<commit_message>
eliminacion de informacion que no necesita el alumno
</commit_message>
<xml_diff>
--- a/Programación/PD_0374. Administración de sistemas operativos_Presencial_2425 (1).docx
+++ b/Programación/PD_0374. Administración de sistemas operativos_Presencial_2425 (1).docx
@@ -457,7 +457,7 @@
           <w:sz w:val="28"/>
           <w:szCs w:val="28"/>
         </w:rPr>
-        <w:t>Curso: 2025/2026</w:t>
+        <w:t>Curso: 2026/2027 · Revisión horaria: 16/09/2026</w:t>
       </w:r>
     </w:p>
     <w:p>
@@ -1314,7 +1314,7 @@
                   <w:szCs w:val="18"/>
                   <w:lang w:val="es-MX" w:bidi="hi-IN"/>
                 </w:rPr>
-                <w:t>ORDEN 36/2012</w:t>
+                <w:t>ORDEN 36/2012, de 22 de junio, de la Conselleria de Educación, por la que se establece el currículo del ciclo formativo de grado superior correspondiente al título de Técnico Superior en Administración de Sistemas Informáticos en Red. Distribución horaria actualizada por el DECRETO 114/2025, de 29 de julio, del Consell, anexo de ASIR (DOGV 10165, 04/08/2025, p. 72): 0374, 133 horas y 4 horas semanales. https://dogv.gva.es/datos/2025/08/04/pdf/2025_29742_es.pdf</w:t>
               </w:r>
             </w:hyperlink>
             <w:r>
@@ -1324,7 +1324,7 @@
                 <w:szCs w:val="18"/>
                 <w:lang w:val="es-MX" w:bidi="hi-IN"/>
               </w:rPr>
-              <w:t>, de 22 de junio, de la Conselleria de Educación, por la que se establece el currículo del ciclo formativo de grado superior correspondiente al título de Técnico Superior en Administración de Sistemas Informáticos en Red.</w:t>
+              <w:t/>
             </w:r>
           </w:p>
         </w:tc>
@@ -2512,4683 +2512,67 @@
       </w:pPr>
       <w:r>
         <w:rPr/>
-        <w:t>Cuadro horario</w:t>
+        <w:t>Cuadro horario del módulo ASO — currículo vigente</w:t>
       </w:r>
     </w:p>
     <w:tbl>
-      <w:tblPr>
-        <w:tblW w:w="9338" w:type="dxa"/>
-        <w:jc w:val="left"/>
-        <w:tblInd w:w="0" w:type="dxa"/>
-        <w:tblLayout w:type="fixed"/>
-        <w:tblCellMar>
-          <w:top w:w="0" w:type="dxa"/>
-          <w:left w:w="7" w:type="dxa"/>
-          <w:bottom w:w="0" w:type="dxa"/>
-          <w:right w:w="7" w:type="dxa"/>
-        </w:tblCellMar>
-        <w:tblLook w:val="04a0" w:noHBand="0" w:noVBand="1" w:firstColumn="1" w:lastRow="0" w:lastColumn="0" w:firstRow="1"/>
-      </w:tblPr>
-      <w:tblGrid>
-        <w:gridCol w:w="3977"/>
-        <w:gridCol w:w="1133"/>
-        <w:gridCol w:w="991"/>
-        <w:gridCol w:w="936"/>
-        <w:gridCol w:w="1222"/>
-        <w:gridCol w:w="1078"/>
-      </w:tblGrid>
       <w:tr>
-        <w:trPr>
-          <w:trHeight w:val="405" w:hRule="atLeast"/>
-        </w:trPr>
-        <w:tc>
-          <w:tcPr>
-            <w:tcW w:w="3977" w:type="dxa"/>
-            <w:vMerge w:val="restart"/>
-            <w:tcBorders>
-              <w:top w:val="single" w:sz="6" w:space="0" w:color="000000"/>
-              <w:left w:val="single" w:sz="6" w:space="0" w:color="000000"/>
-              <w:bottom w:val="single" w:sz="6" w:space="0" w:color="000000"/>
-              <w:right w:val="single" w:sz="6" w:space="0" w:color="000000"/>
-            </w:tcBorders>
-            <w:shd w:color="auto" w:fill="808080" w:val="clear"/>
-            <w:vAlign w:val="center"/>
-          </w:tcPr>
-          <w:p>
-            <w:pPr>
-              <w:pStyle w:val="Normal"/>
-              <w:suppressAutoHyphens w:val="false"/>
-              <w:spacing w:before="0" w:after="0"/>
-              <w:jc w:val="center"/>
-              <w:textAlignment w:val="baseline"/>
-              <w:rPr>
-                <w:rFonts w:ascii="Segoe UI" w:hAnsi="Segoe UI" w:cs="Segoe UI"/>
-                <w:b/>
-                <w:bCs/>
-                <w:color w:val="FFFFFF"/>
-                <w:kern w:val="0"/>
-                <w:sz w:val="18"/>
-                <w:szCs w:val="18"/>
-                <w:lang w:eastAsia="es-ES"/>
-              </w:rPr>
-            </w:pPr>
-            <w:r>
-              <w:rPr>
-                <w:rFonts w:cs="Arial"/>
-                <w:b/>
-                <w:bCs/>
-                <w:color w:val="FFFFFF"/>
-                <w:kern w:val="0"/>
-                <w:szCs w:val="22"/>
-                <w:lang w:eastAsia="es-ES"/>
-              </w:rPr>
+        <w:tc>
+          <w:p>
+            <w:r>
               <w:t>Módulo profesional</w:t>
             </w:r>
           </w:p>
         </w:tc>
         <w:tc>
-          <w:tcPr>
-            <w:tcW w:w="1133" w:type="dxa"/>
-            <w:vMerge w:val="restart"/>
-            <w:tcBorders>
-              <w:top w:val="single" w:sz="6" w:space="0" w:color="000000"/>
-              <w:left w:val="single" w:sz="6" w:space="0" w:color="000000"/>
-              <w:bottom w:val="single" w:sz="6" w:space="0" w:color="000000"/>
-              <w:right w:val="single" w:sz="6" w:space="0" w:color="000000"/>
-            </w:tcBorders>
-            <w:shd w:color="auto" w:fill="808080" w:val="clear"/>
-            <w:vAlign w:val="center"/>
-          </w:tcPr>
-          <w:p>
-            <w:pPr>
-              <w:pStyle w:val="Normal"/>
-              <w:suppressAutoHyphens w:val="false"/>
-              <w:spacing w:before="0" w:after="0"/>
-              <w:jc w:val="center"/>
-              <w:textAlignment w:val="baseline"/>
-              <w:rPr>
-                <w:rFonts w:ascii="Segoe UI" w:hAnsi="Segoe UI" w:cs="Segoe UI"/>
-                <w:b/>
-                <w:bCs/>
-                <w:color w:val="FFFFFF"/>
-                <w:kern w:val="0"/>
-                <w:sz w:val="18"/>
-                <w:szCs w:val="18"/>
-                <w:lang w:eastAsia="es-ES"/>
-              </w:rPr>
-            </w:pPr>
-            <w:r>
-              <w:rPr>
-                <w:rFonts w:cs="Arial"/>
-                <w:b/>
-                <w:bCs/>
-                <w:color w:val="FFFFFF"/>
-                <w:kern w:val="0"/>
-                <w:szCs w:val="22"/>
-                <w:lang w:eastAsia="es-ES"/>
-              </w:rPr>
-              <w:t>Lengua vehicular</w:t>
-            </w:r>
-          </w:p>
-        </w:tc>
-        <w:tc>
-          <w:tcPr>
-            <w:tcW w:w="991" w:type="dxa"/>
-            <w:vMerge w:val="restart"/>
-            <w:tcBorders>
-              <w:top w:val="single" w:sz="6" w:space="0" w:color="000000"/>
-              <w:left w:val="single" w:sz="6" w:space="0" w:color="000000"/>
-              <w:bottom w:val="single" w:sz="6" w:space="0" w:color="000000"/>
-              <w:right w:val="single" w:sz="6" w:space="0" w:color="000000"/>
-            </w:tcBorders>
-            <w:shd w:color="auto" w:fill="808080" w:val="clear"/>
-            <w:vAlign w:val="center"/>
-          </w:tcPr>
-          <w:p>
-            <w:pPr>
-              <w:pStyle w:val="Normal"/>
-              <w:suppressAutoHyphens w:val="false"/>
-              <w:spacing w:before="0" w:after="0"/>
-              <w:jc w:val="center"/>
-              <w:textAlignment w:val="baseline"/>
-              <w:rPr>
-                <w:rFonts w:ascii="Segoe UI" w:hAnsi="Segoe UI" w:cs="Segoe UI"/>
-                <w:b/>
-                <w:bCs/>
-                <w:color w:val="FFFFFF"/>
-                <w:kern w:val="0"/>
-                <w:sz w:val="18"/>
-                <w:szCs w:val="18"/>
-                <w:lang w:eastAsia="es-ES"/>
-              </w:rPr>
-            </w:pPr>
-            <w:r>
-              <w:rPr>
-                <w:rFonts w:cs="Arial"/>
-                <w:b/>
-                <w:bCs/>
-                <w:color w:val="FFFFFF"/>
-                <w:kern w:val="0"/>
-                <w:szCs w:val="22"/>
-                <w:lang w:eastAsia="es-ES"/>
-              </w:rPr>
-              <w:t>Carga lectiva</w:t>
-            </w:r>
-          </w:p>
-          <w:p>
-            <w:pPr>
-              <w:pStyle w:val="Normal"/>
-              <w:suppressAutoHyphens w:val="false"/>
-              <w:spacing w:before="0" w:after="0"/>
-              <w:jc w:val="center"/>
-              <w:textAlignment w:val="baseline"/>
-              <w:rPr>
-                <w:rFonts w:ascii="Segoe UI" w:hAnsi="Segoe UI" w:cs="Segoe UI"/>
-                <w:b/>
-                <w:bCs/>
-                <w:color w:val="FFFFFF"/>
-                <w:kern w:val="0"/>
-                <w:sz w:val="18"/>
-                <w:szCs w:val="18"/>
-                <w:lang w:eastAsia="es-ES"/>
-              </w:rPr>
-            </w:pPr>
-            <w:r>
-              <w:rPr>
-                <w:rFonts w:cs="Arial"/>
-                <w:b/>
-                <w:bCs/>
-                <w:color w:val="FFFFFF"/>
-                <w:kern w:val="0"/>
-                <w:szCs w:val="22"/>
-                <w:lang w:eastAsia="es-ES"/>
-              </w:rPr>
-              <w:t>(horas)</w:t>
-            </w:r>
-          </w:p>
-        </w:tc>
-        <w:tc>
-          <w:tcPr>
-            <w:tcW w:w="936" w:type="dxa"/>
-            <w:vMerge w:val="restart"/>
-            <w:tcBorders>
-              <w:top w:val="single" w:sz="6" w:space="0" w:color="000000"/>
-              <w:left w:val="single" w:sz="6" w:space="0" w:color="000000"/>
-              <w:bottom w:val="single" w:sz="6" w:space="0" w:color="000000"/>
-              <w:right w:val="single" w:sz="6" w:space="0" w:color="000000"/>
-            </w:tcBorders>
-            <w:shd w:color="auto" w:fill="808080" w:val="clear"/>
-            <w:vAlign w:val="center"/>
-          </w:tcPr>
-          <w:p>
-            <w:pPr>
-              <w:pStyle w:val="Normal"/>
-              <w:suppressAutoHyphens w:val="false"/>
-              <w:spacing w:before="0" w:after="0"/>
-              <w:jc w:val="center"/>
-              <w:textAlignment w:val="baseline"/>
-              <w:rPr>
-                <w:rFonts w:ascii="Segoe UI" w:hAnsi="Segoe UI" w:cs="Segoe UI"/>
-                <w:b/>
-                <w:bCs/>
-                <w:color w:val="FFFFFF"/>
-                <w:kern w:val="0"/>
-                <w:sz w:val="18"/>
-                <w:szCs w:val="18"/>
-                <w:lang w:eastAsia="es-ES"/>
-              </w:rPr>
-            </w:pPr>
-            <w:r>
-              <w:rPr>
-                <w:rFonts w:cs="Arial"/>
-                <w:b/>
-                <w:bCs/>
-                <w:color w:val="FFFFFF"/>
-                <w:kern w:val="0"/>
-                <w:szCs w:val="22"/>
-                <w:lang w:eastAsia="es-ES"/>
-              </w:rPr>
-              <w:t>Primer curso</w:t>
-            </w:r>
-          </w:p>
-          <w:p>
-            <w:pPr>
-              <w:pStyle w:val="Normal"/>
-              <w:suppressAutoHyphens w:val="false"/>
-              <w:spacing w:before="0" w:after="0"/>
-              <w:jc w:val="center"/>
-              <w:textAlignment w:val="baseline"/>
-              <w:rPr>
-                <w:rFonts w:ascii="Segoe UI" w:hAnsi="Segoe UI" w:cs="Segoe UI"/>
-                <w:b/>
-                <w:bCs/>
-                <w:color w:val="FFFFFF"/>
-                <w:kern w:val="0"/>
-                <w:sz w:val="18"/>
-                <w:szCs w:val="18"/>
-                <w:lang w:eastAsia="es-ES"/>
-              </w:rPr>
-            </w:pPr>
-            <w:r>
-              <w:rPr>
-                <w:rFonts w:cs="Arial"/>
-                <w:b/>
-                <w:bCs/>
-                <w:color w:val="FFFFFF"/>
-                <w:kern w:val="0"/>
-                <w:szCs w:val="22"/>
-                <w:lang w:eastAsia="es-ES"/>
-              </w:rPr>
-              <w:t>(horas/s</w:t>
-            </w:r>
-          </w:p>
-          <w:p>
-            <w:pPr>
-              <w:pStyle w:val="Normal"/>
-              <w:suppressAutoHyphens w:val="false"/>
-              <w:spacing w:before="0" w:after="0"/>
-              <w:jc w:val="center"/>
-              <w:textAlignment w:val="baseline"/>
-              <w:rPr>
-                <w:rFonts w:ascii="Segoe UI" w:hAnsi="Segoe UI" w:cs="Segoe UI"/>
-                <w:b/>
-                <w:bCs/>
-                <w:color w:val="FFFFFF"/>
-                <w:kern w:val="0"/>
-                <w:sz w:val="18"/>
-                <w:szCs w:val="18"/>
-                <w:lang w:eastAsia="es-ES"/>
-              </w:rPr>
-            </w:pPr>
-            <w:r>
-              <w:rPr>
-                <w:rFonts w:cs="Arial"/>
-                <w:b/>
-                <w:bCs/>
-                <w:color w:val="FFFFFF"/>
-                <w:kern w:val="0"/>
-                <w:szCs w:val="22"/>
-                <w:lang w:eastAsia="es-ES"/>
-              </w:rPr>
-              <w:t>emana)</w:t>
-            </w:r>
-          </w:p>
-        </w:tc>
-        <w:tc>
-          <w:tcPr>
-            <w:tcW w:w="2300" w:type="dxa"/>
-            <w:gridSpan w:val="2"/>
-            <w:tcBorders>
-              <w:top w:val="single" w:sz="6" w:space="0" w:color="000000"/>
-              <w:left w:val="single" w:sz="6" w:space="0" w:color="000000"/>
-              <w:bottom w:val="single" w:sz="6" w:space="0" w:color="000000"/>
-              <w:right w:val="single" w:sz="6" w:space="0" w:color="000000"/>
-            </w:tcBorders>
-            <w:shd w:color="auto" w:fill="808080" w:val="clear"/>
-            <w:vAlign w:val="center"/>
-          </w:tcPr>
-          <w:p>
-            <w:pPr>
-              <w:pStyle w:val="Normal"/>
-              <w:suppressAutoHyphens w:val="false"/>
-              <w:spacing w:before="0" w:after="0"/>
-              <w:jc w:val="center"/>
-              <w:textAlignment w:val="baseline"/>
-              <w:rPr>
-                <w:rFonts w:ascii="Segoe UI" w:hAnsi="Segoe UI" w:cs="Segoe UI"/>
-                <w:b/>
-                <w:bCs/>
-                <w:color w:val="FFFFFF"/>
-                <w:kern w:val="0"/>
-                <w:sz w:val="18"/>
-                <w:szCs w:val="18"/>
-                <w:lang w:eastAsia="es-ES"/>
-              </w:rPr>
-            </w:pPr>
-            <w:r>
-              <w:rPr>
-                <w:rFonts w:cs="Arial"/>
-                <w:b/>
-                <w:bCs/>
-                <w:color w:val="FFFFFF"/>
-                <w:kern w:val="0"/>
-                <w:szCs w:val="22"/>
-                <w:lang w:eastAsia="es-ES"/>
-              </w:rPr>
-              <w:t>Segundo</w:t>
-            </w:r>
-          </w:p>
-          <w:p>
-            <w:pPr>
-              <w:pStyle w:val="Normal"/>
-              <w:suppressAutoHyphens w:val="false"/>
-              <w:spacing w:before="0" w:after="0"/>
-              <w:jc w:val="center"/>
-              <w:textAlignment w:val="baseline"/>
-              <w:rPr>
-                <w:rFonts w:ascii="Segoe UI" w:hAnsi="Segoe UI" w:cs="Segoe UI"/>
-                <w:b/>
-                <w:bCs/>
-                <w:color w:val="FFFFFF"/>
-                <w:kern w:val="0"/>
-                <w:sz w:val="18"/>
-                <w:szCs w:val="18"/>
-                <w:lang w:eastAsia="es-ES"/>
-              </w:rPr>
-            </w:pPr>
-            <w:r>
-              <w:rPr>
-                <w:rFonts w:cs="Arial"/>
-                <w:b/>
-                <w:bCs/>
-                <w:color w:val="FFFFFF"/>
-                <w:kern w:val="0"/>
-                <w:szCs w:val="22"/>
-                <w:lang w:eastAsia="es-ES"/>
-              </w:rPr>
-              <w:t> </w:t>
-            </w:r>
-            <w:r>
-              <w:rPr>
-                <w:rFonts w:cs="Arial"/>
-                <w:b/>
-                <w:bCs/>
-                <w:color w:val="FFFFFF"/>
-                <w:kern w:val="0"/>
-                <w:szCs w:val="22"/>
-                <w:lang w:eastAsia="es-ES"/>
-              </w:rPr>
-              <w:t>curso</w:t>
+          <w:p>
+            <w:r>
+              <w:t>Curso</w:t>
+            </w:r>
+          </w:p>
+        </w:tc>
+        <w:tc>
+          <w:p>
+            <w:r>
+              <w:t>Horas curriculares</w:t>
+            </w:r>
+          </w:p>
+        </w:tc>
+        <w:tc>
+          <w:p>
+            <w:r>
+              <w:t>Horas semanales</w:t>
             </w:r>
           </w:p>
         </w:tc>
       </w:tr>
       <w:tr>
-        <w:trPr>
-          <w:trHeight w:val="225" w:hRule="atLeast"/>
-        </w:trPr>
-        <w:tc>
-          <w:tcPr>
-            <w:tcW w:w="3977" w:type="dxa"/>
-            <w:vMerge w:val="continue"/>
-            <w:tcBorders>
-              <w:top w:val="single" w:sz="6" w:space="0" w:color="000000"/>
-              <w:left w:val="single" w:sz="6" w:space="0" w:color="000000"/>
-              <w:bottom w:val="single" w:sz="6" w:space="0" w:color="000000"/>
-              <w:right w:val="single" w:sz="6" w:space="0" w:color="000000"/>
-            </w:tcBorders>
-            <w:shd w:color="auto" w:fill="auto" w:val="clear"/>
-            <w:vAlign w:val="center"/>
-          </w:tcPr>
-          <w:p>
-            <w:pPr>
-              <w:pStyle w:val="Normal"/>
-              <w:suppressAutoHyphens w:val="false"/>
-              <w:spacing w:before="0" w:after="0"/>
-              <w:jc w:val="left"/>
-              <w:rPr>
-                <w:rFonts w:ascii="Segoe UI" w:hAnsi="Segoe UI" w:cs="Segoe UI"/>
-                <w:b/>
-                <w:bCs/>
-                <w:color w:val="FFFFFF"/>
-                <w:kern w:val="0"/>
-                <w:sz w:val="18"/>
-                <w:szCs w:val="18"/>
-                <w:lang w:eastAsia="es-ES"/>
-              </w:rPr>
-            </w:pPr>
-            <w:r>
-              <w:rPr>
-                <w:rFonts w:cs="Segoe UI" w:ascii="Segoe UI" w:hAnsi="Segoe UI"/>
-                <w:b/>
-                <w:bCs/>
-                <w:color w:val="FFFFFF"/>
-                <w:kern w:val="0"/>
-                <w:sz w:val="18"/>
-                <w:szCs w:val="18"/>
-                <w:lang w:eastAsia="es-ES"/>
-              </w:rPr>
-            </w:r>
-          </w:p>
-        </w:tc>
-        <w:tc>
-          <w:tcPr>
-            <w:tcW w:w="1133" w:type="dxa"/>
-            <w:vMerge w:val="continue"/>
-            <w:tcBorders>
-              <w:top w:val="single" w:sz="6" w:space="0" w:color="000000"/>
-              <w:left w:val="single" w:sz="6" w:space="0" w:color="000000"/>
-              <w:bottom w:val="single" w:sz="6" w:space="0" w:color="000000"/>
-              <w:right w:val="single" w:sz="6" w:space="0" w:color="000000"/>
-            </w:tcBorders>
-            <w:shd w:color="auto" w:fill="auto" w:val="clear"/>
-            <w:vAlign w:val="center"/>
-          </w:tcPr>
-          <w:p>
-            <w:pPr>
-              <w:pStyle w:val="Normal"/>
-              <w:suppressAutoHyphens w:val="false"/>
-              <w:spacing w:before="0" w:after="0"/>
-              <w:jc w:val="left"/>
-              <w:rPr>
-                <w:rFonts w:ascii="Segoe UI" w:hAnsi="Segoe UI" w:cs="Segoe UI"/>
-                <w:b/>
-                <w:bCs/>
-                <w:color w:val="FFFFFF"/>
-                <w:kern w:val="0"/>
-                <w:sz w:val="18"/>
-                <w:szCs w:val="18"/>
-                <w:lang w:eastAsia="es-ES"/>
-              </w:rPr>
-            </w:pPr>
-            <w:r>
-              <w:rPr>
-                <w:rFonts w:cs="Segoe UI" w:ascii="Segoe UI" w:hAnsi="Segoe UI"/>
-                <w:b/>
-                <w:bCs/>
-                <w:color w:val="FFFFFF"/>
-                <w:kern w:val="0"/>
-                <w:sz w:val="18"/>
-                <w:szCs w:val="18"/>
-                <w:lang w:eastAsia="es-ES"/>
-              </w:rPr>
-            </w:r>
-          </w:p>
-        </w:tc>
-        <w:tc>
-          <w:tcPr>
-            <w:tcW w:w="991" w:type="dxa"/>
-            <w:vMerge w:val="continue"/>
-            <w:tcBorders>
-              <w:top w:val="single" w:sz="6" w:space="0" w:color="000000"/>
-              <w:left w:val="single" w:sz="6" w:space="0" w:color="000000"/>
-              <w:bottom w:val="single" w:sz="6" w:space="0" w:color="000000"/>
-              <w:right w:val="single" w:sz="6" w:space="0" w:color="000000"/>
-            </w:tcBorders>
-            <w:shd w:color="auto" w:fill="auto" w:val="clear"/>
-            <w:vAlign w:val="center"/>
-          </w:tcPr>
-          <w:p>
-            <w:pPr>
-              <w:pStyle w:val="Normal"/>
-              <w:suppressAutoHyphens w:val="false"/>
-              <w:spacing w:before="0" w:after="0"/>
-              <w:jc w:val="left"/>
-              <w:rPr>
-                <w:rFonts w:ascii="Segoe UI" w:hAnsi="Segoe UI" w:cs="Segoe UI"/>
-                <w:b/>
-                <w:bCs/>
-                <w:color w:val="FFFFFF"/>
-                <w:kern w:val="0"/>
-                <w:sz w:val="18"/>
-                <w:szCs w:val="18"/>
-                <w:lang w:eastAsia="es-ES"/>
-              </w:rPr>
-            </w:pPr>
-            <w:r>
-              <w:rPr>
-                <w:rFonts w:cs="Segoe UI" w:ascii="Segoe UI" w:hAnsi="Segoe UI"/>
-                <w:b/>
-                <w:bCs/>
-                <w:color w:val="FFFFFF"/>
-                <w:kern w:val="0"/>
-                <w:sz w:val="18"/>
-                <w:szCs w:val="18"/>
-                <w:lang w:eastAsia="es-ES"/>
-              </w:rPr>
-            </w:r>
-          </w:p>
-        </w:tc>
-        <w:tc>
-          <w:tcPr>
-            <w:tcW w:w="936" w:type="dxa"/>
-            <w:vMerge w:val="continue"/>
-            <w:tcBorders>
-              <w:top w:val="single" w:sz="6" w:space="0" w:color="000000"/>
-              <w:left w:val="single" w:sz="6" w:space="0" w:color="000000"/>
-              <w:bottom w:val="single" w:sz="6" w:space="0" w:color="000000"/>
-              <w:right w:val="single" w:sz="6" w:space="0" w:color="000000"/>
-            </w:tcBorders>
-            <w:shd w:color="auto" w:fill="auto" w:val="clear"/>
-            <w:vAlign w:val="center"/>
-          </w:tcPr>
-          <w:p>
-            <w:pPr>
-              <w:pStyle w:val="Normal"/>
-              <w:suppressAutoHyphens w:val="false"/>
-              <w:spacing w:before="0" w:after="0"/>
-              <w:jc w:val="left"/>
-              <w:rPr>
-                <w:rFonts w:ascii="Segoe UI" w:hAnsi="Segoe UI" w:cs="Segoe UI"/>
-                <w:b/>
-                <w:bCs/>
-                <w:color w:val="FFFFFF"/>
-                <w:kern w:val="0"/>
-                <w:sz w:val="18"/>
-                <w:szCs w:val="18"/>
-                <w:lang w:eastAsia="es-ES"/>
-              </w:rPr>
-            </w:pPr>
-            <w:r>
-              <w:rPr>
-                <w:rFonts w:cs="Segoe UI" w:ascii="Segoe UI" w:hAnsi="Segoe UI"/>
-                <w:b/>
-                <w:bCs/>
-                <w:color w:val="FFFFFF"/>
-                <w:kern w:val="0"/>
-                <w:sz w:val="18"/>
-                <w:szCs w:val="18"/>
-                <w:lang w:eastAsia="es-ES"/>
-              </w:rPr>
-            </w:r>
-          </w:p>
-        </w:tc>
-        <w:tc>
-          <w:tcPr>
-            <w:tcW w:w="1222" w:type="dxa"/>
-            <w:tcBorders>
-              <w:top w:val="single" w:sz="6" w:space="0" w:color="000000"/>
-              <w:left w:val="single" w:sz="6" w:space="0" w:color="000000"/>
-              <w:bottom w:val="single" w:sz="6" w:space="0" w:color="000000"/>
-              <w:right w:val="single" w:sz="6" w:space="0" w:color="000000"/>
-            </w:tcBorders>
-            <w:shd w:color="auto" w:fill="808080" w:val="clear"/>
-            <w:vAlign w:val="center"/>
-          </w:tcPr>
-          <w:p>
-            <w:pPr>
-              <w:pStyle w:val="Normal"/>
-              <w:suppressAutoHyphens w:val="false"/>
-              <w:spacing w:before="0" w:after="0"/>
-              <w:jc w:val="center"/>
-              <w:textAlignment w:val="baseline"/>
-              <w:rPr>
-                <w:rFonts w:ascii="Segoe UI" w:hAnsi="Segoe UI" w:cs="Segoe UI"/>
-                <w:kern w:val="0"/>
-                <w:sz w:val="18"/>
-                <w:szCs w:val="18"/>
-                <w:lang w:eastAsia="es-ES"/>
-              </w:rPr>
-            </w:pPr>
-            <w:r>
-              <w:rPr>
-                <w:rFonts w:cs="Arial"/>
-                <w:color w:val="FFFFFF"/>
-                <w:kern w:val="0"/>
-                <w:sz w:val="16"/>
-                <w:szCs w:val="16"/>
-                <w:lang w:eastAsia="es-ES"/>
-              </w:rPr>
-              <w:t>Dos trimestres</w:t>
-            </w:r>
-          </w:p>
-          <w:p>
-            <w:pPr>
-              <w:pStyle w:val="Normal"/>
-              <w:suppressAutoHyphens w:val="false"/>
-              <w:spacing w:before="0" w:after="0"/>
-              <w:jc w:val="center"/>
-              <w:textAlignment w:val="baseline"/>
-              <w:rPr>
-                <w:rFonts w:ascii="Segoe UI" w:hAnsi="Segoe UI" w:cs="Segoe UI"/>
-                <w:kern w:val="0"/>
-                <w:sz w:val="18"/>
-                <w:szCs w:val="18"/>
-                <w:lang w:eastAsia="es-ES"/>
-              </w:rPr>
-            </w:pPr>
-            <w:r>
-              <w:rPr>
-                <w:rFonts w:cs="Arial"/>
-                <w:color w:val="FFFFFF"/>
-                <w:kern w:val="0"/>
-                <w:sz w:val="16"/>
-                <w:szCs w:val="16"/>
-                <w:lang w:eastAsia="es-ES"/>
-              </w:rPr>
-              <w:t>(horas/semana)</w:t>
-            </w:r>
-          </w:p>
-        </w:tc>
-        <w:tc>
-          <w:tcPr>
-            <w:tcW w:w="1078" w:type="dxa"/>
-            <w:tcBorders>
-              <w:top w:val="single" w:sz="6" w:space="0" w:color="000000"/>
-              <w:left w:val="single" w:sz="6" w:space="0" w:color="000000"/>
-              <w:bottom w:val="single" w:sz="6" w:space="0" w:color="000000"/>
-              <w:right w:val="single" w:sz="6" w:space="0" w:color="000000"/>
-            </w:tcBorders>
-            <w:shd w:color="auto" w:fill="808080" w:val="clear"/>
-            <w:vAlign w:val="center"/>
-          </w:tcPr>
-          <w:p>
-            <w:pPr>
-              <w:pStyle w:val="Normal"/>
-              <w:suppressAutoHyphens w:val="false"/>
-              <w:spacing w:before="0" w:after="0"/>
-              <w:jc w:val="center"/>
-              <w:textAlignment w:val="baseline"/>
-              <w:rPr>
-                <w:rFonts w:ascii="Segoe UI" w:hAnsi="Segoe UI" w:cs="Segoe UI"/>
-                <w:kern w:val="0"/>
-                <w:sz w:val="18"/>
-                <w:szCs w:val="18"/>
-                <w:lang w:eastAsia="es-ES"/>
-              </w:rPr>
-            </w:pPr>
-            <w:r>
-              <w:rPr>
-                <w:rFonts w:cs="Arial"/>
-                <w:color w:val="FFFFFF"/>
-                <w:kern w:val="0"/>
-                <w:sz w:val="16"/>
-                <w:szCs w:val="16"/>
-                <w:lang w:eastAsia="es-ES"/>
-              </w:rPr>
-              <w:t>Un trimestre</w:t>
-            </w:r>
-          </w:p>
-          <w:p>
-            <w:pPr>
-              <w:pStyle w:val="Normal"/>
-              <w:suppressAutoHyphens w:val="false"/>
-              <w:spacing w:before="0" w:after="0"/>
-              <w:jc w:val="center"/>
-              <w:textAlignment w:val="baseline"/>
-              <w:rPr>
-                <w:rFonts w:ascii="Segoe UI" w:hAnsi="Segoe UI" w:cs="Segoe UI"/>
-                <w:kern w:val="0"/>
-                <w:sz w:val="18"/>
-                <w:szCs w:val="18"/>
-                <w:lang w:eastAsia="es-ES"/>
-              </w:rPr>
-            </w:pPr>
-            <w:r>
-              <w:rPr>
-                <w:rFonts w:cs="Arial"/>
-                <w:color w:val="FFFFFF"/>
-                <w:kern w:val="0"/>
-                <w:sz w:val="16"/>
-                <w:szCs w:val="16"/>
-                <w:lang w:eastAsia="es-ES"/>
-              </w:rPr>
-              <w:t>(horas)</w:t>
-            </w:r>
-          </w:p>
-        </w:tc>
-      </w:tr>
-      <w:tr>
-        <w:trPr>
-          <w:trHeight w:val="255" w:hRule="atLeast"/>
-        </w:trPr>
-        <w:tc>
-          <w:tcPr>
-            <w:tcW w:w="3977" w:type="dxa"/>
-            <w:tcBorders>
-              <w:top w:val="single" w:sz="6" w:space="0" w:color="000000"/>
-              <w:left w:val="single" w:sz="6" w:space="0" w:color="000000"/>
-              <w:bottom w:val="single" w:sz="6" w:space="0" w:color="000000"/>
-              <w:right w:val="single" w:sz="6" w:space="0" w:color="000000"/>
-            </w:tcBorders>
-            <w:shd w:color="auto" w:fill="FFFFFF" w:val="clear"/>
-          </w:tcPr>
-          <w:p>
-            <w:pPr>
-              <w:pStyle w:val="Normal"/>
-              <w:suppressAutoHyphens w:val="false"/>
-              <w:spacing w:before="0" w:after="0"/>
-              <w:jc w:val="left"/>
-              <w:textAlignment w:val="baseline"/>
-              <w:rPr>
-                <w:rFonts w:cs="Arial"/>
-                <w:b/>
-                <w:bCs/>
-                <w:kern w:val="0"/>
-                <w:lang w:eastAsia="es-ES"/>
-              </w:rPr>
-            </w:pPr>
-            <w:r>
-              <w:rPr>
-                <w:rFonts w:cs="Arial"/>
-                <w:b/>
-                <w:bCs/>
-                <w:kern w:val="0"/>
-                <w:szCs w:val="22"/>
-                <w:lang w:eastAsia="es-ES"/>
-              </w:rPr>
-              <w:t>Planificación y administración de redes.</w:t>
-            </w:r>
-          </w:p>
-        </w:tc>
-        <w:tc>
-          <w:tcPr>
-            <w:tcW w:w="1133" w:type="dxa"/>
-            <w:tcBorders>
-              <w:top w:val="single" w:sz="6" w:space="0" w:color="000000"/>
-              <w:left w:val="single" w:sz="6" w:space="0" w:color="000000"/>
-              <w:bottom w:val="single" w:sz="6" w:space="0" w:color="000000"/>
-              <w:right w:val="single" w:sz="6" w:space="0" w:color="000000"/>
-            </w:tcBorders>
-            <w:shd w:color="auto" w:fill="FFFFFF" w:val="clear"/>
-            <w:vAlign w:val="center"/>
-          </w:tcPr>
-          <w:p>
-            <w:pPr>
-              <w:pStyle w:val="Normal"/>
-              <w:suppressAutoHyphens w:val="false"/>
-              <w:spacing w:before="0" w:after="0"/>
-              <w:jc w:val="center"/>
-              <w:textAlignment w:val="baseline"/>
-              <w:rPr>
-                <w:rFonts w:cs="Arial"/>
-                <w:kern w:val="0"/>
-                <w:lang w:eastAsia="es-ES"/>
-              </w:rPr>
-            </w:pPr>
-            <w:r>
-              <w:rPr>
-                <w:rFonts w:cs="Arial"/>
-                <w:kern w:val="0"/>
-                <w:szCs w:val="22"/>
-                <w:lang w:eastAsia="es-ES"/>
-              </w:rPr>
-              <w:t>Castellano</w:t>
-            </w:r>
-          </w:p>
-        </w:tc>
-        <w:tc>
-          <w:tcPr>
-            <w:tcW w:w="991" w:type="dxa"/>
-            <w:tcBorders>
-              <w:top w:val="single" w:sz="6" w:space="0" w:color="000000"/>
-              <w:left w:val="single" w:sz="6" w:space="0" w:color="000000"/>
-              <w:bottom w:val="single" w:sz="6" w:space="0" w:color="000000"/>
-              <w:right w:val="single" w:sz="6" w:space="0" w:color="000000"/>
-            </w:tcBorders>
-            <w:shd w:color="auto" w:fill="FFFFFF" w:val="clear"/>
-            <w:vAlign w:val="center"/>
-          </w:tcPr>
-          <w:p>
-            <w:pPr>
-              <w:pStyle w:val="Normal"/>
-              <w:suppressAutoHyphens w:val="false"/>
-              <w:spacing w:before="0" w:after="0"/>
-              <w:jc w:val="center"/>
-              <w:textAlignment w:val="baseline"/>
-              <w:rPr>
-                <w:rFonts w:cs="Arial"/>
-                <w:kern w:val="0"/>
-                <w:lang w:eastAsia="es-ES"/>
-              </w:rPr>
-            </w:pPr>
-            <w:r>
-              <w:rPr>
-                <w:rFonts w:cs="Arial"/>
-                <w:kern w:val="0"/>
-                <w:szCs w:val="22"/>
-                <w:lang w:eastAsia="es-ES"/>
-              </w:rPr>
-              <w:t>192</w:t>
-            </w:r>
-          </w:p>
-        </w:tc>
-        <w:tc>
-          <w:tcPr>
-            <w:tcW w:w="936" w:type="dxa"/>
-            <w:tcBorders>
-              <w:top w:val="single" w:sz="6" w:space="0" w:color="000000"/>
-              <w:left w:val="single" w:sz="6" w:space="0" w:color="000000"/>
-              <w:bottom w:val="single" w:sz="6" w:space="0" w:color="000000"/>
-              <w:right w:val="single" w:sz="6" w:space="0" w:color="000000"/>
-            </w:tcBorders>
-            <w:shd w:color="auto" w:fill="FFFFFF" w:val="clear"/>
-            <w:vAlign w:val="center"/>
-          </w:tcPr>
-          <w:p>
-            <w:pPr>
-              <w:pStyle w:val="Normal"/>
-              <w:suppressAutoHyphens w:val="false"/>
-              <w:spacing w:before="0" w:after="0"/>
-              <w:jc w:val="center"/>
-              <w:textAlignment w:val="baseline"/>
-              <w:rPr>
-                <w:rFonts w:cs="Arial"/>
-                <w:kern w:val="0"/>
-                <w:lang w:eastAsia="es-ES"/>
-              </w:rPr>
-            </w:pPr>
-            <w:r>
-              <w:rPr>
-                <w:rFonts w:cs="Arial"/>
-                <w:kern w:val="0"/>
-                <w:szCs w:val="22"/>
-                <w:lang w:eastAsia="es-ES"/>
-              </w:rPr>
-              <w:t>6</w:t>
-            </w:r>
-          </w:p>
-        </w:tc>
-        <w:tc>
-          <w:tcPr>
-            <w:tcW w:w="1222" w:type="dxa"/>
-            <w:tcBorders>
-              <w:top w:val="single" w:sz="6" w:space="0" w:color="000000"/>
-              <w:left w:val="single" w:sz="6" w:space="0" w:color="000000"/>
-              <w:bottom w:val="single" w:sz="6" w:space="0" w:color="000000"/>
-              <w:right w:val="single" w:sz="6" w:space="0" w:color="000000"/>
-            </w:tcBorders>
-            <w:shd w:color="auto" w:fill="FFFFFF" w:val="clear"/>
-            <w:vAlign w:val="center"/>
-          </w:tcPr>
-          <w:p>
-            <w:pPr>
-              <w:pStyle w:val="Normal"/>
-              <w:suppressAutoHyphens w:val="false"/>
-              <w:spacing w:before="0" w:after="0"/>
-              <w:jc w:val="center"/>
-              <w:textAlignment w:val="baseline"/>
-              <w:rPr>
-                <w:rFonts w:cs="Arial"/>
-                <w:kern w:val="0"/>
-                <w:lang w:eastAsia="es-ES"/>
-              </w:rPr>
-            </w:pPr>
-            <w:r>
-              <w:rPr>
-                <w:rFonts w:cs="Arial"/>
-                <w:kern w:val="0"/>
-                <w:lang w:eastAsia="es-ES"/>
-              </w:rPr>
-            </w:r>
-          </w:p>
-        </w:tc>
-        <w:tc>
-          <w:tcPr>
-            <w:tcW w:w="1078" w:type="dxa"/>
-            <w:tcBorders>
-              <w:top w:val="single" w:sz="6" w:space="0" w:color="000000"/>
-              <w:left w:val="single" w:sz="6" w:space="0" w:color="000000"/>
-              <w:bottom w:val="single" w:sz="6" w:space="0" w:color="000000"/>
-              <w:right w:val="single" w:sz="6" w:space="0" w:color="000000"/>
-            </w:tcBorders>
-            <w:shd w:color="auto" w:fill="FFFFFF" w:val="clear"/>
-            <w:vAlign w:val="center"/>
-          </w:tcPr>
-          <w:p>
-            <w:pPr>
-              <w:pStyle w:val="Normal"/>
-              <w:suppressAutoHyphens w:val="false"/>
-              <w:spacing w:before="0" w:after="0"/>
-              <w:jc w:val="center"/>
-              <w:textAlignment w:val="baseline"/>
-              <w:rPr>
-                <w:rFonts w:cs="Arial"/>
-                <w:kern w:val="0"/>
-                <w:lang w:eastAsia="es-ES"/>
-              </w:rPr>
-            </w:pPr>
-            <w:r>
-              <w:rPr>
-                <w:rFonts w:cs="Arial"/>
-                <w:kern w:val="0"/>
-                <w:lang w:eastAsia="es-ES"/>
-              </w:rPr>
-            </w:r>
-          </w:p>
-        </w:tc>
-      </w:tr>
-      <w:tr>
-        <w:trPr>
-          <w:trHeight w:val="255" w:hRule="atLeast"/>
-        </w:trPr>
-        <w:tc>
-          <w:tcPr>
-            <w:tcW w:w="3977" w:type="dxa"/>
-            <w:tcBorders>
-              <w:top w:val="single" w:sz="6" w:space="0" w:color="000000"/>
-              <w:left w:val="single" w:sz="6" w:space="0" w:color="000000"/>
-              <w:bottom w:val="single" w:sz="6" w:space="0" w:color="000000"/>
-              <w:right w:val="single" w:sz="6" w:space="0" w:color="000000"/>
-            </w:tcBorders>
-            <w:shd w:color="auto" w:fill="FFFFFF" w:val="clear"/>
-          </w:tcPr>
-          <w:p>
-            <w:pPr>
-              <w:pStyle w:val="Normal"/>
-              <w:suppressAutoHyphens w:val="false"/>
-              <w:spacing w:before="0" w:after="0"/>
-              <w:jc w:val="left"/>
-              <w:textAlignment w:val="baseline"/>
-              <w:rPr>
-                <w:rFonts w:cs="Arial"/>
-                <w:b/>
-                <w:bCs/>
-                <w:kern w:val="0"/>
-                <w:lang w:eastAsia="es-ES"/>
-              </w:rPr>
-            </w:pPr>
-            <w:r>
-              <w:rPr>
-                <w:rFonts w:cs="Arial"/>
-                <w:b/>
-                <w:bCs/>
-                <w:kern w:val="0"/>
-                <w:szCs w:val="22"/>
-                <w:lang w:eastAsia="es-ES"/>
-              </w:rPr>
-              <w:t>Implantación de sistemas operativos.</w:t>
-            </w:r>
-          </w:p>
-        </w:tc>
-        <w:tc>
-          <w:tcPr>
-            <w:tcW w:w="1133" w:type="dxa"/>
-            <w:tcBorders>
-              <w:top w:val="single" w:sz="6" w:space="0" w:color="000000"/>
-              <w:left w:val="single" w:sz="6" w:space="0" w:color="000000"/>
-              <w:bottom w:val="single" w:sz="6" w:space="0" w:color="000000"/>
-              <w:right w:val="single" w:sz="6" w:space="0" w:color="000000"/>
-            </w:tcBorders>
-            <w:shd w:color="auto" w:fill="FFFFFF" w:val="clear"/>
-            <w:vAlign w:val="center"/>
-          </w:tcPr>
-          <w:p>
-            <w:pPr>
-              <w:pStyle w:val="Normal"/>
-              <w:suppressAutoHyphens w:val="false"/>
-              <w:spacing w:before="0" w:after="0"/>
-              <w:jc w:val="center"/>
-              <w:textAlignment w:val="baseline"/>
-              <w:rPr>
-                <w:rFonts w:cs="Arial"/>
-                <w:kern w:val="0"/>
-                <w:lang w:eastAsia="es-ES"/>
-              </w:rPr>
-            </w:pPr>
-            <w:r>
-              <w:rPr>
-                <w:rFonts w:cs="Arial"/>
-                <w:kern w:val="0"/>
-                <w:szCs w:val="22"/>
-                <w:lang w:eastAsia="es-ES"/>
-              </w:rPr>
-              <w:t>Valencià</w:t>
-            </w:r>
-          </w:p>
-        </w:tc>
-        <w:tc>
-          <w:tcPr>
-            <w:tcW w:w="991" w:type="dxa"/>
-            <w:tcBorders>
-              <w:top w:val="single" w:sz="6" w:space="0" w:color="000000"/>
-              <w:left w:val="single" w:sz="6" w:space="0" w:color="000000"/>
-              <w:bottom w:val="single" w:sz="6" w:space="0" w:color="000000"/>
-              <w:right w:val="single" w:sz="6" w:space="0" w:color="000000"/>
-            </w:tcBorders>
-            <w:shd w:color="auto" w:fill="FFFFFF" w:val="clear"/>
-            <w:vAlign w:val="center"/>
-          </w:tcPr>
-          <w:p>
-            <w:pPr>
-              <w:pStyle w:val="Normal"/>
-              <w:suppressAutoHyphens w:val="false"/>
-              <w:spacing w:before="0" w:after="0"/>
-              <w:jc w:val="center"/>
-              <w:textAlignment w:val="baseline"/>
-              <w:rPr>
-                <w:rFonts w:cs="Arial"/>
-                <w:kern w:val="0"/>
-                <w:lang w:eastAsia="es-ES"/>
-              </w:rPr>
-            </w:pPr>
-            <w:r>
-              <w:rPr>
-                <w:rFonts w:cs="Arial"/>
-                <w:kern w:val="0"/>
-                <w:szCs w:val="22"/>
-                <w:lang w:eastAsia="es-ES"/>
-              </w:rPr>
-              <w:t>224</w:t>
-            </w:r>
-          </w:p>
-        </w:tc>
-        <w:tc>
-          <w:tcPr>
-            <w:tcW w:w="936" w:type="dxa"/>
-            <w:tcBorders>
-              <w:top w:val="single" w:sz="6" w:space="0" w:color="000000"/>
-              <w:left w:val="single" w:sz="6" w:space="0" w:color="000000"/>
-              <w:bottom w:val="single" w:sz="6" w:space="0" w:color="000000"/>
-              <w:right w:val="single" w:sz="6" w:space="0" w:color="000000"/>
-            </w:tcBorders>
-            <w:shd w:color="auto" w:fill="FFFFFF" w:val="clear"/>
-            <w:vAlign w:val="center"/>
-          </w:tcPr>
-          <w:p>
-            <w:pPr>
-              <w:pStyle w:val="Normal"/>
-              <w:suppressAutoHyphens w:val="false"/>
-              <w:spacing w:before="0" w:after="0"/>
-              <w:jc w:val="center"/>
-              <w:textAlignment w:val="baseline"/>
-              <w:rPr>
-                <w:rFonts w:cs="Arial"/>
-                <w:kern w:val="0"/>
-                <w:lang w:eastAsia="es-ES"/>
-              </w:rPr>
-            </w:pPr>
-            <w:r>
-              <w:rPr>
-                <w:rFonts w:cs="Arial"/>
-                <w:kern w:val="0"/>
-                <w:szCs w:val="22"/>
-                <w:lang w:eastAsia="es-ES"/>
-              </w:rPr>
-              <w:t>7</w:t>
-            </w:r>
-          </w:p>
-        </w:tc>
-        <w:tc>
-          <w:tcPr>
-            <w:tcW w:w="1222" w:type="dxa"/>
-            <w:tcBorders>
-              <w:top w:val="single" w:sz="6" w:space="0" w:color="000000"/>
-              <w:left w:val="single" w:sz="6" w:space="0" w:color="000000"/>
-              <w:bottom w:val="single" w:sz="6" w:space="0" w:color="000000"/>
-              <w:right w:val="single" w:sz="6" w:space="0" w:color="000000"/>
-            </w:tcBorders>
-            <w:shd w:color="auto" w:fill="FFFFFF" w:val="clear"/>
-            <w:vAlign w:val="center"/>
-          </w:tcPr>
-          <w:p>
-            <w:pPr>
-              <w:pStyle w:val="Normal"/>
-              <w:suppressAutoHyphens w:val="false"/>
-              <w:spacing w:before="0" w:after="0"/>
-              <w:jc w:val="center"/>
-              <w:textAlignment w:val="baseline"/>
-              <w:rPr>
-                <w:rFonts w:cs="Arial"/>
-                <w:kern w:val="0"/>
-                <w:lang w:eastAsia="es-ES"/>
-              </w:rPr>
-            </w:pPr>
-            <w:r>
-              <w:rPr>
-                <w:rFonts w:cs="Arial"/>
-                <w:kern w:val="0"/>
-                <w:lang w:eastAsia="es-ES"/>
-              </w:rPr>
-            </w:r>
-          </w:p>
-        </w:tc>
-        <w:tc>
-          <w:tcPr>
-            <w:tcW w:w="1078" w:type="dxa"/>
-            <w:tcBorders>
-              <w:top w:val="single" w:sz="6" w:space="0" w:color="000000"/>
-              <w:left w:val="single" w:sz="6" w:space="0" w:color="000000"/>
-              <w:bottom w:val="single" w:sz="6" w:space="0" w:color="000000"/>
-              <w:right w:val="single" w:sz="6" w:space="0" w:color="000000"/>
-            </w:tcBorders>
-            <w:shd w:color="auto" w:fill="FFFFFF" w:val="clear"/>
-            <w:vAlign w:val="center"/>
-          </w:tcPr>
-          <w:p>
-            <w:pPr>
-              <w:pStyle w:val="Normal"/>
-              <w:suppressAutoHyphens w:val="false"/>
-              <w:spacing w:before="0" w:after="0"/>
-              <w:jc w:val="center"/>
-              <w:textAlignment w:val="baseline"/>
-              <w:rPr>
-                <w:rFonts w:cs="Arial"/>
-                <w:kern w:val="0"/>
-                <w:lang w:eastAsia="es-ES"/>
-              </w:rPr>
-            </w:pPr>
-            <w:r>
-              <w:rPr>
-                <w:rFonts w:cs="Arial"/>
-                <w:kern w:val="0"/>
-                <w:lang w:eastAsia="es-ES"/>
-              </w:rPr>
-            </w:r>
-          </w:p>
-        </w:tc>
-      </w:tr>
-      <w:tr>
-        <w:trPr>
-          <w:trHeight w:val="255" w:hRule="atLeast"/>
-        </w:trPr>
-        <w:tc>
-          <w:tcPr>
-            <w:tcW w:w="3977" w:type="dxa"/>
-            <w:tcBorders>
-              <w:top w:val="single" w:sz="6" w:space="0" w:color="000000"/>
-              <w:left w:val="single" w:sz="6" w:space="0" w:color="000000"/>
-              <w:bottom w:val="single" w:sz="6" w:space="0" w:color="000000"/>
-              <w:right w:val="single" w:sz="6" w:space="0" w:color="000000"/>
-            </w:tcBorders>
-            <w:shd w:color="auto" w:fill="FFFFFF" w:val="clear"/>
-          </w:tcPr>
-          <w:p>
-            <w:pPr>
-              <w:pStyle w:val="Normal"/>
-              <w:suppressAutoHyphens w:val="false"/>
-              <w:spacing w:before="0" w:after="0"/>
-              <w:jc w:val="left"/>
-              <w:textAlignment w:val="baseline"/>
-              <w:rPr>
-                <w:rFonts w:cs="Arial"/>
-                <w:b/>
-                <w:bCs/>
-                <w:kern w:val="0"/>
-                <w:lang w:eastAsia="es-ES"/>
-              </w:rPr>
-            </w:pPr>
-            <w:r>
-              <w:rPr>
-                <w:rFonts w:cs="Arial"/>
-                <w:b/>
-                <w:bCs/>
-                <w:kern w:val="0"/>
-                <w:szCs w:val="22"/>
-                <w:lang w:eastAsia="es-ES"/>
-              </w:rPr>
-              <w:t>Fundamentos de hardware.</w:t>
-            </w:r>
-          </w:p>
-        </w:tc>
-        <w:tc>
-          <w:tcPr>
-            <w:tcW w:w="1133" w:type="dxa"/>
-            <w:tcBorders>
-              <w:top w:val="single" w:sz="6" w:space="0" w:color="000000"/>
-              <w:left w:val="single" w:sz="6" w:space="0" w:color="000000"/>
-              <w:bottom w:val="single" w:sz="6" w:space="0" w:color="000000"/>
-              <w:right w:val="single" w:sz="6" w:space="0" w:color="000000"/>
-            </w:tcBorders>
-            <w:shd w:color="auto" w:fill="FFFFFF" w:val="clear"/>
-            <w:vAlign w:val="center"/>
-          </w:tcPr>
-          <w:p>
-            <w:pPr>
-              <w:pStyle w:val="Normal"/>
-              <w:suppressAutoHyphens w:val="false"/>
-              <w:spacing w:before="0" w:after="0"/>
-              <w:jc w:val="center"/>
-              <w:textAlignment w:val="baseline"/>
-              <w:rPr>
-                <w:rFonts w:cs="Arial"/>
-                <w:kern w:val="0"/>
-                <w:lang w:eastAsia="es-ES"/>
-              </w:rPr>
-            </w:pPr>
-            <w:r>
-              <w:rPr>
-                <w:rFonts w:cs="Arial"/>
-                <w:kern w:val="0"/>
-                <w:szCs w:val="22"/>
-                <w:lang w:eastAsia="es-ES"/>
-              </w:rPr>
-              <w:t>Castellano</w:t>
-            </w:r>
-          </w:p>
-        </w:tc>
-        <w:tc>
-          <w:tcPr>
-            <w:tcW w:w="991" w:type="dxa"/>
-            <w:tcBorders>
-              <w:top w:val="single" w:sz="6" w:space="0" w:color="000000"/>
-              <w:left w:val="single" w:sz="6" w:space="0" w:color="000000"/>
-              <w:bottom w:val="single" w:sz="6" w:space="0" w:color="000000"/>
-              <w:right w:val="single" w:sz="6" w:space="0" w:color="000000"/>
-            </w:tcBorders>
-            <w:shd w:color="auto" w:fill="FFFFFF" w:val="clear"/>
-            <w:vAlign w:val="center"/>
-          </w:tcPr>
-          <w:p>
-            <w:pPr>
-              <w:pStyle w:val="Normal"/>
-              <w:suppressAutoHyphens w:val="false"/>
-              <w:spacing w:before="0" w:after="0"/>
-              <w:jc w:val="center"/>
-              <w:textAlignment w:val="baseline"/>
-              <w:rPr>
-                <w:rFonts w:cs="Arial"/>
-                <w:kern w:val="0"/>
-                <w:lang w:eastAsia="es-ES"/>
-              </w:rPr>
-            </w:pPr>
-            <w:r>
-              <w:rPr>
-                <w:rFonts w:cs="Arial"/>
-                <w:kern w:val="0"/>
-                <w:szCs w:val="22"/>
-                <w:lang w:eastAsia="es-ES"/>
-              </w:rPr>
-              <w:t>96</w:t>
-            </w:r>
-          </w:p>
-        </w:tc>
-        <w:tc>
-          <w:tcPr>
-            <w:tcW w:w="936" w:type="dxa"/>
-            <w:tcBorders>
-              <w:top w:val="single" w:sz="6" w:space="0" w:color="000000"/>
-              <w:left w:val="single" w:sz="6" w:space="0" w:color="000000"/>
-              <w:bottom w:val="single" w:sz="6" w:space="0" w:color="000000"/>
-              <w:right w:val="single" w:sz="6" w:space="0" w:color="000000"/>
-            </w:tcBorders>
-            <w:shd w:color="auto" w:fill="FFFFFF" w:val="clear"/>
-            <w:vAlign w:val="center"/>
-          </w:tcPr>
-          <w:p>
-            <w:pPr>
-              <w:pStyle w:val="Normal"/>
-              <w:suppressAutoHyphens w:val="false"/>
-              <w:spacing w:before="0" w:after="0"/>
-              <w:jc w:val="center"/>
-              <w:textAlignment w:val="baseline"/>
-              <w:rPr>
-                <w:rFonts w:cs="Arial"/>
-                <w:kern w:val="0"/>
-                <w:lang w:eastAsia="es-ES"/>
-              </w:rPr>
-            </w:pPr>
-            <w:r>
-              <w:rPr>
-                <w:rFonts w:cs="Arial"/>
-                <w:kern w:val="0"/>
-                <w:szCs w:val="22"/>
-                <w:lang w:eastAsia="es-ES"/>
-              </w:rPr>
-              <w:t>3</w:t>
-            </w:r>
-          </w:p>
-        </w:tc>
-        <w:tc>
-          <w:tcPr>
-            <w:tcW w:w="1222" w:type="dxa"/>
-            <w:tcBorders>
-              <w:top w:val="single" w:sz="6" w:space="0" w:color="000000"/>
-              <w:left w:val="single" w:sz="6" w:space="0" w:color="000000"/>
-              <w:bottom w:val="single" w:sz="6" w:space="0" w:color="000000"/>
-              <w:right w:val="single" w:sz="6" w:space="0" w:color="000000"/>
-            </w:tcBorders>
-            <w:shd w:color="auto" w:fill="FFFFFF" w:val="clear"/>
-            <w:vAlign w:val="center"/>
-          </w:tcPr>
-          <w:p>
-            <w:pPr>
-              <w:pStyle w:val="Normal"/>
-              <w:suppressAutoHyphens w:val="false"/>
-              <w:spacing w:before="0" w:after="0"/>
-              <w:jc w:val="center"/>
-              <w:textAlignment w:val="baseline"/>
-              <w:rPr>
-                <w:rFonts w:cs="Arial"/>
-                <w:kern w:val="0"/>
-                <w:lang w:eastAsia="es-ES"/>
-              </w:rPr>
-            </w:pPr>
-            <w:r>
-              <w:rPr>
-                <w:rFonts w:cs="Arial"/>
-                <w:kern w:val="0"/>
-                <w:lang w:eastAsia="es-ES"/>
-              </w:rPr>
-            </w:r>
-          </w:p>
-        </w:tc>
-        <w:tc>
-          <w:tcPr>
-            <w:tcW w:w="1078" w:type="dxa"/>
-            <w:tcBorders>
-              <w:top w:val="single" w:sz="6" w:space="0" w:color="000000"/>
-              <w:left w:val="single" w:sz="6" w:space="0" w:color="000000"/>
-              <w:bottom w:val="single" w:sz="6" w:space="0" w:color="000000"/>
-              <w:right w:val="single" w:sz="6" w:space="0" w:color="000000"/>
-            </w:tcBorders>
-            <w:shd w:color="auto" w:fill="FFFFFF" w:val="clear"/>
-            <w:vAlign w:val="center"/>
-          </w:tcPr>
-          <w:p>
-            <w:pPr>
-              <w:pStyle w:val="Normal"/>
-              <w:suppressAutoHyphens w:val="false"/>
-              <w:spacing w:before="0" w:after="0"/>
-              <w:jc w:val="center"/>
-              <w:textAlignment w:val="baseline"/>
-              <w:rPr>
-                <w:rFonts w:cs="Arial"/>
-                <w:kern w:val="0"/>
-                <w:lang w:eastAsia="es-ES"/>
-              </w:rPr>
-            </w:pPr>
-            <w:r>
-              <w:rPr>
-                <w:rFonts w:cs="Arial"/>
-                <w:kern w:val="0"/>
-                <w:lang w:eastAsia="es-ES"/>
-              </w:rPr>
-            </w:r>
-          </w:p>
-        </w:tc>
-      </w:tr>
-      <w:tr>
-        <w:trPr>
-          <w:trHeight w:val="255" w:hRule="atLeast"/>
-        </w:trPr>
-        <w:tc>
-          <w:tcPr>
-            <w:tcW w:w="3977" w:type="dxa"/>
-            <w:tcBorders>
-              <w:top w:val="single" w:sz="6" w:space="0" w:color="000000"/>
-              <w:left w:val="single" w:sz="6" w:space="0" w:color="000000"/>
-              <w:bottom w:val="single" w:sz="6" w:space="0" w:color="000000"/>
-              <w:right w:val="single" w:sz="6" w:space="0" w:color="000000"/>
-            </w:tcBorders>
-            <w:shd w:color="auto" w:fill="FFFFFF" w:val="clear"/>
-          </w:tcPr>
-          <w:p>
-            <w:pPr>
-              <w:pStyle w:val="Normal"/>
-              <w:suppressAutoHyphens w:val="false"/>
-              <w:spacing w:before="0" w:after="0"/>
-              <w:jc w:val="left"/>
-              <w:textAlignment w:val="baseline"/>
-              <w:rPr>
-                <w:rFonts w:cs="Arial"/>
-                <w:b/>
-                <w:bCs/>
-                <w:kern w:val="0"/>
-                <w:lang w:eastAsia="es-ES"/>
-              </w:rPr>
-            </w:pPr>
-            <w:r>
-              <w:rPr>
-                <w:rFonts w:cs="Arial"/>
-                <w:b/>
-                <w:bCs/>
-                <w:kern w:val="0"/>
-                <w:szCs w:val="22"/>
-                <w:lang w:eastAsia="es-ES"/>
-              </w:rPr>
-              <w:t>Gestión de bases de datos.</w:t>
-            </w:r>
-          </w:p>
-        </w:tc>
-        <w:tc>
-          <w:tcPr>
-            <w:tcW w:w="1133" w:type="dxa"/>
-            <w:tcBorders>
-              <w:top w:val="single" w:sz="6" w:space="0" w:color="000000"/>
-              <w:left w:val="single" w:sz="6" w:space="0" w:color="000000"/>
-              <w:bottom w:val="single" w:sz="6" w:space="0" w:color="000000"/>
-              <w:right w:val="single" w:sz="6" w:space="0" w:color="000000"/>
-            </w:tcBorders>
-            <w:shd w:color="auto" w:fill="FFFFFF" w:val="clear"/>
-            <w:vAlign w:val="center"/>
-          </w:tcPr>
-          <w:p>
-            <w:pPr>
-              <w:pStyle w:val="Normal"/>
-              <w:suppressAutoHyphens w:val="false"/>
-              <w:spacing w:before="0" w:after="0"/>
-              <w:jc w:val="center"/>
-              <w:textAlignment w:val="baseline"/>
-              <w:rPr>
-                <w:rFonts w:cs="Arial"/>
-                <w:kern w:val="0"/>
-                <w:lang w:eastAsia="es-ES"/>
-              </w:rPr>
-            </w:pPr>
-            <w:r>
-              <w:rPr>
-                <w:rFonts w:cs="Arial"/>
-                <w:kern w:val="0"/>
-                <w:szCs w:val="22"/>
-                <w:lang w:eastAsia="es-ES"/>
-              </w:rPr>
-              <w:t>Castellano</w:t>
-            </w:r>
-          </w:p>
-        </w:tc>
-        <w:tc>
-          <w:tcPr>
-            <w:tcW w:w="991" w:type="dxa"/>
-            <w:tcBorders>
-              <w:top w:val="single" w:sz="6" w:space="0" w:color="000000"/>
-              <w:left w:val="single" w:sz="6" w:space="0" w:color="000000"/>
-              <w:bottom w:val="single" w:sz="6" w:space="0" w:color="000000"/>
-              <w:right w:val="single" w:sz="6" w:space="0" w:color="000000"/>
-            </w:tcBorders>
-            <w:shd w:color="auto" w:fill="FFFFFF" w:val="clear"/>
-            <w:vAlign w:val="center"/>
-          </w:tcPr>
-          <w:p>
-            <w:pPr>
-              <w:pStyle w:val="Normal"/>
-              <w:suppressAutoHyphens w:val="false"/>
-              <w:spacing w:before="0" w:after="0"/>
-              <w:jc w:val="center"/>
-              <w:textAlignment w:val="baseline"/>
-              <w:rPr>
-                <w:rFonts w:cs="Arial"/>
-                <w:kern w:val="0"/>
-                <w:lang w:eastAsia="es-ES"/>
-              </w:rPr>
-            </w:pPr>
-            <w:r>
-              <w:rPr>
-                <w:rFonts w:cs="Arial"/>
-                <w:kern w:val="0"/>
-                <w:szCs w:val="22"/>
-                <w:lang w:eastAsia="es-ES"/>
-              </w:rPr>
-              <w:t>160</w:t>
-            </w:r>
-          </w:p>
-        </w:tc>
-        <w:tc>
-          <w:tcPr>
-            <w:tcW w:w="936" w:type="dxa"/>
-            <w:tcBorders>
-              <w:top w:val="single" w:sz="6" w:space="0" w:color="000000"/>
-              <w:left w:val="single" w:sz="6" w:space="0" w:color="000000"/>
-              <w:bottom w:val="single" w:sz="6" w:space="0" w:color="000000"/>
-              <w:right w:val="single" w:sz="6" w:space="0" w:color="000000"/>
-            </w:tcBorders>
-            <w:shd w:color="auto" w:fill="FFFFFF" w:val="clear"/>
-            <w:vAlign w:val="center"/>
-          </w:tcPr>
-          <w:p>
-            <w:pPr>
-              <w:pStyle w:val="Normal"/>
-              <w:suppressAutoHyphens w:val="false"/>
-              <w:spacing w:before="0" w:after="0"/>
-              <w:jc w:val="center"/>
-              <w:textAlignment w:val="baseline"/>
-              <w:rPr>
-                <w:rFonts w:cs="Arial"/>
-                <w:kern w:val="0"/>
-                <w:lang w:eastAsia="es-ES"/>
-              </w:rPr>
-            </w:pPr>
-            <w:r>
-              <w:rPr>
-                <w:rFonts w:cs="Arial"/>
-                <w:kern w:val="0"/>
-                <w:szCs w:val="22"/>
-                <w:lang w:eastAsia="es-ES"/>
-              </w:rPr>
-              <w:t>5</w:t>
-            </w:r>
-          </w:p>
-        </w:tc>
-        <w:tc>
-          <w:tcPr>
-            <w:tcW w:w="1222" w:type="dxa"/>
-            <w:tcBorders>
-              <w:top w:val="single" w:sz="6" w:space="0" w:color="000000"/>
-              <w:left w:val="single" w:sz="6" w:space="0" w:color="000000"/>
-              <w:bottom w:val="single" w:sz="6" w:space="0" w:color="000000"/>
-              <w:right w:val="single" w:sz="6" w:space="0" w:color="000000"/>
-            </w:tcBorders>
-            <w:shd w:color="auto" w:fill="FFFFFF" w:val="clear"/>
-            <w:vAlign w:val="center"/>
-          </w:tcPr>
-          <w:p>
-            <w:pPr>
-              <w:pStyle w:val="Normal"/>
-              <w:suppressAutoHyphens w:val="false"/>
-              <w:spacing w:before="0" w:after="0"/>
-              <w:jc w:val="center"/>
-              <w:textAlignment w:val="baseline"/>
-              <w:rPr>
-                <w:rFonts w:cs="Arial"/>
-                <w:kern w:val="0"/>
-                <w:lang w:eastAsia="es-ES"/>
-              </w:rPr>
-            </w:pPr>
-            <w:r>
-              <w:rPr>
-                <w:rFonts w:cs="Arial"/>
-                <w:kern w:val="0"/>
-                <w:lang w:eastAsia="es-ES"/>
-              </w:rPr>
-            </w:r>
-          </w:p>
-        </w:tc>
-        <w:tc>
-          <w:tcPr>
-            <w:tcW w:w="1078" w:type="dxa"/>
-            <w:tcBorders>
-              <w:top w:val="single" w:sz="6" w:space="0" w:color="000000"/>
-              <w:left w:val="single" w:sz="6" w:space="0" w:color="000000"/>
-              <w:bottom w:val="single" w:sz="6" w:space="0" w:color="000000"/>
-              <w:right w:val="single" w:sz="6" w:space="0" w:color="000000"/>
-            </w:tcBorders>
-            <w:shd w:color="auto" w:fill="FFFFFF" w:val="clear"/>
-            <w:vAlign w:val="center"/>
-          </w:tcPr>
-          <w:p>
-            <w:pPr>
-              <w:pStyle w:val="Normal"/>
-              <w:suppressAutoHyphens w:val="false"/>
-              <w:spacing w:before="0" w:after="0"/>
-              <w:jc w:val="center"/>
-              <w:textAlignment w:val="baseline"/>
-              <w:rPr>
-                <w:rFonts w:cs="Arial"/>
-                <w:kern w:val="0"/>
-                <w:lang w:eastAsia="es-ES"/>
-              </w:rPr>
-            </w:pPr>
-            <w:r>
-              <w:rPr>
-                <w:rFonts w:cs="Arial"/>
-                <w:kern w:val="0"/>
-                <w:lang w:eastAsia="es-ES"/>
-              </w:rPr>
-            </w:r>
-          </w:p>
-        </w:tc>
-      </w:tr>
-      <w:tr>
-        <w:trPr>
-          <w:trHeight w:val="255" w:hRule="atLeast"/>
-        </w:trPr>
-        <w:tc>
-          <w:tcPr>
-            <w:tcW w:w="3977" w:type="dxa"/>
-            <w:tcBorders>
-              <w:top w:val="single" w:sz="6" w:space="0" w:color="000000"/>
-              <w:left w:val="single" w:sz="6" w:space="0" w:color="000000"/>
-              <w:bottom w:val="single" w:sz="6" w:space="0" w:color="000000"/>
-              <w:right w:val="single" w:sz="6" w:space="0" w:color="000000"/>
-            </w:tcBorders>
-            <w:shd w:color="auto" w:fill="FFFFFF" w:val="clear"/>
-          </w:tcPr>
-          <w:p>
-            <w:pPr>
-              <w:pStyle w:val="Normal"/>
-              <w:tabs>
-                <w:tab w:val="clear" w:pos="708"/>
-                <w:tab w:val="left" w:pos="2715" w:leader="none"/>
-              </w:tabs>
-              <w:suppressAutoHyphens w:val="false"/>
-              <w:spacing w:before="0" w:after="0"/>
-              <w:jc w:val="left"/>
-              <w:textAlignment w:val="baseline"/>
-              <w:rPr>
-                <w:rFonts w:cs="Arial"/>
-                <w:b/>
-                <w:bCs/>
-                <w:kern w:val="0"/>
-                <w:lang w:eastAsia="es-ES"/>
-              </w:rPr>
-            </w:pPr>
-            <w:r>
-              <w:rPr>
-                <w:rFonts w:cs="Arial"/>
-                <w:b/>
-                <w:bCs/>
-                <w:kern w:val="0"/>
-                <w:szCs w:val="22"/>
-                <w:lang w:eastAsia="es-ES"/>
-              </w:rPr>
-              <w:t>Lenguajes de marcas y sistemas de gestión de información.</w:t>
-            </w:r>
-          </w:p>
-        </w:tc>
-        <w:tc>
-          <w:tcPr>
-            <w:tcW w:w="1133" w:type="dxa"/>
-            <w:tcBorders>
-              <w:top w:val="single" w:sz="6" w:space="0" w:color="000000"/>
-              <w:left w:val="single" w:sz="6" w:space="0" w:color="000000"/>
-              <w:bottom w:val="single" w:sz="6" w:space="0" w:color="000000"/>
-              <w:right w:val="single" w:sz="6" w:space="0" w:color="000000"/>
-            </w:tcBorders>
-            <w:shd w:color="auto" w:fill="FFFFFF" w:val="clear"/>
-            <w:vAlign w:val="center"/>
-          </w:tcPr>
-          <w:p>
-            <w:pPr>
-              <w:pStyle w:val="Normal"/>
-              <w:suppressAutoHyphens w:val="false"/>
-              <w:spacing w:before="0" w:after="0"/>
-              <w:jc w:val="center"/>
-              <w:textAlignment w:val="baseline"/>
-              <w:rPr>
-                <w:rFonts w:cs="Arial"/>
-                <w:kern w:val="0"/>
-                <w:lang w:eastAsia="es-ES"/>
-              </w:rPr>
-            </w:pPr>
-            <w:r>
-              <w:rPr>
-                <w:rFonts w:cs="Arial"/>
-                <w:kern w:val="0"/>
-                <w:szCs w:val="22"/>
-                <w:lang w:eastAsia="es-ES"/>
-              </w:rPr>
-              <w:t>Inglés</w:t>
-            </w:r>
-          </w:p>
-        </w:tc>
-        <w:tc>
-          <w:tcPr>
-            <w:tcW w:w="991" w:type="dxa"/>
-            <w:tcBorders>
-              <w:top w:val="single" w:sz="6" w:space="0" w:color="000000"/>
-              <w:left w:val="single" w:sz="6" w:space="0" w:color="000000"/>
-              <w:bottom w:val="single" w:sz="6" w:space="0" w:color="000000"/>
-              <w:right w:val="single" w:sz="6" w:space="0" w:color="000000"/>
-            </w:tcBorders>
-            <w:shd w:color="auto" w:fill="FFFFFF" w:val="clear"/>
-            <w:vAlign w:val="center"/>
-          </w:tcPr>
-          <w:p>
-            <w:pPr>
-              <w:pStyle w:val="Normal"/>
-              <w:suppressAutoHyphens w:val="false"/>
-              <w:spacing w:before="0" w:after="0"/>
-              <w:jc w:val="center"/>
-              <w:textAlignment w:val="baseline"/>
-              <w:rPr>
-                <w:rFonts w:cs="Arial"/>
-                <w:kern w:val="0"/>
-                <w:lang w:eastAsia="es-ES"/>
-              </w:rPr>
-            </w:pPr>
-            <w:r>
-              <w:rPr>
-                <w:rFonts w:cs="Arial"/>
-                <w:kern w:val="0"/>
-                <w:szCs w:val="22"/>
-                <w:lang w:eastAsia="es-ES"/>
-              </w:rPr>
-              <w:t>96</w:t>
-            </w:r>
-          </w:p>
-        </w:tc>
-        <w:tc>
-          <w:tcPr>
-            <w:tcW w:w="936" w:type="dxa"/>
-            <w:tcBorders>
-              <w:top w:val="single" w:sz="6" w:space="0" w:color="000000"/>
-              <w:left w:val="single" w:sz="6" w:space="0" w:color="000000"/>
-              <w:bottom w:val="single" w:sz="6" w:space="0" w:color="000000"/>
-              <w:right w:val="single" w:sz="6" w:space="0" w:color="000000"/>
-            </w:tcBorders>
-            <w:shd w:color="auto" w:fill="FFFFFF" w:val="clear"/>
-            <w:vAlign w:val="center"/>
-          </w:tcPr>
-          <w:p>
-            <w:pPr>
-              <w:pStyle w:val="Normal"/>
-              <w:suppressAutoHyphens w:val="false"/>
-              <w:spacing w:before="0" w:after="0"/>
-              <w:jc w:val="center"/>
-              <w:textAlignment w:val="baseline"/>
-              <w:rPr>
-                <w:rFonts w:cs="Arial"/>
-                <w:kern w:val="0"/>
-                <w:lang w:eastAsia="es-ES"/>
-              </w:rPr>
-            </w:pPr>
-            <w:r>
-              <w:rPr>
-                <w:rFonts w:cs="Arial"/>
-                <w:kern w:val="0"/>
-                <w:szCs w:val="22"/>
-                <w:lang w:eastAsia="es-ES"/>
-              </w:rPr>
-              <w:t>3</w:t>
-            </w:r>
-          </w:p>
-        </w:tc>
-        <w:tc>
-          <w:tcPr>
-            <w:tcW w:w="1222" w:type="dxa"/>
-            <w:tcBorders>
-              <w:top w:val="single" w:sz="6" w:space="0" w:color="000000"/>
-              <w:left w:val="single" w:sz="6" w:space="0" w:color="000000"/>
-              <w:bottom w:val="single" w:sz="6" w:space="0" w:color="000000"/>
-              <w:right w:val="single" w:sz="6" w:space="0" w:color="000000"/>
-            </w:tcBorders>
-            <w:shd w:color="auto" w:fill="FFFFFF" w:val="clear"/>
-            <w:vAlign w:val="center"/>
-          </w:tcPr>
-          <w:p>
-            <w:pPr>
-              <w:pStyle w:val="Normal"/>
-              <w:suppressAutoHyphens w:val="false"/>
-              <w:spacing w:before="0" w:after="0"/>
-              <w:jc w:val="center"/>
-              <w:textAlignment w:val="baseline"/>
-              <w:rPr>
-                <w:rFonts w:cs="Arial"/>
-                <w:kern w:val="0"/>
-                <w:lang w:eastAsia="es-ES"/>
-              </w:rPr>
-            </w:pPr>
-            <w:r>
-              <w:rPr>
-                <w:rFonts w:cs="Arial"/>
-                <w:kern w:val="0"/>
-                <w:lang w:eastAsia="es-ES"/>
-              </w:rPr>
-            </w:r>
-          </w:p>
-        </w:tc>
-        <w:tc>
-          <w:tcPr>
-            <w:tcW w:w="1078" w:type="dxa"/>
-            <w:tcBorders>
-              <w:top w:val="single" w:sz="6" w:space="0" w:color="000000"/>
-              <w:left w:val="single" w:sz="6" w:space="0" w:color="000000"/>
-              <w:bottom w:val="single" w:sz="6" w:space="0" w:color="000000"/>
-              <w:right w:val="single" w:sz="6" w:space="0" w:color="000000"/>
-            </w:tcBorders>
-            <w:shd w:color="auto" w:fill="FFFFFF" w:val="clear"/>
-            <w:vAlign w:val="center"/>
-          </w:tcPr>
-          <w:p>
-            <w:pPr>
-              <w:pStyle w:val="Normal"/>
-              <w:suppressAutoHyphens w:val="false"/>
-              <w:spacing w:before="0" w:after="0"/>
-              <w:jc w:val="center"/>
-              <w:textAlignment w:val="baseline"/>
-              <w:rPr>
-                <w:rFonts w:cs="Arial"/>
-                <w:kern w:val="0"/>
-                <w:lang w:eastAsia="es-ES"/>
-              </w:rPr>
-            </w:pPr>
-            <w:r>
-              <w:rPr>
-                <w:rFonts w:cs="Arial"/>
-                <w:kern w:val="0"/>
-                <w:lang w:eastAsia="es-ES"/>
-              </w:rPr>
-            </w:r>
-          </w:p>
-        </w:tc>
-      </w:tr>
-      <w:tr>
-        <w:trPr>
-          <w:trHeight w:val="255" w:hRule="atLeast"/>
-        </w:trPr>
-        <w:tc>
-          <w:tcPr>
-            <w:tcW w:w="3977" w:type="dxa"/>
-            <w:tcBorders>
-              <w:top w:val="single" w:sz="6" w:space="0" w:color="000000"/>
-              <w:left w:val="single" w:sz="6" w:space="0" w:color="000000"/>
-              <w:bottom w:val="single" w:sz="6" w:space="0" w:color="000000"/>
-              <w:right w:val="single" w:sz="6" w:space="0" w:color="000000"/>
-            </w:tcBorders>
-            <w:shd w:color="auto" w:fill="FFFFFF" w:val="clear"/>
-          </w:tcPr>
-          <w:p>
-            <w:pPr>
-              <w:pStyle w:val="Normal"/>
-              <w:suppressAutoHyphens w:val="false"/>
-              <w:spacing w:before="0" w:after="0"/>
-              <w:jc w:val="left"/>
-              <w:textAlignment w:val="baseline"/>
-              <w:rPr>
-                <w:rFonts w:cs="Arial"/>
-                <w:b/>
-                <w:bCs/>
-                <w:kern w:val="0"/>
-                <w:lang w:eastAsia="es-ES"/>
-              </w:rPr>
-            </w:pPr>
-            <w:r>
-              <w:rPr>
-                <w:rFonts w:cs="Arial"/>
-                <w:b/>
-                <w:bCs/>
-                <w:kern w:val="0"/>
-                <w:szCs w:val="22"/>
-                <w:lang w:eastAsia="es-ES"/>
-              </w:rPr>
-              <w:t>Formación y orientación laboral</w:t>
-            </w:r>
-          </w:p>
-        </w:tc>
-        <w:tc>
-          <w:tcPr>
-            <w:tcW w:w="1133" w:type="dxa"/>
-            <w:tcBorders>
-              <w:top w:val="single" w:sz="6" w:space="0" w:color="000000"/>
-              <w:left w:val="single" w:sz="6" w:space="0" w:color="000000"/>
-              <w:bottom w:val="single" w:sz="6" w:space="0" w:color="000000"/>
-              <w:right w:val="single" w:sz="6" w:space="0" w:color="000000"/>
-            </w:tcBorders>
-            <w:shd w:color="auto" w:fill="FFFFFF" w:val="clear"/>
-            <w:vAlign w:val="center"/>
-          </w:tcPr>
-          <w:p>
-            <w:pPr>
-              <w:pStyle w:val="Normal"/>
-              <w:suppressAutoHyphens w:val="false"/>
-              <w:spacing w:before="0" w:after="0"/>
-              <w:jc w:val="center"/>
-              <w:textAlignment w:val="baseline"/>
-              <w:rPr>
-                <w:rFonts w:cs="Arial"/>
-                <w:kern w:val="0"/>
-                <w:lang w:eastAsia="es-ES"/>
-              </w:rPr>
-            </w:pPr>
-            <w:r>
-              <w:rPr>
-                <w:rFonts w:cs="Arial"/>
-                <w:kern w:val="0"/>
-                <w:szCs w:val="22"/>
-                <w:lang w:eastAsia="es-ES"/>
-              </w:rPr>
-              <w:t>Castellano</w:t>
-            </w:r>
-          </w:p>
-        </w:tc>
-        <w:tc>
-          <w:tcPr>
-            <w:tcW w:w="991" w:type="dxa"/>
-            <w:tcBorders>
-              <w:top w:val="single" w:sz="6" w:space="0" w:color="000000"/>
-              <w:left w:val="single" w:sz="6" w:space="0" w:color="000000"/>
-              <w:bottom w:val="single" w:sz="6" w:space="0" w:color="000000"/>
-              <w:right w:val="single" w:sz="6" w:space="0" w:color="000000"/>
-            </w:tcBorders>
-            <w:shd w:color="auto" w:fill="FFFFFF" w:val="clear"/>
-            <w:vAlign w:val="center"/>
-          </w:tcPr>
-          <w:p>
-            <w:pPr>
-              <w:pStyle w:val="Normal"/>
-              <w:suppressAutoHyphens w:val="false"/>
-              <w:spacing w:before="0" w:after="0"/>
-              <w:jc w:val="center"/>
-              <w:textAlignment w:val="baseline"/>
-              <w:rPr>
-                <w:rFonts w:cs="Arial"/>
-                <w:kern w:val="0"/>
-                <w:lang w:eastAsia="es-ES"/>
-              </w:rPr>
-            </w:pPr>
-            <w:r>
-              <w:rPr>
-                <w:rFonts w:cs="Arial"/>
-                <w:kern w:val="0"/>
-                <w:szCs w:val="22"/>
-                <w:lang w:eastAsia="es-ES"/>
-              </w:rPr>
-              <w:t>96</w:t>
-            </w:r>
-          </w:p>
-        </w:tc>
-        <w:tc>
-          <w:tcPr>
-            <w:tcW w:w="936" w:type="dxa"/>
-            <w:tcBorders>
-              <w:top w:val="single" w:sz="6" w:space="0" w:color="000000"/>
-              <w:left w:val="single" w:sz="6" w:space="0" w:color="000000"/>
-              <w:bottom w:val="single" w:sz="6" w:space="0" w:color="000000"/>
-              <w:right w:val="single" w:sz="6" w:space="0" w:color="000000"/>
-            </w:tcBorders>
-            <w:shd w:color="auto" w:fill="FFFFFF" w:val="clear"/>
-            <w:vAlign w:val="center"/>
-          </w:tcPr>
-          <w:p>
-            <w:pPr>
-              <w:pStyle w:val="Normal"/>
-              <w:suppressAutoHyphens w:val="false"/>
-              <w:spacing w:before="0" w:after="0"/>
-              <w:jc w:val="center"/>
-              <w:textAlignment w:val="baseline"/>
-              <w:rPr>
-                <w:rFonts w:cs="Arial"/>
-                <w:kern w:val="0"/>
-                <w:lang w:eastAsia="es-ES"/>
-              </w:rPr>
-            </w:pPr>
-            <w:r>
-              <w:rPr>
-                <w:rFonts w:cs="Arial"/>
-                <w:kern w:val="0"/>
-                <w:szCs w:val="22"/>
-                <w:lang w:eastAsia="es-ES"/>
-              </w:rPr>
-              <w:t>3</w:t>
-            </w:r>
-          </w:p>
-        </w:tc>
-        <w:tc>
-          <w:tcPr>
-            <w:tcW w:w="1222" w:type="dxa"/>
-            <w:tcBorders>
-              <w:top w:val="single" w:sz="6" w:space="0" w:color="000000"/>
-              <w:left w:val="single" w:sz="6" w:space="0" w:color="000000"/>
-              <w:bottom w:val="single" w:sz="6" w:space="0" w:color="000000"/>
-              <w:right w:val="single" w:sz="6" w:space="0" w:color="000000"/>
-            </w:tcBorders>
-            <w:shd w:color="auto" w:fill="FFFFFF" w:val="clear"/>
-            <w:vAlign w:val="center"/>
-          </w:tcPr>
-          <w:p>
-            <w:pPr>
-              <w:pStyle w:val="Normal"/>
-              <w:suppressAutoHyphens w:val="false"/>
-              <w:spacing w:before="0" w:after="0"/>
-              <w:jc w:val="center"/>
-              <w:textAlignment w:val="baseline"/>
-              <w:rPr>
-                <w:rFonts w:cs="Arial"/>
-                <w:kern w:val="0"/>
-                <w:lang w:eastAsia="es-ES"/>
-              </w:rPr>
-            </w:pPr>
-            <w:r>
-              <w:rPr>
-                <w:rFonts w:cs="Arial"/>
-                <w:kern w:val="0"/>
-                <w:lang w:eastAsia="es-ES"/>
-              </w:rPr>
-            </w:r>
-          </w:p>
-        </w:tc>
-        <w:tc>
-          <w:tcPr>
-            <w:tcW w:w="1078" w:type="dxa"/>
-            <w:tcBorders>
-              <w:top w:val="single" w:sz="6" w:space="0" w:color="000000"/>
-              <w:left w:val="single" w:sz="6" w:space="0" w:color="000000"/>
-              <w:bottom w:val="single" w:sz="6" w:space="0" w:color="000000"/>
-              <w:right w:val="single" w:sz="6" w:space="0" w:color="000000"/>
-            </w:tcBorders>
-            <w:shd w:color="auto" w:fill="FFFFFF" w:val="clear"/>
-            <w:vAlign w:val="center"/>
-          </w:tcPr>
-          <w:p>
-            <w:pPr>
-              <w:pStyle w:val="Normal"/>
-              <w:suppressAutoHyphens w:val="false"/>
-              <w:spacing w:before="0" w:after="0"/>
-              <w:jc w:val="center"/>
-              <w:textAlignment w:val="baseline"/>
-              <w:rPr>
-                <w:rFonts w:cs="Arial"/>
-                <w:kern w:val="0"/>
-                <w:lang w:eastAsia="es-ES"/>
-              </w:rPr>
-            </w:pPr>
-            <w:r>
-              <w:rPr>
-                <w:rFonts w:cs="Arial"/>
-                <w:kern w:val="0"/>
-                <w:lang w:eastAsia="es-ES"/>
-              </w:rPr>
-            </w:r>
-          </w:p>
-        </w:tc>
-      </w:tr>
-      <w:tr>
-        <w:trPr>
-          <w:trHeight w:val="255" w:hRule="atLeast"/>
-        </w:trPr>
-        <w:tc>
-          <w:tcPr>
-            <w:tcW w:w="3977" w:type="dxa"/>
-            <w:tcBorders>
-              <w:top w:val="single" w:sz="6" w:space="0" w:color="000000"/>
-              <w:left w:val="single" w:sz="6" w:space="0" w:color="000000"/>
-              <w:bottom w:val="single" w:sz="6" w:space="0" w:color="000000"/>
-              <w:right w:val="single" w:sz="6" w:space="0" w:color="000000"/>
-            </w:tcBorders>
-            <w:shd w:color="auto" w:fill="FFFFFF" w:val="clear"/>
-          </w:tcPr>
-          <w:p>
-            <w:pPr>
-              <w:pStyle w:val="Normal"/>
-              <w:suppressAutoHyphens w:val="false"/>
-              <w:spacing w:before="0" w:after="0"/>
-              <w:jc w:val="left"/>
-              <w:textAlignment w:val="baseline"/>
-              <w:rPr>
-                <w:rFonts w:cs="Arial"/>
-                <w:b/>
-                <w:bCs/>
-                <w:kern w:val="0"/>
-                <w:lang w:eastAsia="es-ES"/>
-              </w:rPr>
-            </w:pPr>
-            <w:r>
-              <w:rPr>
-                <w:rFonts w:cs="Arial"/>
-                <w:b/>
-                <w:bCs/>
-                <w:kern w:val="0"/>
-                <w:szCs w:val="22"/>
-                <w:lang w:eastAsia="es-ES"/>
-              </w:rPr>
-              <w:t>Inglés Técnico I-S</w:t>
-            </w:r>
-          </w:p>
-        </w:tc>
-        <w:tc>
-          <w:tcPr>
-            <w:tcW w:w="1133" w:type="dxa"/>
-            <w:tcBorders>
-              <w:top w:val="single" w:sz="6" w:space="0" w:color="000000"/>
-              <w:left w:val="single" w:sz="6" w:space="0" w:color="000000"/>
-              <w:bottom w:val="single" w:sz="6" w:space="0" w:color="000000"/>
-              <w:right w:val="single" w:sz="6" w:space="0" w:color="000000"/>
-            </w:tcBorders>
-            <w:shd w:color="auto" w:fill="FFFFFF" w:val="clear"/>
-            <w:vAlign w:val="center"/>
-          </w:tcPr>
-          <w:p>
-            <w:pPr>
-              <w:pStyle w:val="Normal"/>
-              <w:suppressAutoHyphens w:val="false"/>
-              <w:spacing w:before="0" w:after="0"/>
-              <w:jc w:val="center"/>
-              <w:textAlignment w:val="baseline"/>
-              <w:rPr>
-                <w:rFonts w:cs="Arial"/>
-                <w:kern w:val="0"/>
-                <w:lang w:eastAsia="es-ES"/>
-              </w:rPr>
-            </w:pPr>
-            <w:r>
-              <w:rPr>
-                <w:rFonts w:cs="Arial"/>
-                <w:kern w:val="0"/>
-                <w:szCs w:val="22"/>
-                <w:lang w:eastAsia="es-ES"/>
-              </w:rPr>
-              <w:t>Inglés</w:t>
-            </w:r>
-          </w:p>
-        </w:tc>
-        <w:tc>
-          <w:tcPr>
-            <w:tcW w:w="991" w:type="dxa"/>
-            <w:tcBorders>
-              <w:top w:val="single" w:sz="6" w:space="0" w:color="000000"/>
-              <w:left w:val="single" w:sz="6" w:space="0" w:color="000000"/>
-              <w:bottom w:val="single" w:sz="6" w:space="0" w:color="000000"/>
-              <w:right w:val="single" w:sz="6" w:space="0" w:color="000000"/>
-            </w:tcBorders>
-            <w:shd w:color="auto" w:fill="FFFFFF" w:val="clear"/>
-            <w:vAlign w:val="center"/>
-          </w:tcPr>
-          <w:p>
-            <w:pPr>
-              <w:pStyle w:val="Normal"/>
-              <w:suppressAutoHyphens w:val="false"/>
-              <w:spacing w:before="0" w:after="0"/>
-              <w:jc w:val="center"/>
-              <w:textAlignment w:val="baseline"/>
-              <w:rPr>
-                <w:rFonts w:cs="Arial"/>
-                <w:kern w:val="0"/>
-                <w:lang w:eastAsia="es-ES"/>
-              </w:rPr>
-            </w:pPr>
-            <w:r>
-              <w:rPr>
-                <w:rFonts w:cs="Arial"/>
-                <w:kern w:val="0"/>
-                <w:szCs w:val="22"/>
-                <w:lang w:eastAsia="es-ES"/>
-              </w:rPr>
-              <w:t>96</w:t>
-            </w:r>
-          </w:p>
-        </w:tc>
-        <w:tc>
-          <w:tcPr>
-            <w:tcW w:w="936" w:type="dxa"/>
-            <w:tcBorders>
-              <w:top w:val="single" w:sz="6" w:space="0" w:color="000000"/>
-              <w:left w:val="single" w:sz="6" w:space="0" w:color="000000"/>
-              <w:bottom w:val="single" w:sz="6" w:space="0" w:color="000000"/>
-              <w:right w:val="single" w:sz="6" w:space="0" w:color="000000"/>
-            </w:tcBorders>
-            <w:shd w:color="auto" w:fill="FFFFFF" w:val="clear"/>
-            <w:vAlign w:val="center"/>
-          </w:tcPr>
-          <w:p>
-            <w:pPr>
-              <w:pStyle w:val="Normal"/>
-              <w:suppressAutoHyphens w:val="false"/>
-              <w:spacing w:before="0" w:after="0"/>
-              <w:jc w:val="center"/>
-              <w:textAlignment w:val="baseline"/>
-              <w:rPr>
-                <w:rFonts w:cs="Arial"/>
-                <w:kern w:val="0"/>
-                <w:lang w:eastAsia="es-ES"/>
-              </w:rPr>
-            </w:pPr>
-            <w:r>
-              <w:rPr>
-                <w:rFonts w:cs="Arial"/>
-                <w:kern w:val="0"/>
-                <w:szCs w:val="22"/>
-                <w:lang w:eastAsia="es-ES"/>
-              </w:rPr>
-              <w:t>3</w:t>
-            </w:r>
-          </w:p>
-        </w:tc>
-        <w:tc>
-          <w:tcPr>
-            <w:tcW w:w="1222" w:type="dxa"/>
-            <w:tcBorders>
-              <w:top w:val="single" w:sz="6" w:space="0" w:color="000000"/>
-              <w:left w:val="single" w:sz="6" w:space="0" w:color="000000"/>
-              <w:bottom w:val="single" w:sz="6" w:space="0" w:color="000000"/>
-              <w:right w:val="single" w:sz="6" w:space="0" w:color="000000"/>
-            </w:tcBorders>
-            <w:shd w:color="auto" w:fill="FFFFFF" w:val="clear"/>
-            <w:vAlign w:val="center"/>
-          </w:tcPr>
-          <w:p>
-            <w:pPr>
-              <w:pStyle w:val="Normal"/>
-              <w:suppressAutoHyphens w:val="false"/>
-              <w:spacing w:before="0" w:after="0"/>
-              <w:jc w:val="center"/>
-              <w:textAlignment w:val="baseline"/>
-              <w:rPr>
-                <w:rFonts w:cs="Arial"/>
-                <w:kern w:val="0"/>
-                <w:lang w:eastAsia="es-ES"/>
-              </w:rPr>
-            </w:pPr>
-            <w:r>
-              <w:rPr>
-                <w:rFonts w:cs="Arial"/>
-                <w:kern w:val="0"/>
-                <w:lang w:eastAsia="es-ES"/>
-              </w:rPr>
-            </w:r>
-          </w:p>
-        </w:tc>
-        <w:tc>
-          <w:tcPr>
-            <w:tcW w:w="1078" w:type="dxa"/>
-            <w:tcBorders>
-              <w:top w:val="single" w:sz="6" w:space="0" w:color="000000"/>
-              <w:left w:val="single" w:sz="6" w:space="0" w:color="000000"/>
-              <w:bottom w:val="single" w:sz="6" w:space="0" w:color="000000"/>
-              <w:right w:val="single" w:sz="6" w:space="0" w:color="000000"/>
-            </w:tcBorders>
-            <w:shd w:color="auto" w:fill="FFFFFF" w:val="clear"/>
-            <w:vAlign w:val="center"/>
-          </w:tcPr>
-          <w:p>
-            <w:pPr>
-              <w:pStyle w:val="Normal"/>
-              <w:suppressAutoHyphens w:val="false"/>
-              <w:spacing w:before="0" w:after="0"/>
-              <w:jc w:val="center"/>
-              <w:textAlignment w:val="baseline"/>
-              <w:rPr>
-                <w:rFonts w:cs="Arial"/>
-                <w:kern w:val="0"/>
-                <w:lang w:eastAsia="es-ES"/>
-              </w:rPr>
-            </w:pPr>
-            <w:r>
-              <w:rPr>
-                <w:rFonts w:cs="Arial"/>
-                <w:kern w:val="0"/>
-                <w:lang w:eastAsia="es-ES"/>
-              </w:rPr>
-            </w:r>
-          </w:p>
-        </w:tc>
-      </w:tr>
-      <w:tr>
-        <w:trPr>
-          <w:trHeight w:val="255" w:hRule="atLeast"/>
-        </w:trPr>
-        <w:tc>
-          <w:tcPr>
-            <w:tcW w:w="3977" w:type="dxa"/>
-            <w:tcBorders>
-              <w:top w:val="single" w:sz="6" w:space="0" w:color="000000"/>
-              <w:left w:val="single" w:sz="6" w:space="0" w:color="000000"/>
-              <w:bottom w:val="single" w:sz="6" w:space="0" w:color="000000"/>
-              <w:right w:val="single" w:sz="6" w:space="0" w:color="000000"/>
-            </w:tcBorders>
-            <w:shd w:color="auto" w:fill="FFFFFF" w:val="clear"/>
-          </w:tcPr>
-          <w:p>
-            <w:pPr>
-              <w:pStyle w:val="Normal"/>
-              <w:suppressAutoHyphens w:val="false"/>
-              <w:spacing w:before="0" w:after="0"/>
-              <w:jc w:val="left"/>
-              <w:textAlignment w:val="baseline"/>
-              <w:rPr>
-                <w:rFonts w:cs="Arial"/>
-                <w:b/>
-                <w:bCs/>
-                <w:kern w:val="0"/>
-                <w:lang w:eastAsia="es-ES"/>
-              </w:rPr>
-            </w:pPr>
-            <w:r>
-              <w:rPr>
-                <w:rFonts w:cs="Arial"/>
-                <w:b/>
-                <w:bCs/>
-                <w:kern w:val="0"/>
-                <w:szCs w:val="22"/>
-                <w:lang w:eastAsia="es-ES"/>
-              </w:rPr>
-              <w:t>Entornos de desarrollo.</w:t>
-            </w:r>
-          </w:p>
-        </w:tc>
-        <w:tc>
-          <w:tcPr>
-            <w:tcW w:w="1133" w:type="dxa"/>
-            <w:tcBorders>
-              <w:top w:val="single" w:sz="6" w:space="0" w:color="000000"/>
-              <w:left w:val="single" w:sz="6" w:space="0" w:color="000000"/>
-              <w:bottom w:val="single" w:sz="6" w:space="0" w:color="000000"/>
-              <w:right w:val="single" w:sz="6" w:space="0" w:color="000000"/>
-            </w:tcBorders>
-            <w:shd w:color="auto" w:fill="FFFFFF" w:val="clear"/>
-            <w:vAlign w:val="center"/>
-          </w:tcPr>
-          <w:p>
-            <w:pPr>
-              <w:pStyle w:val="Normal"/>
-              <w:suppressAutoHyphens w:val="false"/>
-              <w:spacing w:before="0" w:after="0"/>
-              <w:jc w:val="center"/>
-              <w:textAlignment w:val="baseline"/>
-              <w:rPr>
-                <w:rFonts w:cs="Arial"/>
-                <w:kern w:val="0"/>
-                <w:lang w:eastAsia="es-ES"/>
-              </w:rPr>
-            </w:pPr>
-            <w:r>
-              <w:rPr>
-                <w:rFonts w:cs="Arial"/>
-                <w:kern w:val="0"/>
-                <w:szCs w:val="22"/>
-                <w:lang w:eastAsia="es-ES"/>
-              </w:rPr>
-              <w:t>Castellano</w:t>
-            </w:r>
-          </w:p>
-        </w:tc>
-        <w:tc>
-          <w:tcPr>
-            <w:tcW w:w="991" w:type="dxa"/>
-            <w:tcBorders>
-              <w:top w:val="single" w:sz="6" w:space="0" w:color="000000"/>
-              <w:left w:val="single" w:sz="6" w:space="0" w:color="000000"/>
-              <w:bottom w:val="single" w:sz="6" w:space="0" w:color="000000"/>
-              <w:right w:val="single" w:sz="6" w:space="0" w:color="000000"/>
-            </w:tcBorders>
-            <w:shd w:color="auto" w:fill="FFFFFF" w:val="clear"/>
-            <w:vAlign w:val="center"/>
-          </w:tcPr>
-          <w:p>
-            <w:pPr>
-              <w:pStyle w:val="Normal"/>
-              <w:suppressAutoHyphens w:val="false"/>
-              <w:spacing w:before="0" w:after="0"/>
-              <w:jc w:val="center"/>
-              <w:textAlignment w:val="baseline"/>
-              <w:rPr>
-                <w:rFonts w:cs="Arial"/>
-                <w:kern w:val="0"/>
-                <w:lang w:eastAsia="es-ES"/>
-              </w:rPr>
-            </w:pPr>
-            <w:r>
-              <w:rPr>
-                <w:rFonts w:cs="Arial"/>
-                <w:kern w:val="0"/>
-                <w:szCs w:val="22"/>
-                <w:lang w:eastAsia="es-ES"/>
-              </w:rPr>
-              <w:t>96</w:t>
-            </w:r>
-          </w:p>
-        </w:tc>
-        <w:tc>
-          <w:tcPr>
-            <w:tcW w:w="936" w:type="dxa"/>
-            <w:tcBorders>
-              <w:top w:val="single" w:sz="6" w:space="0" w:color="000000"/>
-              <w:left w:val="single" w:sz="6" w:space="0" w:color="000000"/>
-              <w:bottom w:val="single" w:sz="6" w:space="0" w:color="000000"/>
-              <w:right w:val="single" w:sz="6" w:space="0" w:color="000000"/>
-            </w:tcBorders>
-            <w:shd w:color="auto" w:fill="FFFFFF" w:val="clear"/>
-            <w:vAlign w:val="center"/>
-          </w:tcPr>
-          <w:p>
-            <w:pPr>
-              <w:pStyle w:val="Normal"/>
-              <w:suppressAutoHyphens w:val="false"/>
-              <w:spacing w:before="0" w:after="0"/>
-              <w:jc w:val="center"/>
-              <w:textAlignment w:val="baseline"/>
-              <w:rPr>
-                <w:rFonts w:cs="Arial"/>
-                <w:kern w:val="0"/>
-                <w:lang w:eastAsia="es-ES"/>
-              </w:rPr>
-            </w:pPr>
-            <w:r>
-              <w:rPr>
-                <w:rFonts w:cs="Arial"/>
-                <w:kern w:val="0"/>
-                <w:szCs w:val="22"/>
-                <w:lang w:eastAsia="es-ES"/>
-              </w:rPr>
-              <w:t>3</w:t>
-            </w:r>
-          </w:p>
-        </w:tc>
-        <w:tc>
-          <w:tcPr>
-            <w:tcW w:w="1222" w:type="dxa"/>
-            <w:tcBorders>
-              <w:top w:val="single" w:sz="6" w:space="0" w:color="000000"/>
-              <w:left w:val="single" w:sz="6" w:space="0" w:color="000000"/>
-              <w:bottom w:val="single" w:sz="6" w:space="0" w:color="000000"/>
-              <w:right w:val="single" w:sz="6" w:space="0" w:color="000000"/>
-            </w:tcBorders>
-            <w:shd w:color="auto" w:fill="FFFFFF" w:val="clear"/>
-            <w:vAlign w:val="center"/>
-          </w:tcPr>
-          <w:p>
-            <w:pPr>
-              <w:pStyle w:val="Normal"/>
-              <w:suppressAutoHyphens w:val="false"/>
-              <w:spacing w:before="0" w:after="0"/>
-              <w:jc w:val="center"/>
-              <w:textAlignment w:val="baseline"/>
-              <w:rPr>
-                <w:rFonts w:cs="Arial"/>
-                <w:kern w:val="0"/>
-                <w:lang w:eastAsia="es-ES"/>
-              </w:rPr>
-            </w:pPr>
-            <w:r>
-              <w:rPr>
-                <w:rFonts w:cs="Arial"/>
-                <w:kern w:val="0"/>
-                <w:lang w:eastAsia="es-ES"/>
-              </w:rPr>
-            </w:r>
-          </w:p>
-        </w:tc>
-        <w:tc>
-          <w:tcPr>
-            <w:tcW w:w="1078" w:type="dxa"/>
-            <w:tcBorders>
-              <w:top w:val="single" w:sz="6" w:space="0" w:color="000000"/>
-              <w:left w:val="single" w:sz="6" w:space="0" w:color="000000"/>
-              <w:bottom w:val="single" w:sz="6" w:space="0" w:color="000000"/>
-              <w:right w:val="single" w:sz="6" w:space="0" w:color="000000"/>
-            </w:tcBorders>
-            <w:shd w:color="auto" w:fill="FFFFFF" w:val="clear"/>
-            <w:vAlign w:val="center"/>
-          </w:tcPr>
-          <w:p>
-            <w:pPr>
-              <w:pStyle w:val="Normal"/>
-              <w:suppressAutoHyphens w:val="false"/>
-              <w:spacing w:before="0" w:after="0"/>
-              <w:jc w:val="center"/>
-              <w:textAlignment w:val="baseline"/>
-              <w:rPr>
-                <w:rFonts w:cs="Arial"/>
-                <w:kern w:val="0"/>
-                <w:lang w:eastAsia="es-ES"/>
-              </w:rPr>
-            </w:pPr>
-            <w:r>
-              <w:rPr>
-                <w:rFonts w:cs="Arial"/>
-                <w:kern w:val="0"/>
-                <w:lang w:eastAsia="es-ES"/>
-              </w:rPr>
-            </w:r>
-          </w:p>
-        </w:tc>
-      </w:tr>
-      <w:tr>
-        <w:trPr>
-          <w:trHeight w:val="255" w:hRule="atLeast"/>
-        </w:trPr>
-        <w:tc>
-          <w:tcPr>
-            <w:tcW w:w="3977" w:type="dxa"/>
-            <w:tcBorders>
-              <w:top w:val="single" w:sz="6" w:space="0" w:color="000000"/>
-              <w:left w:val="single" w:sz="6" w:space="0" w:color="000000"/>
-              <w:bottom w:val="single" w:sz="6" w:space="0" w:color="000000"/>
-              <w:right w:val="single" w:sz="6" w:space="0" w:color="000000"/>
-            </w:tcBorders>
-            <w:shd w:color="auto" w:fill="FFFFFF" w:val="clear"/>
-          </w:tcPr>
-          <w:p>
-            <w:pPr>
-              <w:pStyle w:val="Normal"/>
-              <w:suppressAutoHyphens w:val="false"/>
-              <w:spacing w:before="0" w:after="0"/>
-              <w:jc w:val="left"/>
-              <w:textAlignment w:val="baseline"/>
-              <w:rPr>
-                <w:rFonts w:cs="Arial"/>
-                <w:b/>
-                <w:bCs/>
-                <w:kern w:val="0"/>
-                <w:lang w:eastAsia="es-ES"/>
-              </w:rPr>
-            </w:pPr>
-            <w:r>
-              <w:rPr>
-                <w:rFonts w:cs="Arial"/>
-                <w:b/>
-                <w:bCs/>
-                <w:kern w:val="0"/>
-                <w:szCs w:val="22"/>
-                <w:lang w:eastAsia="es-ES"/>
-              </w:rPr>
-              <w:t>Administración de sistemas operativos.</w:t>
-            </w:r>
-          </w:p>
-        </w:tc>
-        <w:tc>
-          <w:tcPr>
-            <w:tcW w:w="1133" w:type="dxa"/>
-            <w:tcBorders>
-              <w:top w:val="single" w:sz="6" w:space="0" w:color="000000"/>
-              <w:left w:val="single" w:sz="6" w:space="0" w:color="000000"/>
-              <w:bottom w:val="single" w:sz="6" w:space="0" w:color="000000"/>
-              <w:right w:val="single" w:sz="6" w:space="0" w:color="000000"/>
-            </w:tcBorders>
-            <w:shd w:color="auto" w:fill="FFFFFF" w:val="clear"/>
-            <w:vAlign w:val="center"/>
-          </w:tcPr>
-          <w:p>
-            <w:pPr>
-              <w:pStyle w:val="Normal"/>
-              <w:suppressAutoHyphens w:val="false"/>
-              <w:spacing w:before="0" w:after="0"/>
-              <w:jc w:val="center"/>
-              <w:textAlignment w:val="baseline"/>
-              <w:rPr>
-                <w:rFonts w:cs="Arial"/>
-                <w:kern w:val="0"/>
-                <w:lang w:eastAsia="es-ES"/>
-              </w:rPr>
-            </w:pPr>
-            <w:r>
-              <w:rPr>
-                <w:rFonts w:cs="Arial"/>
-                <w:kern w:val="0"/>
-                <w:szCs w:val="22"/>
-                <w:lang w:eastAsia="es-ES"/>
-              </w:rPr>
-              <w:t>Castellano</w:t>
-            </w:r>
-          </w:p>
-        </w:tc>
-        <w:tc>
-          <w:tcPr>
-            <w:tcW w:w="991" w:type="dxa"/>
-            <w:tcBorders>
-              <w:top w:val="single" w:sz="6" w:space="0" w:color="000000"/>
-              <w:left w:val="single" w:sz="6" w:space="0" w:color="000000"/>
-              <w:bottom w:val="single" w:sz="6" w:space="0" w:color="000000"/>
-              <w:right w:val="single" w:sz="6" w:space="0" w:color="000000"/>
-            </w:tcBorders>
-            <w:shd w:color="auto" w:fill="FFFFFF" w:val="clear"/>
-            <w:vAlign w:val="center"/>
-          </w:tcPr>
-          <w:p>
-            <w:pPr>
-              <w:pStyle w:val="Normal"/>
-              <w:suppressAutoHyphens w:val="false"/>
-              <w:spacing w:before="0" w:after="0"/>
-              <w:jc w:val="center"/>
-              <w:textAlignment w:val="baseline"/>
-              <w:rPr>
-                <w:rFonts w:cs="Arial"/>
-                <w:kern w:val="0"/>
-                <w:lang w:eastAsia="es-ES"/>
-              </w:rPr>
-            </w:pPr>
-            <w:r>
-              <w:rPr>
-                <w:rFonts w:cs="Arial"/>
-                <w:kern w:val="0"/>
-                <w:szCs w:val="22"/>
-                <w:lang w:eastAsia="es-ES"/>
-              </w:rPr>
-              <w:t>120</w:t>
-            </w:r>
-          </w:p>
-        </w:tc>
-        <w:tc>
-          <w:tcPr>
-            <w:tcW w:w="936" w:type="dxa"/>
-            <w:tcBorders>
-              <w:top w:val="single" w:sz="6" w:space="0" w:color="000000"/>
-              <w:left w:val="single" w:sz="6" w:space="0" w:color="000000"/>
-              <w:bottom w:val="single" w:sz="6" w:space="0" w:color="000000"/>
-              <w:right w:val="single" w:sz="6" w:space="0" w:color="000000"/>
-            </w:tcBorders>
-            <w:shd w:color="auto" w:fill="FFFFFF" w:val="clear"/>
-            <w:vAlign w:val="center"/>
-          </w:tcPr>
-          <w:p>
-            <w:pPr>
-              <w:pStyle w:val="Normal"/>
-              <w:suppressAutoHyphens w:val="false"/>
-              <w:spacing w:before="0" w:after="0"/>
-              <w:jc w:val="center"/>
-              <w:textAlignment w:val="baseline"/>
-              <w:rPr>
-                <w:rFonts w:cs="Arial"/>
-                <w:kern w:val="0"/>
-                <w:lang w:eastAsia="es-ES"/>
-              </w:rPr>
-            </w:pPr>
-            <w:r>
-              <w:rPr>
-                <w:rFonts w:cs="Arial"/>
-                <w:kern w:val="0"/>
-                <w:lang w:eastAsia="es-ES"/>
-              </w:rPr>
-            </w:r>
-          </w:p>
-        </w:tc>
-        <w:tc>
-          <w:tcPr>
-            <w:tcW w:w="1222" w:type="dxa"/>
-            <w:tcBorders>
-              <w:top w:val="single" w:sz="6" w:space="0" w:color="000000"/>
-              <w:left w:val="single" w:sz="6" w:space="0" w:color="000000"/>
-              <w:bottom w:val="single" w:sz="6" w:space="0" w:color="000000"/>
-              <w:right w:val="single" w:sz="6" w:space="0" w:color="000000"/>
-            </w:tcBorders>
-            <w:shd w:color="auto" w:fill="FFFFFF" w:val="clear"/>
-            <w:vAlign w:val="center"/>
-          </w:tcPr>
-          <w:p>
-            <w:pPr>
-              <w:pStyle w:val="Normal"/>
-              <w:suppressAutoHyphens w:val="false"/>
-              <w:spacing w:before="0" w:after="0"/>
-              <w:jc w:val="center"/>
-              <w:textAlignment w:val="baseline"/>
-              <w:rPr>
-                <w:rFonts w:cs="Arial"/>
-                <w:kern w:val="0"/>
-                <w:lang w:eastAsia="es-ES"/>
-              </w:rPr>
-            </w:pPr>
-            <w:r>
-              <w:rPr>
-                <w:rFonts w:cs="Arial"/>
-                <w:kern w:val="0"/>
-                <w:szCs w:val="22"/>
-                <w:lang w:eastAsia="es-ES"/>
-              </w:rPr>
-              <w:t>6</w:t>
-            </w:r>
-          </w:p>
-        </w:tc>
-        <w:tc>
-          <w:tcPr>
-            <w:tcW w:w="1078" w:type="dxa"/>
-            <w:tcBorders>
-              <w:top w:val="single" w:sz="6" w:space="0" w:color="000000"/>
-              <w:left w:val="single" w:sz="6" w:space="0" w:color="000000"/>
-              <w:bottom w:val="single" w:sz="6" w:space="0" w:color="000000"/>
-              <w:right w:val="single" w:sz="6" w:space="0" w:color="000000"/>
-            </w:tcBorders>
-            <w:shd w:color="auto" w:fill="FFFFFF" w:val="clear"/>
-            <w:vAlign w:val="center"/>
-          </w:tcPr>
-          <w:p>
-            <w:pPr>
-              <w:pStyle w:val="Normal"/>
-              <w:suppressAutoHyphens w:val="false"/>
-              <w:spacing w:before="0" w:after="0"/>
-              <w:jc w:val="center"/>
-              <w:textAlignment w:val="baseline"/>
-              <w:rPr>
-                <w:rFonts w:cs="Arial"/>
-                <w:kern w:val="0"/>
-                <w:lang w:eastAsia="es-ES"/>
-              </w:rPr>
-            </w:pPr>
-            <w:r>
-              <w:rPr>
-                <w:rFonts w:cs="Arial"/>
-                <w:kern w:val="0"/>
-                <w:lang w:eastAsia="es-ES"/>
-              </w:rPr>
-            </w:r>
-          </w:p>
-        </w:tc>
-      </w:tr>
-      <w:tr>
-        <w:trPr>
-          <w:trHeight w:val="255" w:hRule="atLeast"/>
-        </w:trPr>
-        <w:tc>
-          <w:tcPr>
-            <w:tcW w:w="3977" w:type="dxa"/>
-            <w:tcBorders>
-              <w:top w:val="single" w:sz="6" w:space="0" w:color="000000"/>
-              <w:left w:val="single" w:sz="6" w:space="0" w:color="000000"/>
-              <w:bottom w:val="single" w:sz="6" w:space="0" w:color="000000"/>
-              <w:right w:val="single" w:sz="6" w:space="0" w:color="000000"/>
-            </w:tcBorders>
-            <w:shd w:color="auto" w:fill="FFFFFF" w:val="clear"/>
-          </w:tcPr>
-          <w:p>
-            <w:pPr>
-              <w:pStyle w:val="Normal"/>
-              <w:suppressAutoHyphens w:val="false"/>
-              <w:spacing w:before="0" w:after="0"/>
-              <w:jc w:val="left"/>
-              <w:textAlignment w:val="baseline"/>
-              <w:rPr>
-                <w:rFonts w:cs="Arial"/>
-                <w:b/>
-                <w:bCs/>
-                <w:kern w:val="0"/>
-                <w:lang w:eastAsia="es-ES"/>
-              </w:rPr>
-            </w:pPr>
-            <w:r>
-              <w:rPr>
-                <w:rFonts w:cs="Arial"/>
-                <w:b/>
-                <w:bCs/>
-                <w:kern w:val="0"/>
-                <w:szCs w:val="22"/>
-                <w:lang w:eastAsia="es-ES"/>
-              </w:rPr>
-              <w:t>Servicios de red e Internet.</w:t>
-            </w:r>
-          </w:p>
-        </w:tc>
-        <w:tc>
-          <w:tcPr>
-            <w:tcW w:w="1133" w:type="dxa"/>
-            <w:tcBorders>
-              <w:top w:val="single" w:sz="6" w:space="0" w:color="000000"/>
-              <w:left w:val="single" w:sz="6" w:space="0" w:color="000000"/>
-              <w:bottom w:val="single" w:sz="6" w:space="0" w:color="000000"/>
-              <w:right w:val="single" w:sz="6" w:space="0" w:color="000000"/>
-            </w:tcBorders>
-            <w:shd w:color="auto" w:fill="FFFFFF" w:val="clear"/>
-            <w:vAlign w:val="center"/>
-          </w:tcPr>
-          <w:p>
-            <w:pPr>
-              <w:pStyle w:val="Normal"/>
-              <w:suppressAutoHyphens w:val="false"/>
-              <w:spacing w:before="0" w:after="0"/>
-              <w:jc w:val="center"/>
-              <w:textAlignment w:val="baseline"/>
-              <w:rPr>
-                <w:rFonts w:cs="Arial"/>
-                <w:kern w:val="0"/>
-                <w:lang w:eastAsia="es-ES"/>
-              </w:rPr>
-            </w:pPr>
-            <w:r>
-              <w:rPr>
-                <w:rFonts w:cs="Arial"/>
-                <w:kern w:val="0"/>
-                <w:szCs w:val="22"/>
-                <w:lang w:eastAsia="es-ES"/>
-              </w:rPr>
-              <w:t>Inglés</w:t>
-            </w:r>
-          </w:p>
-        </w:tc>
-        <w:tc>
-          <w:tcPr>
-            <w:tcW w:w="991" w:type="dxa"/>
-            <w:tcBorders>
-              <w:top w:val="single" w:sz="6" w:space="0" w:color="000000"/>
-              <w:left w:val="single" w:sz="6" w:space="0" w:color="000000"/>
-              <w:bottom w:val="single" w:sz="6" w:space="0" w:color="000000"/>
-              <w:right w:val="single" w:sz="6" w:space="0" w:color="000000"/>
-            </w:tcBorders>
-            <w:shd w:color="auto" w:fill="FFFFFF" w:val="clear"/>
-            <w:vAlign w:val="center"/>
-          </w:tcPr>
-          <w:p>
-            <w:pPr>
-              <w:pStyle w:val="Normal"/>
-              <w:suppressAutoHyphens w:val="false"/>
-              <w:spacing w:before="0" w:after="0"/>
-              <w:jc w:val="center"/>
-              <w:textAlignment w:val="baseline"/>
-              <w:rPr>
-                <w:rFonts w:cs="Arial"/>
-                <w:kern w:val="0"/>
-                <w:lang w:eastAsia="es-ES"/>
-              </w:rPr>
-            </w:pPr>
-            <w:r>
-              <w:rPr>
-                <w:rFonts w:cs="Arial"/>
-                <w:kern w:val="0"/>
-                <w:szCs w:val="22"/>
-                <w:lang w:eastAsia="es-ES"/>
-              </w:rPr>
-              <w:t>120</w:t>
-            </w:r>
-          </w:p>
-        </w:tc>
-        <w:tc>
-          <w:tcPr>
-            <w:tcW w:w="936" w:type="dxa"/>
-            <w:tcBorders>
-              <w:top w:val="single" w:sz="6" w:space="0" w:color="000000"/>
-              <w:left w:val="single" w:sz="6" w:space="0" w:color="000000"/>
-              <w:bottom w:val="single" w:sz="6" w:space="0" w:color="000000"/>
-              <w:right w:val="single" w:sz="6" w:space="0" w:color="000000"/>
-            </w:tcBorders>
-            <w:shd w:color="auto" w:fill="FFFFFF" w:val="clear"/>
-            <w:vAlign w:val="center"/>
-          </w:tcPr>
-          <w:p>
-            <w:pPr>
-              <w:pStyle w:val="Normal"/>
-              <w:suppressAutoHyphens w:val="false"/>
-              <w:spacing w:before="0" w:after="0"/>
-              <w:jc w:val="center"/>
-              <w:textAlignment w:val="baseline"/>
-              <w:rPr>
-                <w:rFonts w:cs="Arial"/>
-                <w:kern w:val="0"/>
-                <w:lang w:eastAsia="es-ES"/>
-              </w:rPr>
-            </w:pPr>
-            <w:r>
-              <w:rPr>
-                <w:rFonts w:cs="Arial"/>
-                <w:kern w:val="0"/>
-                <w:lang w:eastAsia="es-ES"/>
-              </w:rPr>
-            </w:r>
-          </w:p>
-        </w:tc>
-        <w:tc>
-          <w:tcPr>
-            <w:tcW w:w="1222" w:type="dxa"/>
-            <w:tcBorders>
-              <w:top w:val="single" w:sz="6" w:space="0" w:color="000000"/>
-              <w:left w:val="single" w:sz="6" w:space="0" w:color="000000"/>
-              <w:bottom w:val="single" w:sz="6" w:space="0" w:color="000000"/>
-              <w:right w:val="single" w:sz="6" w:space="0" w:color="000000"/>
-            </w:tcBorders>
-            <w:shd w:color="auto" w:fill="FFFFFF" w:val="clear"/>
-            <w:vAlign w:val="center"/>
-          </w:tcPr>
-          <w:p>
-            <w:pPr>
-              <w:pStyle w:val="Normal"/>
-              <w:suppressAutoHyphens w:val="false"/>
-              <w:spacing w:before="0" w:after="0"/>
-              <w:jc w:val="center"/>
-              <w:textAlignment w:val="baseline"/>
-              <w:rPr>
-                <w:rFonts w:cs="Arial"/>
-                <w:kern w:val="0"/>
-                <w:lang w:eastAsia="es-ES"/>
-              </w:rPr>
-            </w:pPr>
-            <w:r>
-              <w:rPr>
-                <w:rFonts w:cs="Arial"/>
-                <w:kern w:val="0"/>
-                <w:szCs w:val="22"/>
-                <w:lang w:eastAsia="es-ES"/>
-              </w:rPr>
-              <w:t>6</w:t>
-            </w:r>
-          </w:p>
-        </w:tc>
-        <w:tc>
-          <w:tcPr>
-            <w:tcW w:w="1078" w:type="dxa"/>
-            <w:tcBorders>
-              <w:top w:val="single" w:sz="6" w:space="0" w:color="000000"/>
-              <w:left w:val="single" w:sz="6" w:space="0" w:color="000000"/>
-              <w:bottom w:val="single" w:sz="6" w:space="0" w:color="000000"/>
-              <w:right w:val="single" w:sz="6" w:space="0" w:color="000000"/>
-            </w:tcBorders>
-            <w:shd w:color="auto" w:fill="FFFFFF" w:val="clear"/>
-            <w:vAlign w:val="center"/>
-          </w:tcPr>
-          <w:p>
-            <w:pPr>
-              <w:pStyle w:val="Normal"/>
-              <w:suppressAutoHyphens w:val="false"/>
-              <w:spacing w:before="0" w:after="0"/>
-              <w:jc w:val="center"/>
-              <w:textAlignment w:val="baseline"/>
-              <w:rPr>
-                <w:rFonts w:cs="Arial"/>
-                <w:kern w:val="0"/>
-                <w:lang w:eastAsia="es-ES"/>
-              </w:rPr>
-            </w:pPr>
-            <w:r>
-              <w:rPr>
-                <w:rFonts w:cs="Arial"/>
-                <w:kern w:val="0"/>
-                <w:lang w:eastAsia="es-ES"/>
-              </w:rPr>
-            </w:r>
-          </w:p>
-        </w:tc>
-      </w:tr>
-      <w:tr>
-        <w:trPr>
-          <w:trHeight w:val="255" w:hRule="atLeast"/>
-        </w:trPr>
-        <w:tc>
-          <w:tcPr>
-            <w:tcW w:w="3977" w:type="dxa"/>
-            <w:tcBorders>
-              <w:top w:val="single" w:sz="6" w:space="0" w:color="000000"/>
-              <w:left w:val="single" w:sz="6" w:space="0" w:color="000000"/>
-              <w:bottom w:val="single" w:sz="6" w:space="0" w:color="000000"/>
-              <w:right w:val="single" w:sz="6" w:space="0" w:color="000000"/>
-            </w:tcBorders>
-            <w:shd w:color="auto" w:fill="FFFFFF" w:val="clear"/>
-          </w:tcPr>
-          <w:p>
-            <w:pPr>
-              <w:pStyle w:val="Normal"/>
-              <w:suppressAutoHyphens w:val="false"/>
-              <w:spacing w:before="0" w:after="0"/>
-              <w:jc w:val="left"/>
-              <w:textAlignment w:val="baseline"/>
-              <w:rPr>
-                <w:rFonts w:cs="Arial"/>
-                <w:b/>
-                <w:bCs/>
-                <w:kern w:val="0"/>
-                <w:lang w:eastAsia="es-ES"/>
-              </w:rPr>
-            </w:pPr>
-            <w:r>
-              <w:rPr>
-                <w:rFonts w:cs="Arial"/>
-                <w:b/>
-                <w:bCs/>
-                <w:kern w:val="0"/>
-                <w:szCs w:val="22"/>
-                <w:lang w:eastAsia="es-ES"/>
-              </w:rPr>
-              <w:t>Implantación de aplicaciones web.</w:t>
-            </w:r>
-          </w:p>
-        </w:tc>
-        <w:tc>
-          <w:tcPr>
-            <w:tcW w:w="1133" w:type="dxa"/>
-            <w:tcBorders>
-              <w:top w:val="single" w:sz="6" w:space="0" w:color="000000"/>
-              <w:left w:val="single" w:sz="6" w:space="0" w:color="000000"/>
-              <w:bottom w:val="single" w:sz="6" w:space="0" w:color="000000"/>
-              <w:right w:val="single" w:sz="6" w:space="0" w:color="000000"/>
-            </w:tcBorders>
-            <w:shd w:color="auto" w:fill="FFFFFF" w:val="clear"/>
-            <w:vAlign w:val="center"/>
-          </w:tcPr>
-          <w:p>
-            <w:pPr>
-              <w:pStyle w:val="Normal"/>
-              <w:suppressAutoHyphens w:val="false"/>
-              <w:spacing w:before="0" w:after="0"/>
-              <w:jc w:val="center"/>
-              <w:textAlignment w:val="baseline"/>
-              <w:rPr>
-                <w:rFonts w:cs="Arial"/>
-                <w:kern w:val="0"/>
-                <w:lang w:eastAsia="es-ES"/>
-              </w:rPr>
-            </w:pPr>
-            <w:r>
-              <w:rPr>
-                <w:rFonts w:cs="Arial"/>
-                <w:kern w:val="0"/>
-                <w:szCs w:val="22"/>
-                <w:lang w:eastAsia="es-ES"/>
-              </w:rPr>
-              <w:t>Castelllano</w:t>
-            </w:r>
-          </w:p>
-        </w:tc>
-        <w:tc>
-          <w:tcPr>
-            <w:tcW w:w="991" w:type="dxa"/>
-            <w:tcBorders>
-              <w:top w:val="single" w:sz="6" w:space="0" w:color="000000"/>
-              <w:left w:val="single" w:sz="6" w:space="0" w:color="000000"/>
-              <w:bottom w:val="single" w:sz="6" w:space="0" w:color="000000"/>
-              <w:right w:val="single" w:sz="6" w:space="0" w:color="000000"/>
-            </w:tcBorders>
-            <w:shd w:color="auto" w:fill="FFFFFF" w:val="clear"/>
-            <w:vAlign w:val="center"/>
-          </w:tcPr>
-          <w:p>
-            <w:pPr>
-              <w:pStyle w:val="Normal"/>
-              <w:suppressAutoHyphens w:val="false"/>
-              <w:spacing w:before="0" w:after="0"/>
-              <w:jc w:val="center"/>
-              <w:textAlignment w:val="baseline"/>
-              <w:rPr>
-                <w:rFonts w:cs="Arial"/>
-                <w:kern w:val="0"/>
-                <w:lang w:eastAsia="es-ES"/>
-              </w:rPr>
-            </w:pPr>
-            <w:r>
-              <w:rPr>
-                <w:rFonts w:cs="Arial"/>
-                <w:kern w:val="0"/>
-                <w:szCs w:val="22"/>
-                <w:lang w:eastAsia="es-ES"/>
-              </w:rPr>
-              <w:t>100</w:t>
-            </w:r>
-          </w:p>
-        </w:tc>
-        <w:tc>
-          <w:tcPr>
-            <w:tcW w:w="936" w:type="dxa"/>
-            <w:tcBorders>
-              <w:top w:val="single" w:sz="6" w:space="0" w:color="000000"/>
-              <w:left w:val="single" w:sz="6" w:space="0" w:color="000000"/>
-              <w:bottom w:val="single" w:sz="6" w:space="0" w:color="000000"/>
-              <w:right w:val="single" w:sz="6" w:space="0" w:color="000000"/>
-            </w:tcBorders>
-            <w:shd w:color="auto" w:fill="FFFFFF" w:val="clear"/>
-            <w:vAlign w:val="center"/>
-          </w:tcPr>
-          <w:p>
-            <w:pPr>
-              <w:pStyle w:val="Normal"/>
-              <w:suppressAutoHyphens w:val="false"/>
-              <w:spacing w:before="0" w:after="0"/>
-              <w:jc w:val="center"/>
-              <w:textAlignment w:val="baseline"/>
-              <w:rPr>
-                <w:rFonts w:cs="Arial"/>
-                <w:kern w:val="0"/>
-                <w:lang w:eastAsia="es-ES"/>
-              </w:rPr>
-            </w:pPr>
-            <w:r>
-              <w:rPr>
-                <w:rFonts w:cs="Arial"/>
-                <w:kern w:val="0"/>
-                <w:lang w:eastAsia="es-ES"/>
-              </w:rPr>
-            </w:r>
-          </w:p>
-        </w:tc>
-        <w:tc>
-          <w:tcPr>
-            <w:tcW w:w="1222" w:type="dxa"/>
-            <w:tcBorders>
-              <w:top w:val="single" w:sz="6" w:space="0" w:color="000000"/>
-              <w:left w:val="single" w:sz="6" w:space="0" w:color="000000"/>
-              <w:bottom w:val="single" w:sz="6" w:space="0" w:color="000000"/>
-              <w:right w:val="single" w:sz="6" w:space="0" w:color="000000"/>
-            </w:tcBorders>
-            <w:shd w:color="auto" w:fill="FFFFFF" w:val="clear"/>
-            <w:vAlign w:val="center"/>
-          </w:tcPr>
-          <w:p>
-            <w:pPr>
-              <w:pStyle w:val="Normal"/>
-              <w:suppressAutoHyphens w:val="false"/>
-              <w:spacing w:before="0" w:after="0"/>
-              <w:jc w:val="center"/>
-              <w:textAlignment w:val="baseline"/>
-              <w:rPr>
-                <w:rFonts w:cs="Arial"/>
-                <w:kern w:val="0"/>
-                <w:lang w:eastAsia="es-ES"/>
-              </w:rPr>
-            </w:pPr>
-            <w:r>
-              <w:rPr>
-                <w:rFonts w:cs="Arial"/>
-                <w:kern w:val="0"/>
-                <w:szCs w:val="22"/>
-                <w:lang w:eastAsia="es-ES"/>
-              </w:rPr>
-              <w:t>5</w:t>
-            </w:r>
-          </w:p>
-        </w:tc>
-        <w:tc>
-          <w:tcPr>
-            <w:tcW w:w="1078" w:type="dxa"/>
-            <w:tcBorders>
-              <w:top w:val="single" w:sz="6" w:space="0" w:color="000000"/>
-              <w:left w:val="single" w:sz="6" w:space="0" w:color="000000"/>
-              <w:bottom w:val="single" w:sz="6" w:space="0" w:color="000000"/>
-              <w:right w:val="single" w:sz="6" w:space="0" w:color="000000"/>
-            </w:tcBorders>
-            <w:shd w:color="auto" w:fill="FFFFFF" w:val="clear"/>
-            <w:vAlign w:val="center"/>
-          </w:tcPr>
-          <w:p>
-            <w:pPr>
-              <w:pStyle w:val="Normal"/>
-              <w:suppressAutoHyphens w:val="false"/>
-              <w:spacing w:before="0" w:after="0"/>
-              <w:jc w:val="center"/>
-              <w:textAlignment w:val="baseline"/>
-              <w:rPr>
-                <w:rFonts w:cs="Arial"/>
-                <w:kern w:val="0"/>
-                <w:lang w:eastAsia="es-ES"/>
-              </w:rPr>
-            </w:pPr>
-            <w:r>
-              <w:rPr>
-                <w:rFonts w:cs="Arial"/>
-                <w:kern w:val="0"/>
-                <w:lang w:eastAsia="es-ES"/>
-              </w:rPr>
-            </w:r>
-          </w:p>
-        </w:tc>
-      </w:tr>
-      <w:tr>
-        <w:trPr>
-          <w:trHeight w:val="255" w:hRule="atLeast"/>
-        </w:trPr>
-        <w:tc>
-          <w:tcPr>
-            <w:tcW w:w="3977" w:type="dxa"/>
-            <w:tcBorders>
-              <w:top w:val="single" w:sz="6" w:space="0" w:color="000000"/>
-              <w:left w:val="single" w:sz="6" w:space="0" w:color="000000"/>
-              <w:bottom w:val="single" w:sz="6" w:space="0" w:color="000000"/>
-              <w:right w:val="single" w:sz="6" w:space="0" w:color="000000"/>
-            </w:tcBorders>
-            <w:shd w:color="auto" w:fill="FFFFFF" w:val="clear"/>
-          </w:tcPr>
-          <w:p>
-            <w:pPr>
-              <w:pStyle w:val="Normal"/>
-              <w:suppressAutoHyphens w:val="false"/>
-              <w:spacing w:before="0" w:after="0"/>
-              <w:jc w:val="left"/>
-              <w:textAlignment w:val="baseline"/>
-              <w:rPr>
-                <w:rFonts w:cs="Arial"/>
-                <w:b/>
-                <w:bCs/>
-                <w:kern w:val="0"/>
-                <w:lang w:eastAsia="es-ES"/>
-              </w:rPr>
-            </w:pPr>
-            <w:r>
-              <w:rPr>
-                <w:rFonts w:cs="Arial"/>
-                <w:b/>
-                <w:bCs/>
-                <w:kern w:val="0"/>
-                <w:szCs w:val="22"/>
-                <w:lang w:eastAsia="es-ES"/>
-              </w:rPr>
-              <w:t>Administración de sistemas gestores de bases de datos.</w:t>
-            </w:r>
-          </w:p>
-        </w:tc>
-        <w:tc>
-          <w:tcPr>
-            <w:tcW w:w="1133" w:type="dxa"/>
-            <w:tcBorders>
-              <w:top w:val="single" w:sz="6" w:space="0" w:color="000000"/>
-              <w:left w:val="single" w:sz="6" w:space="0" w:color="000000"/>
-              <w:bottom w:val="single" w:sz="6" w:space="0" w:color="000000"/>
-              <w:right w:val="single" w:sz="6" w:space="0" w:color="000000"/>
-            </w:tcBorders>
-            <w:shd w:color="auto" w:fill="FFFFFF" w:val="clear"/>
-            <w:vAlign w:val="center"/>
-          </w:tcPr>
-          <w:p>
-            <w:pPr>
-              <w:pStyle w:val="Normal"/>
-              <w:suppressAutoHyphens w:val="false"/>
-              <w:spacing w:before="0" w:after="0"/>
-              <w:jc w:val="center"/>
-              <w:textAlignment w:val="baseline"/>
-              <w:rPr>
-                <w:rFonts w:cs="Arial"/>
-                <w:kern w:val="0"/>
-                <w:lang w:eastAsia="es-ES"/>
-              </w:rPr>
-            </w:pPr>
-            <w:r>
-              <w:rPr>
-                <w:rFonts w:cs="Arial"/>
-                <w:kern w:val="0"/>
-                <w:szCs w:val="22"/>
-                <w:lang w:eastAsia="es-ES"/>
-              </w:rPr>
-              <w:t>Castellano</w:t>
-            </w:r>
-          </w:p>
-        </w:tc>
-        <w:tc>
-          <w:tcPr>
-            <w:tcW w:w="991" w:type="dxa"/>
-            <w:tcBorders>
-              <w:top w:val="single" w:sz="6" w:space="0" w:color="000000"/>
-              <w:left w:val="single" w:sz="6" w:space="0" w:color="000000"/>
-              <w:bottom w:val="single" w:sz="6" w:space="0" w:color="000000"/>
-              <w:right w:val="single" w:sz="6" w:space="0" w:color="000000"/>
-            </w:tcBorders>
-            <w:shd w:color="auto" w:fill="FFFFFF" w:val="clear"/>
-            <w:vAlign w:val="center"/>
-          </w:tcPr>
-          <w:p>
-            <w:pPr>
-              <w:pStyle w:val="Normal"/>
-              <w:suppressAutoHyphens w:val="false"/>
-              <w:spacing w:before="0" w:after="0"/>
-              <w:jc w:val="center"/>
-              <w:textAlignment w:val="baseline"/>
-              <w:rPr>
-                <w:rFonts w:cs="Arial"/>
-                <w:kern w:val="0"/>
-                <w:lang w:eastAsia="es-ES"/>
-              </w:rPr>
-            </w:pPr>
-            <w:r>
-              <w:rPr>
-                <w:rFonts w:cs="Arial"/>
-                <w:kern w:val="0"/>
-                <w:szCs w:val="22"/>
-                <w:lang w:eastAsia="es-ES"/>
-              </w:rPr>
-              <w:t>60</w:t>
-            </w:r>
-          </w:p>
-        </w:tc>
-        <w:tc>
-          <w:tcPr>
-            <w:tcW w:w="936" w:type="dxa"/>
-            <w:tcBorders>
-              <w:top w:val="single" w:sz="6" w:space="0" w:color="000000"/>
-              <w:left w:val="single" w:sz="6" w:space="0" w:color="000000"/>
-              <w:bottom w:val="single" w:sz="6" w:space="0" w:color="000000"/>
-              <w:right w:val="single" w:sz="6" w:space="0" w:color="000000"/>
-            </w:tcBorders>
-            <w:shd w:color="auto" w:fill="FFFFFF" w:val="clear"/>
-            <w:vAlign w:val="center"/>
-          </w:tcPr>
-          <w:p>
-            <w:pPr>
-              <w:pStyle w:val="Normal"/>
-              <w:suppressAutoHyphens w:val="false"/>
-              <w:spacing w:before="0" w:after="0"/>
-              <w:jc w:val="center"/>
-              <w:textAlignment w:val="baseline"/>
-              <w:rPr>
-                <w:rFonts w:cs="Arial"/>
-                <w:kern w:val="0"/>
-                <w:lang w:eastAsia="es-ES"/>
-              </w:rPr>
-            </w:pPr>
-            <w:r>
-              <w:rPr>
-                <w:rFonts w:cs="Arial"/>
-                <w:kern w:val="0"/>
-                <w:lang w:eastAsia="es-ES"/>
-              </w:rPr>
-            </w:r>
-          </w:p>
-        </w:tc>
-        <w:tc>
-          <w:tcPr>
-            <w:tcW w:w="1222" w:type="dxa"/>
-            <w:tcBorders>
-              <w:top w:val="single" w:sz="6" w:space="0" w:color="000000"/>
-              <w:left w:val="single" w:sz="6" w:space="0" w:color="000000"/>
-              <w:bottom w:val="single" w:sz="6" w:space="0" w:color="000000"/>
-              <w:right w:val="single" w:sz="6" w:space="0" w:color="000000"/>
-            </w:tcBorders>
-            <w:shd w:color="auto" w:fill="FFFFFF" w:val="clear"/>
-            <w:vAlign w:val="center"/>
-          </w:tcPr>
-          <w:p>
-            <w:pPr>
-              <w:pStyle w:val="Normal"/>
-              <w:suppressAutoHyphens w:val="false"/>
-              <w:spacing w:before="0" w:after="0"/>
-              <w:jc w:val="center"/>
-              <w:textAlignment w:val="baseline"/>
-              <w:rPr>
-                <w:rFonts w:cs="Arial"/>
-                <w:kern w:val="0"/>
-                <w:lang w:eastAsia="es-ES"/>
-              </w:rPr>
-            </w:pPr>
-            <w:r>
-              <w:rPr>
-                <w:rFonts w:cs="Arial"/>
-                <w:kern w:val="0"/>
-                <w:szCs w:val="22"/>
-                <w:lang w:eastAsia="es-ES"/>
-              </w:rPr>
-              <w:t>3</w:t>
-            </w:r>
-          </w:p>
-        </w:tc>
-        <w:tc>
-          <w:tcPr>
-            <w:tcW w:w="1078" w:type="dxa"/>
-            <w:tcBorders>
-              <w:top w:val="single" w:sz="6" w:space="0" w:color="000000"/>
-              <w:left w:val="single" w:sz="6" w:space="0" w:color="000000"/>
-              <w:bottom w:val="single" w:sz="6" w:space="0" w:color="000000"/>
-              <w:right w:val="single" w:sz="6" w:space="0" w:color="000000"/>
-            </w:tcBorders>
-            <w:shd w:color="auto" w:fill="FFFFFF" w:val="clear"/>
-            <w:vAlign w:val="center"/>
-          </w:tcPr>
-          <w:p>
-            <w:pPr>
-              <w:pStyle w:val="Normal"/>
-              <w:suppressAutoHyphens w:val="false"/>
-              <w:spacing w:before="0" w:after="0"/>
-              <w:jc w:val="center"/>
-              <w:textAlignment w:val="baseline"/>
-              <w:rPr>
-                <w:rFonts w:cs="Arial"/>
-                <w:kern w:val="0"/>
-                <w:lang w:eastAsia="es-ES"/>
-              </w:rPr>
-            </w:pPr>
-            <w:r>
-              <w:rPr>
-                <w:rFonts w:cs="Arial"/>
-                <w:kern w:val="0"/>
-                <w:lang w:eastAsia="es-ES"/>
-              </w:rPr>
-            </w:r>
-          </w:p>
-        </w:tc>
-      </w:tr>
-      <w:tr>
-        <w:trPr>
-          <w:trHeight w:val="255" w:hRule="atLeast"/>
-        </w:trPr>
-        <w:tc>
-          <w:tcPr>
-            <w:tcW w:w="3977" w:type="dxa"/>
-            <w:tcBorders>
-              <w:top w:val="single" w:sz="6" w:space="0" w:color="000000"/>
-              <w:left w:val="single" w:sz="6" w:space="0" w:color="000000"/>
-              <w:bottom w:val="single" w:sz="6" w:space="0" w:color="000000"/>
-              <w:right w:val="single" w:sz="6" w:space="0" w:color="000000"/>
-            </w:tcBorders>
-            <w:shd w:color="auto" w:fill="FFFFFF" w:val="clear"/>
-          </w:tcPr>
-          <w:p>
-            <w:pPr>
-              <w:pStyle w:val="Normal"/>
-              <w:suppressAutoHyphens w:val="false"/>
-              <w:spacing w:before="0" w:after="0"/>
-              <w:jc w:val="left"/>
-              <w:textAlignment w:val="baseline"/>
-              <w:rPr>
-                <w:rFonts w:cs="Arial"/>
-                <w:b/>
-                <w:bCs/>
-                <w:kern w:val="0"/>
-                <w:lang w:eastAsia="es-ES"/>
-              </w:rPr>
-            </w:pPr>
-            <w:r>
-              <w:rPr>
-                <w:rFonts w:cs="Arial"/>
-                <w:b/>
-                <w:bCs/>
-                <w:kern w:val="0"/>
-                <w:szCs w:val="22"/>
-                <w:lang w:eastAsia="es-ES"/>
-              </w:rPr>
-              <w:t>Seguridad y alta disponibilidad.</w:t>
-            </w:r>
-          </w:p>
-        </w:tc>
-        <w:tc>
-          <w:tcPr>
-            <w:tcW w:w="1133" w:type="dxa"/>
-            <w:tcBorders>
-              <w:top w:val="single" w:sz="6" w:space="0" w:color="000000"/>
-              <w:left w:val="single" w:sz="6" w:space="0" w:color="000000"/>
-              <w:bottom w:val="single" w:sz="6" w:space="0" w:color="000000"/>
-              <w:right w:val="single" w:sz="6" w:space="0" w:color="000000"/>
-            </w:tcBorders>
-            <w:shd w:color="auto" w:fill="FFFFFF" w:val="clear"/>
-            <w:vAlign w:val="center"/>
-          </w:tcPr>
-          <w:p>
-            <w:pPr>
-              <w:pStyle w:val="Normal"/>
-              <w:suppressAutoHyphens w:val="false"/>
-              <w:spacing w:before="0" w:after="0"/>
-              <w:jc w:val="center"/>
-              <w:textAlignment w:val="baseline"/>
-              <w:rPr>
-                <w:rFonts w:cs="Arial"/>
-                <w:kern w:val="0"/>
-                <w:lang w:eastAsia="es-ES"/>
-              </w:rPr>
-            </w:pPr>
-            <w:r>
-              <w:rPr>
-                <w:rFonts w:cs="Arial"/>
-                <w:kern w:val="0"/>
-                <w:szCs w:val="22"/>
-                <w:lang w:eastAsia="es-ES"/>
-              </w:rPr>
-              <w:t>Valencià</w:t>
-            </w:r>
-          </w:p>
-        </w:tc>
-        <w:tc>
-          <w:tcPr>
-            <w:tcW w:w="991" w:type="dxa"/>
-            <w:tcBorders>
-              <w:top w:val="single" w:sz="6" w:space="0" w:color="000000"/>
-              <w:left w:val="single" w:sz="6" w:space="0" w:color="000000"/>
-              <w:bottom w:val="single" w:sz="6" w:space="0" w:color="000000"/>
-              <w:right w:val="single" w:sz="6" w:space="0" w:color="000000"/>
-            </w:tcBorders>
-            <w:shd w:color="auto" w:fill="FFFFFF" w:val="clear"/>
-            <w:vAlign w:val="center"/>
-          </w:tcPr>
-          <w:p>
-            <w:pPr>
-              <w:pStyle w:val="Normal"/>
-              <w:suppressAutoHyphens w:val="false"/>
-              <w:spacing w:before="0" w:after="0"/>
-              <w:jc w:val="center"/>
-              <w:textAlignment w:val="baseline"/>
-              <w:rPr>
-                <w:rFonts w:cs="Arial"/>
-                <w:kern w:val="0"/>
-                <w:lang w:eastAsia="es-ES"/>
-              </w:rPr>
-            </w:pPr>
-            <w:r>
-              <w:rPr>
-                <w:rFonts w:cs="Arial"/>
-                <w:kern w:val="0"/>
-                <w:szCs w:val="22"/>
-                <w:lang w:eastAsia="es-ES"/>
-              </w:rPr>
-              <w:t>100</w:t>
-            </w:r>
-          </w:p>
-        </w:tc>
-        <w:tc>
-          <w:tcPr>
-            <w:tcW w:w="936" w:type="dxa"/>
-            <w:tcBorders>
-              <w:top w:val="single" w:sz="6" w:space="0" w:color="000000"/>
-              <w:left w:val="single" w:sz="6" w:space="0" w:color="000000"/>
-              <w:bottom w:val="single" w:sz="6" w:space="0" w:color="000000"/>
-              <w:right w:val="single" w:sz="6" w:space="0" w:color="000000"/>
-            </w:tcBorders>
-            <w:shd w:color="auto" w:fill="FFFFFF" w:val="clear"/>
-            <w:vAlign w:val="center"/>
-          </w:tcPr>
-          <w:p>
-            <w:pPr>
-              <w:pStyle w:val="Normal"/>
-              <w:suppressAutoHyphens w:val="false"/>
-              <w:spacing w:before="0" w:after="0"/>
-              <w:jc w:val="center"/>
-              <w:textAlignment w:val="baseline"/>
-              <w:rPr>
-                <w:rFonts w:cs="Arial"/>
-                <w:kern w:val="0"/>
-                <w:lang w:eastAsia="es-ES"/>
-              </w:rPr>
-            </w:pPr>
-            <w:r>
-              <w:rPr>
-                <w:rFonts w:cs="Arial"/>
-                <w:kern w:val="0"/>
-                <w:lang w:eastAsia="es-ES"/>
-              </w:rPr>
-            </w:r>
-          </w:p>
-        </w:tc>
-        <w:tc>
-          <w:tcPr>
-            <w:tcW w:w="1222" w:type="dxa"/>
-            <w:tcBorders>
-              <w:top w:val="single" w:sz="6" w:space="0" w:color="000000"/>
-              <w:left w:val="single" w:sz="6" w:space="0" w:color="000000"/>
-              <w:bottom w:val="single" w:sz="6" w:space="0" w:color="000000"/>
-              <w:right w:val="single" w:sz="6" w:space="0" w:color="000000"/>
-            </w:tcBorders>
-            <w:shd w:color="auto" w:fill="FFFFFF" w:val="clear"/>
-            <w:vAlign w:val="center"/>
-          </w:tcPr>
-          <w:p>
-            <w:pPr>
-              <w:pStyle w:val="Normal"/>
-              <w:suppressAutoHyphens w:val="false"/>
-              <w:spacing w:before="0" w:after="0"/>
-              <w:jc w:val="center"/>
-              <w:textAlignment w:val="baseline"/>
-              <w:rPr>
-                <w:rFonts w:cs="Arial"/>
-                <w:kern w:val="0"/>
-                <w:lang w:eastAsia="es-ES"/>
-              </w:rPr>
-            </w:pPr>
-            <w:r>
-              <w:rPr>
-                <w:rFonts w:cs="Arial"/>
-                <w:kern w:val="0"/>
-                <w:szCs w:val="22"/>
-                <w:lang w:eastAsia="es-ES"/>
-              </w:rPr>
-              <w:t>5</w:t>
-            </w:r>
-          </w:p>
-        </w:tc>
-        <w:tc>
-          <w:tcPr>
-            <w:tcW w:w="1078" w:type="dxa"/>
-            <w:tcBorders>
-              <w:top w:val="single" w:sz="6" w:space="0" w:color="000000"/>
-              <w:left w:val="single" w:sz="6" w:space="0" w:color="000000"/>
-              <w:bottom w:val="single" w:sz="6" w:space="0" w:color="000000"/>
-              <w:right w:val="single" w:sz="6" w:space="0" w:color="000000"/>
-            </w:tcBorders>
-            <w:shd w:color="auto" w:fill="FFFFFF" w:val="clear"/>
-            <w:vAlign w:val="center"/>
-          </w:tcPr>
-          <w:p>
-            <w:pPr>
-              <w:pStyle w:val="Normal"/>
-              <w:suppressAutoHyphens w:val="false"/>
-              <w:spacing w:before="0" w:after="0"/>
-              <w:jc w:val="center"/>
-              <w:textAlignment w:val="baseline"/>
-              <w:rPr>
-                <w:rFonts w:cs="Arial"/>
-                <w:kern w:val="0"/>
-                <w:lang w:eastAsia="es-ES"/>
-              </w:rPr>
-            </w:pPr>
-            <w:r>
-              <w:rPr>
-                <w:rFonts w:cs="Arial"/>
-                <w:kern w:val="0"/>
-                <w:lang w:eastAsia="es-ES"/>
-              </w:rPr>
-            </w:r>
-          </w:p>
-        </w:tc>
-      </w:tr>
-      <w:tr>
-        <w:trPr>
-          <w:trHeight w:val="255" w:hRule="atLeast"/>
-        </w:trPr>
-        <w:tc>
-          <w:tcPr>
-            <w:tcW w:w="3977" w:type="dxa"/>
-            <w:tcBorders>
-              <w:top w:val="single" w:sz="6" w:space="0" w:color="000000"/>
-              <w:left w:val="single" w:sz="6" w:space="0" w:color="000000"/>
-              <w:bottom w:val="single" w:sz="6" w:space="0" w:color="000000"/>
-              <w:right w:val="single" w:sz="6" w:space="0" w:color="000000"/>
-            </w:tcBorders>
-            <w:shd w:color="auto" w:fill="FFFFFF" w:val="clear"/>
-          </w:tcPr>
-          <w:p>
-            <w:pPr>
-              <w:pStyle w:val="Normal"/>
-              <w:suppressAutoHyphens w:val="false"/>
-              <w:spacing w:before="0" w:after="0"/>
-              <w:jc w:val="left"/>
-              <w:textAlignment w:val="baseline"/>
-              <w:rPr>
-                <w:rFonts w:cs="Arial"/>
-                <w:b/>
-                <w:bCs/>
-                <w:kern w:val="0"/>
-                <w:lang w:eastAsia="es-ES"/>
-              </w:rPr>
-            </w:pPr>
-            <w:r>
-              <w:rPr>
-                <w:rFonts w:cs="Arial"/>
-                <w:b/>
-                <w:bCs/>
-                <w:kern w:val="0"/>
-                <w:szCs w:val="22"/>
-                <w:lang w:eastAsia="es-ES"/>
-              </w:rPr>
-              <w:t>Empresa e iniciativa emprendedora.</w:t>
-            </w:r>
-          </w:p>
-        </w:tc>
-        <w:tc>
-          <w:tcPr>
-            <w:tcW w:w="1133" w:type="dxa"/>
-            <w:tcBorders>
-              <w:top w:val="single" w:sz="6" w:space="0" w:color="000000"/>
-              <w:left w:val="single" w:sz="6" w:space="0" w:color="000000"/>
-              <w:bottom w:val="single" w:sz="6" w:space="0" w:color="000000"/>
-              <w:right w:val="single" w:sz="6" w:space="0" w:color="000000"/>
-            </w:tcBorders>
-            <w:shd w:color="auto" w:fill="FFFFFF" w:val="clear"/>
-            <w:vAlign w:val="center"/>
-          </w:tcPr>
-          <w:p>
-            <w:pPr>
-              <w:pStyle w:val="Normal"/>
-              <w:suppressAutoHyphens w:val="false"/>
-              <w:spacing w:before="0" w:after="0"/>
-              <w:jc w:val="center"/>
-              <w:textAlignment w:val="baseline"/>
-              <w:rPr>
-                <w:rFonts w:cs="Arial"/>
-                <w:kern w:val="0"/>
-                <w:lang w:eastAsia="es-ES"/>
-              </w:rPr>
-            </w:pPr>
-            <w:r>
-              <w:rPr>
-                <w:rFonts w:cs="Arial"/>
-                <w:kern w:val="0"/>
-                <w:szCs w:val="22"/>
-                <w:lang w:eastAsia="es-ES"/>
-              </w:rPr>
-              <w:t>Castellano</w:t>
-            </w:r>
-          </w:p>
-        </w:tc>
-        <w:tc>
-          <w:tcPr>
-            <w:tcW w:w="991" w:type="dxa"/>
-            <w:tcBorders>
-              <w:top w:val="single" w:sz="6" w:space="0" w:color="000000"/>
-              <w:left w:val="single" w:sz="6" w:space="0" w:color="000000"/>
-              <w:bottom w:val="single" w:sz="6" w:space="0" w:color="000000"/>
-              <w:right w:val="single" w:sz="6" w:space="0" w:color="000000"/>
-            </w:tcBorders>
-            <w:shd w:color="auto" w:fill="FFFFFF" w:val="clear"/>
-            <w:vAlign w:val="center"/>
-          </w:tcPr>
-          <w:p>
-            <w:pPr>
-              <w:pStyle w:val="Normal"/>
-              <w:suppressAutoHyphens w:val="false"/>
-              <w:spacing w:before="0" w:after="0"/>
-              <w:jc w:val="center"/>
-              <w:textAlignment w:val="baseline"/>
-              <w:rPr>
-                <w:rFonts w:cs="Arial"/>
-                <w:kern w:val="0"/>
-                <w:lang w:eastAsia="es-ES"/>
-              </w:rPr>
-            </w:pPr>
-            <w:r>
-              <w:rPr>
-                <w:rFonts w:cs="Arial"/>
-                <w:kern w:val="0"/>
-                <w:szCs w:val="22"/>
-                <w:lang w:eastAsia="es-ES"/>
-              </w:rPr>
-              <w:t>60</w:t>
-            </w:r>
-          </w:p>
-        </w:tc>
-        <w:tc>
-          <w:tcPr>
-            <w:tcW w:w="936" w:type="dxa"/>
-            <w:tcBorders>
-              <w:top w:val="single" w:sz="6" w:space="0" w:color="000000"/>
-              <w:left w:val="single" w:sz="6" w:space="0" w:color="000000"/>
-              <w:bottom w:val="single" w:sz="6" w:space="0" w:color="000000"/>
-              <w:right w:val="single" w:sz="6" w:space="0" w:color="000000"/>
-            </w:tcBorders>
-            <w:shd w:color="auto" w:fill="FFFFFF" w:val="clear"/>
-            <w:vAlign w:val="center"/>
-          </w:tcPr>
-          <w:p>
-            <w:pPr>
-              <w:pStyle w:val="Normal"/>
-              <w:suppressAutoHyphens w:val="false"/>
-              <w:spacing w:before="0" w:after="0"/>
-              <w:jc w:val="center"/>
-              <w:textAlignment w:val="baseline"/>
-              <w:rPr>
-                <w:rFonts w:cs="Arial"/>
-                <w:kern w:val="0"/>
-                <w:lang w:eastAsia="es-ES"/>
-              </w:rPr>
-            </w:pPr>
-            <w:r>
-              <w:rPr>
-                <w:rFonts w:cs="Arial"/>
-                <w:kern w:val="0"/>
-                <w:lang w:eastAsia="es-ES"/>
-              </w:rPr>
-            </w:r>
-          </w:p>
-        </w:tc>
-        <w:tc>
-          <w:tcPr>
-            <w:tcW w:w="1222" w:type="dxa"/>
-            <w:tcBorders>
-              <w:top w:val="single" w:sz="6" w:space="0" w:color="000000"/>
-              <w:left w:val="single" w:sz="6" w:space="0" w:color="000000"/>
-              <w:bottom w:val="single" w:sz="6" w:space="0" w:color="000000"/>
-              <w:right w:val="single" w:sz="6" w:space="0" w:color="000000"/>
-            </w:tcBorders>
-            <w:shd w:color="auto" w:fill="FFFFFF" w:val="clear"/>
-            <w:vAlign w:val="center"/>
-          </w:tcPr>
-          <w:p>
-            <w:pPr>
-              <w:pStyle w:val="Normal"/>
-              <w:suppressAutoHyphens w:val="false"/>
-              <w:spacing w:before="0" w:after="0"/>
-              <w:jc w:val="center"/>
-              <w:textAlignment w:val="baseline"/>
-              <w:rPr>
-                <w:rFonts w:cs="Arial"/>
-                <w:kern w:val="0"/>
-                <w:lang w:eastAsia="es-ES"/>
-              </w:rPr>
-            </w:pPr>
-            <w:r>
-              <w:rPr>
-                <w:rFonts w:cs="Arial"/>
-                <w:kern w:val="0"/>
-                <w:szCs w:val="22"/>
-                <w:lang w:eastAsia="es-ES"/>
-              </w:rPr>
-              <w:t>3</w:t>
-            </w:r>
-          </w:p>
-        </w:tc>
-        <w:tc>
-          <w:tcPr>
-            <w:tcW w:w="1078" w:type="dxa"/>
-            <w:tcBorders>
-              <w:top w:val="single" w:sz="6" w:space="0" w:color="000000"/>
-              <w:left w:val="single" w:sz="6" w:space="0" w:color="000000"/>
-              <w:bottom w:val="single" w:sz="6" w:space="0" w:color="000000"/>
-              <w:right w:val="single" w:sz="6" w:space="0" w:color="000000"/>
-            </w:tcBorders>
-            <w:shd w:color="auto" w:fill="FFFFFF" w:val="clear"/>
-            <w:vAlign w:val="center"/>
-          </w:tcPr>
-          <w:p>
-            <w:pPr>
-              <w:pStyle w:val="Normal"/>
-              <w:suppressAutoHyphens w:val="false"/>
-              <w:spacing w:before="0" w:after="0"/>
-              <w:jc w:val="center"/>
-              <w:textAlignment w:val="baseline"/>
-              <w:rPr>
-                <w:rFonts w:cs="Arial"/>
-                <w:kern w:val="0"/>
-                <w:lang w:eastAsia="es-ES"/>
-              </w:rPr>
-            </w:pPr>
-            <w:r>
-              <w:rPr>
-                <w:rFonts w:cs="Arial"/>
-                <w:kern w:val="0"/>
-                <w:lang w:eastAsia="es-ES"/>
-              </w:rPr>
-            </w:r>
-          </w:p>
-        </w:tc>
-      </w:tr>
-      <w:tr>
-        <w:trPr>
-          <w:trHeight w:val="255" w:hRule="atLeast"/>
-        </w:trPr>
-        <w:tc>
-          <w:tcPr>
-            <w:tcW w:w="3977" w:type="dxa"/>
-            <w:tcBorders>
-              <w:top w:val="single" w:sz="6" w:space="0" w:color="000000"/>
-              <w:left w:val="single" w:sz="6" w:space="0" w:color="000000"/>
-              <w:bottom w:val="single" w:sz="6" w:space="0" w:color="000000"/>
-              <w:right w:val="single" w:sz="6" w:space="0" w:color="000000"/>
-            </w:tcBorders>
-            <w:shd w:color="auto" w:fill="FFFFFF" w:val="clear"/>
-          </w:tcPr>
-          <w:p>
-            <w:pPr>
-              <w:pStyle w:val="Normal"/>
-              <w:suppressAutoHyphens w:val="false"/>
-              <w:spacing w:before="0" w:after="0"/>
-              <w:jc w:val="left"/>
-              <w:textAlignment w:val="baseline"/>
-              <w:rPr>
-                <w:rFonts w:cs="Arial"/>
-                <w:b/>
-                <w:bCs/>
-                <w:kern w:val="0"/>
-                <w:lang w:eastAsia="es-ES"/>
-              </w:rPr>
-            </w:pPr>
-            <w:r>
-              <w:rPr>
-                <w:rFonts w:cs="Arial"/>
-                <w:b/>
-                <w:bCs/>
-                <w:kern w:val="0"/>
-                <w:szCs w:val="22"/>
-                <w:lang w:eastAsia="es-ES"/>
-              </w:rPr>
-              <w:t>Inglés Técnico II-S</w:t>
-            </w:r>
-          </w:p>
-        </w:tc>
-        <w:tc>
-          <w:tcPr>
-            <w:tcW w:w="1133" w:type="dxa"/>
-            <w:tcBorders>
-              <w:top w:val="single" w:sz="6" w:space="0" w:color="000000"/>
-              <w:left w:val="single" w:sz="6" w:space="0" w:color="000000"/>
-              <w:bottom w:val="single" w:sz="6" w:space="0" w:color="000000"/>
-              <w:right w:val="single" w:sz="6" w:space="0" w:color="000000"/>
-            </w:tcBorders>
-            <w:shd w:color="auto" w:fill="FFFFFF" w:val="clear"/>
-            <w:vAlign w:val="center"/>
-          </w:tcPr>
-          <w:p>
-            <w:pPr>
-              <w:pStyle w:val="Normal"/>
-              <w:suppressAutoHyphens w:val="false"/>
-              <w:spacing w:before="0" w:after="0"/>
-              <w:jc w:val="center"/>
-              <w:textAlignment w:val="baseline"/>
-              <w:rPr>
-                <w:rFonts w:cs="Arial"/>
-                <w:kern w:val="0"/>
-                <w:lang w:eastAsia="es-ES"/>
-              </w:rPr>
-            </w:pPr>
-            <w:r>
-              <w:rPr>
-                <w:rFonts w:cs="Arial"/>
-                <w:kern w:val="0"/>
-                <w:szCs w:val="22"/>
-                <w:lang w:eastAsia="es-ES"/>
-              </w:rPr>
-              <w:t>Inglés</w:t>
-            </w:r>
-          </w:p>
-        </w:tc>
-        <w:tc>
-          <w:tcPr>
-            <w:tcW w:w="991" w:type="dxa"/>
-            <w:tcBorders>
-              <w:top w:val="single" w:sz="6" w:space="0" w:color="000000"/>
-              <w:left w:val="single" w:sz="6" w:space="0" w:color="000000"/>
-              <w:bottom w:val="single" w:sz="6" w:space="0" w:color="000000"/>
-              <w:right w:val="single" w:sz="6" w:space="0" w:color="000000"/>
-            </w:tcBorders>
-            <w:shd w:color="auto" w:fill="FFFFFF" w:val="clear"/>
-            <w:vAlign w:val="center"/>
-          </w:tcPr>
-          <w:p>
-            <w:pPr>
-              <w:pStyle w:val="Normal"/>
-              <w:suppressAutoHyphens w:val="false"/>
-              <w:spacing w:before="0" w:after="0"/>
-              <w:jc w:val="center"/>
-              <w:textAlignment w:val="baseline"/>
-              <w:rPr>
-                <w:rFonts w:cs="Arial"/>
-                <w:kern w:val="0"/>
-                <w:lang w:eastAsia="es-ES"/>
-              </w:rPr>
-            </w:pPr>
-            <w:r>
-              <w:rPr>
-                <w:rFonts w:cs="Arial"/>
-                <w:kern w:val="0"/>
-                <w:szCs w:val="22"/>
-                <w:lang w:eastAsia="es-ES"/>
-              </w:rPr>
-              <w:t>40</w:t>
-            </w:r>
-          </w:p>
-        </w:tc>
-        <w:tc>
-          <w:tcPr>
-            <w:tcW w:w="936" w:type="dxa"/>
-            <w:tcBorders>
-              <w:top w:val="single" w:sz="6" w:space="0" w:color="000000"/>
-              <w:left w:val="single" w:sz="6" w:space="0" w:color="000000"/>
-              <w:bottom w:val="single" w:sz="6" w:space="0" w:color="000000"/>
-              <w:right w:val="single" w:sz="6" w:space="0" w:color="000000"/>
-            </w:tcBorders>
-            <w:shd w:color="auto" w:fill="FFFFFF" w:val="clear"/>
-            <w:vAlign w:val="center"/>
-          </w:tcPr>
-          <w:p>
-            <w:pPr>
-              <w:pStyle w:val="Normal"/>
-              <w:suppressAutoHyphens w:val="false"/>
-              <w:spacing w:before="0" w:after="0"/>
-              <w:jc w:val="center"/>
-              <w:textAlignment w:val="baseline"/>
-              <w:rPr>
-                <w:rFonts w:cs="Arial"/>
-                <w:kern w:val="0"/>
-                <w:lang w:eastAsia="es-ES"/>
-              </w:rPr>
-            </w:pPr>
-            <w:r>
-              <w:rPr>
-                <w:rFonts w:cs="Arial"/>
-                <w:kern w:val="0"/>
-                <w:lang w:eastAsia="es-ES"/>
-              </w:rPr>
-            </w:r>
-          </w:p>
-        </w:tc>
-        <w:tc>
-          <w:tcPr>
-            <w:tcW w:w="1222" w:type="dxa"/>
-            <w:tcBorders>
-              <w:top w:val="single" w:sz="6" w:space="0" w:color="000000"/>
-              <w:left w:val="single" w:sz="6" w:space="0" w:color="000000"/>
-              <w:bottom w:val="single" w:sz="6" w:space="0" w:color="000000"/>
-              <w:right w:val="single" w:sz="6" w:space="0" w:color="000000"/>
-            </w:tcBorders>
-            <w:shd w:color="auto" w:fill="FFFFFF" w:val="clear"/>
-            <w:vAlign w:val="center"/>
-          </w:tcPr>
-          <w:p>
-            <w:pPr>
-              <w:pStyle w:val="Normal"/>
-              <w:suppressAutoHyphens w:val="false"/>
-              <w:spacing w:before="0" w:after="0"/>
-              <w:jc w:val="center"/>
-              <w:textAlignment w:val="baseline"/>
-              <w:rPr>
-                <w:rFonts w:cs="Arial"/>
-                <w:kern w:val="0"/>
-                <w:lang w:eastAsia="es-ES"/>
-              </w:rPr>
-            </w:pPr>
-            <w:r>
-              <w:rPr>
-                <w:rFonts w:cs="Arial"/>
-                <w:kern w:val="0"/>
-                <w:szCs w:val="22"/>
-                <w:lang w:eastAsia="es-ES"/>
-              </w:rPr>
-              <w:t>2</w:t>
-            </w:r>
-          </w:p>
-        </w:tc>
-        <w:tc>
-          <w:tcPr>
-            <w:tcW w:w="1078" w:type="dxa"/>
-            <w:tcBorders>
-              <w:top w:val="single" w:sz="6" w:space="0" w:color="000000"/>
-              <w:left w:val="single" w:sz="6" w:space="0" w:color="000000"/>
-              <w:bottom w:val="single" w:sz="6" w:space="0" w:color="000000"/>
-              <w:right w:val="single" w:sz="6" w:space="0" w:color="000000"/>
-            </w:tcBorders>
-            <w:shd w:color="auto" w:fill="FFFFFF" w:val="clear"/>
-            <w:vAlign w:val="center"/>
-          </w:tcPr>
-          <w:p>
-            <w:pPr>
-              <w:pStyle w:val="Normal"/>
-              <w:suppressAutoHyphens w:val="false"/>
-              <w:spacing w:before="0" w:after="0"/>
-              <w:jc w:val="center"/>
-              <w:textAlignment w:val="baseline"/>
-              <w:rPr>
-                <w:rFonts w:cs="Arial"/>
-                <w:kern w:val="0"/>
-                <w:lang w:eastAsia="es-ES"/>
-              </w:rPr>
-            </w:pPr>
-            <w:r>
-              <w:rPr>
-                <w:rFonts w:cs="Arial"/>
-                <w:kern w:val="0"/>
-                <w:lang w:eastAsia="es-ES"/>
-              </w:rPr>
-            </w:r>
-          </w:p>
-        </w:tc>
-      </w:tr>
-      <w:tr>
-        <w:trPr>
-          <w:trHeight w:val="255" w:hRule="atLeast"/>
-        </w:trPr>
-        <w:tc>
-          <w:tcPr>
-            <w:tcW w:w="3977" w:type="dxa"/>
-            <w:tcBorders>
-              <w:top w:val="single" w:sz="6" w:space="0" w:color="000000"/>
-              <w:left w:val="single" w:sz="6" w:space="0" w:color="000000"/>
-              <w:bottom w:val="single" w:sz="6" w:space="0" w:color="000000"/>
-              <w:right w:val="single" w:sz="6" w:space="0" w:color="000000"/>
-            </w:tcBorders>
-            <w:shd w:color="auto" w:fill="FFFFFF" w:val="clear"/>
-          </w:tcPr>
-          <w:p>
-            <w:pPr>
-              <w:pStyle w:val="Normal"/>
-              <w:suppressAutoHyphens w:val="false"/>
-              <w:spacing w:before="0" w:after="0"/>
-              <w:jc w:val="left"/>
-              <w:textAlignment w:val="baseline"/>
-              <w:rPr>
-                <w:rFonts w:cs="Arial"/>
-                <w:b/>
-                <w:bCs/>
-                <w:kern w:val="0"/>
-                <w:lang w:eastAsia="es-ES"/>
-              </w:rPr>
-            </w:pPr>
-            <w:r>
-              <w:rPr>
-                <w:rFonts w:cs="Arial"/>
-                <w:b/>
-                <w:bCs/>
-                <w:kern w:val="0"/>
-                <w:szCs w:val="22"/>
-                <w:lang w:eastAsia="es-ES"/>
-              </w:rPr>
-              <w:t>Formación en centros de trabajo.</w:t>
-            </w:r>
-          </w:p>
-        </w:tc>
-        <w:tc>
-          <w:tcPr>
-            <w:tcW w:w="1133" w:type="dxa"/>
-            <w:tcBorders>
-              <w:top w:val="single" w:sz="6" w:space="0" w:color="000000"/>
-              <w:left w:val="single" w:sz="6" w:space="0" w:color="000000"/>
-              <w:bottom w:val="single" w:sz="6" w:space="0" w:color="000000"/>
-              <w:right w:val="single" w:sz="6" w:space="0" w:color="000000"/>
-            </w:tcBorders>
-            <w:shd w:color="auto" w:fill="FFFFFF" w:val="clear"/>
-            <w:vAlign w:val="center"/>
-          </w:tcPr>
-          <w:p>
-            <w:pPr>
-              <w:pStyle w:val="Normal"/>
-              <w:suppressAutoHyphens w:val="false"/>
-              <w:spacing w:before="0" w:after="0"/>
-              <w:jc w:val="center"/>
-              <w:textAlignment w:val="baseline"/>
-              <w:rPr>
-                <w:rFonts w:cs="Arial"/>
-                <w:kern w:val="0"/>
-                <w:lang w:eastAsia="es-ES"/>
-              </w:rPr>
-            </w:pPr>
-            <w:r>
-              <w:rPr>
-                <w:rFonts w:cs="Arial"/>
-                <w:kern w:val="0"/>
-                <w:lang w:eastAsia="es-ES"/>
-              </w:rPr>
-            </w:r>
-          </w:p>
-        </w:tc>
-        <w:tc>
-          <w:tcPr>
-            <w:tcW w:w="991" w:type="dxa"/>
-            <w:tcBorders>
-              <w:top w:val="single" w:sz="6" w:space="0" w:color="000000"/>
-              <w:left w:val="single" w:sz="6" w:space="0" w:color="000000"/>
-              <w:bottom w:val="single" w:sz="6" w:space="0" w:color="000000"/>
-              <w:right w:val="single" w:sz="6" w:space="0" w:color="000000"/>
-            </w:tcBorders>
-            <w:shd w:color="auto" w:fill="FFFFFF" w:val="clear"/>
-            <w:vAlign w:val="center"/>
-          </w:tcPr>
-          <w:p>
-            <w:pPr>
-              <w:pStyle w:val="Normal"/>
-              <w:suppressAutoHyphens w:val="false"/>
-              <w:spacing w:before="0" w:after="0"/>
-              <w:jc w:val="center"/>
-              <w:textAlignment w:val="baseline"/>
-              <w:rPr>
-                <w:rFonts w:cs="Arial"/>
-                <w:kern w:val="0"/>
-                <w:lang w:eastAsia="es-ES"/>
-              </w:rPr>
-            </w:pPr>
-            <w:r>
-              <w:rPr>
-                <w:rFonts w:cs="Arial"/>
-                <w:kern w:val="0"/>
-                <w:szCs w:val="22"/>
-                <w:lang w:eastAsia="es-ES"/>
-              </w:rPr>
-              <w:t>400</w:t>
-            </w:r>
-          </w:p>
-        </w:tc>
-        <w:tc>
-          <w:tcPr>
-            <w:tcW w:w="936" w:type="dxa"/>
-            <w:tcBorders>
-              <w:top w:val="single" w:sz="6" w:space="0" w:color="000000"/>
-              <w:left w:val="single" w:sz="6" w:space="0" w:color="000000"/>
-              <w:bottom w:val="single" w:sz="6" w:space="0" w:color="000000"/>
-              <w:right w:val="single" w:sz="6" w:space="0" w:color="000000"/>
-            </w:tcBorders>
-            <w:shd w:color="auto" w:fill="FFFFFF" w:val="clear"/>
-            <w:vAlign w:val="center"/>
-          </w:tcPr>
-          <w:p>
-            <w:pPr>
-              <w:pStyle w:val="Normal"/>
-              <w:suppressAutoHyphens w:val="false"/>
-              <w:spacing w:before="0" w:after="0"/>
-              <w:jc w:val="center"/>
-              <w:textAlignment w:val="baseline"/>
-              <w:rPr>
-                <w:rFonts w:cs="Arial"/>
-                <w:kern w:val="0"/>
-                <w:lang w:eastAsia="es-ES"/>
-              </w:rPr>
-            </w:pPr>
-            <w:r>
-              <w:rPr>
-                <w:rFonts w:cs="Arial"/>
-                <w:kern w:val="0"/>
-                <w:lang w:eastAsia="es-ES"/>
-              </w:rPr>
-            </w:r>
-          </w:p>
-        </w:tc>
-        <w:tc>
-          <w:tcPr>
-            <w:tcW w:w="1222" w:type="dxa"/>
-            <w:tcBorders>
-              <w:top w:val="single" w:sz="6" w:space="0" w:color="000000"/>
-              <w:left w:val="single" w:sz="6" w:space="0" w:color="000000"/>
-              <w:bottom w:val="single" w:sz="6" w:space="0" w:color="000000"/>
-              <w:right w:val="single" w:sz="6" w:space="0" w:color="000000"/>
-            </w:tcBorders>
-            <w:shd w:color="auto" w:fill="FFFFFF" w:val="clear"/>
-            <w:vAlign w:val="center"/>
-          </w:tcPr>
-          <w:p>
-            <w:pPr>
-              <w:pStyle w:val="Normal"/>
-              <w:suppressAutoHyphens w:val="false"/>
-              <w:spacing w:before="0" w:after="0"/>
-              <w:jc w:val="center"/>
-              <w:textAlignment w:val="baseline"/>
-              <w:rPr>
-                <w:rFonts w:cs="Arial"/>
-                <w:kern w:val="0"/>
-                <w:lang w:eastAsia="es-ES"/>
-              </w:rPr>
-            </w:pPr>
-            <w:r>
-              <w:rPr>
-                <w:rFonts w:cs="Arial"/>
-                <w:kern w:val="0"/>
-                <w:lang w:eastAsia="es-ES"/>
-              </w:rPr>
-            </w:r>
-          </w:p>
-        </w:tc>
-        <w:tc>
-          <w:tcPr>
-            <w:tcW w:w="1078" w:type="dxa"/>
-            <w:tcBorders>
-              <w:top w:val="single" w:sz="6" w:space="0" w:color="000000"/>
-              <w:left w:val="single" w:sz="6" w:space="0" w:color="000000"/>
-              <w:bottom w:val="single" w:sz="6" w:space="0" w:color="000000"/>
-              <w:right w:val="single" w:sz="6" w:space="0" w:color="000000"/>
-            </w:tcBorders>
-            <w:shd w:color="auto" w:fill="FFFFFF" w:val="clear"/>
-            <w:vAlign w:val="center"/>
-          </w:tcPr>
-          <w:p>
-            <w:pPr>
-              <w:pStyle w:val="Normal"/>
-              <w:suppressAutoHyphens w:val="false"/>
-              <w:spacing w:before="0" w:after="0"/>
-              <w:jc w:val="center"/>
-              <w:textAlignment w:val="baseline"/>
-              <w:rPr>
-                <w:rFonts w:cs="Arial"/>
-                <w:kern w:val="0"/>
-                <w:lang w:eastAsia="es-ES"/>
-              </w:rPr>
-            </w:pPr>
-            <w:r>
-              <w:rPr>
-                <w:rFonts w:cs="Arial"/>
-                <w:kern w:val="0"/>
-                <w:lang w:eastAsia="es-ES"/>
-              </w:rPr>
-            </w:r>
-          </w:p>
-        </w:tc>
-      </w:tr>
-      <w:tr>
-        <w:trPr>
-          <w:trHeight w:val="255" w:hRule="atLeast"/>
-        </w:trPr>
-        <w:tc>
-          <w:tcPr>
-            <w:tcW w:w="3977" w:type="dxa"/>
-            <w:tcBorders>
-              <w:top w:val="single" w:sz="6" w:space="0" w:color="000000"/>
-              <w:left w:val="single" w:sz="6" w:space="0" w:color="000000"/>
-              <w:bottom w:val="single" w:sz="6" w:space="0" w:color="000000"/>
-              <w:right w:val="single" w:sz="6" w:space="0" w:color="000000"/>
-            </w:tcBorders>
-            <w:shd w:color="auto" w:fill="FFFFFF" w:val="clear"/>
-          </w:tcPr>
-          <w:p>
-            <w:pPr>
-              <w:pStyle w:val="Normal"/>
-              <w:suppressAutoHyphens w:val="false"/>
-              <w:spacing w:before="0" w:after="0"/>
-              <w:jc w:val="left"/>
-              <w:textAlignment w:val="baseline"/>
-              <w:rPr>
-                <w:rFonts w:cs="Arial"/>
-                <w:b/>
-                <w:bCs/>
-                <w:kern w:val="0"/>
-                <w:lang w:eastAsia="es-ES"/>
-              </w:rPr>
-            </w:pPr>
-            <w:r>
-              <w:rPr>
-                <w:rFonts w:cs="Arial"/>
-                <w:b/>
-                <w:bCs/>
-                <w:kern w:val="0"/>
-                <w:szCs w:val="22"/>
-                <w:lang w:eastAsia="es-ES"/>
-              </w:rPr>
-              <w:t>Proyecto de administración de sistemas informáticos en red</w:t>
-            </w:r>
-          </w:p>
-        </w:tc>
-        <w:tc>
-          <w:tcPr>
-            <w:tcW w:w="1133" w:type="dxa"/>
-            <w:tcBorders>
-              <w:top w:val="single" w:sz="6" w:space="0" w:color="000000"/>
-              <w:left w:val="single" w:sz="6" w:space="0" w:color="000000"/>
-              <w:bottom w:val="single" w:sz="6" w:space="0" w:color="000000"/>
-              <w:right w:val="single" w:sz="6" w:space="0" w:color="000000"/>
-            </w:tcBorders>
-            <w:shd w:color="auto" w:fill="FFFFFF" w:val="clear"/>
-            <w:vAlign w:val="center"/>
-          </w:tcPr>
-          <w:p>
-            <w:pPr>
-              <w:pStyle w:val="Normal"/>
-              <w:suppressAutoHyphens w:val="false"/>
-              <w:spacing w:before="0" w:after="0"/>
-              <w:jc w:val="center"/>
-              <w:textAlignment w:val="baseline"/>
-              <w:rPr>
-                <w:rFonts w:cs="Arial"/>
-                <w:kern w:val="0"/>
-                <w:lang w:eastAsia="es-ES"/>
-              </w:rPr>
-            </w:pPr>
-            <w:r>
-              <w:rPr>
-                <w:rFonts w:cs="Arial"/>
-                <w:kern w:val="0"/>
-                <w:lang w:eastAsia="es-ES"/>
-              </w:rPr>
-            </w:r>
-          </w:p>
-        </w:tc>
-        <w:tc>
-          <w:tcPr>
-            <w:tcW w:w="991" w:type="dxa"/>
-            <w:tcBorders>
-              <w:top w:val="single" w:sz="6" w:space="0" w:color="000000"/>
-              <w:left w:val="single" w:sz="6" w:space="0" w:color="000000"/>
-              <w:bottom w:val="single" w:sz="6" w:space="0" w:color="000000"/>
-              <w:right w:val="single" w:sz="6" w:space="0" w:color="000000"/>
-            </w:tcBorders>
-            <w:shd w:color="auto" w:fill="FFFFFF" w:val="clear"/>
-            <w:vAlign w:val="center"/>
-          </w:tcPr>
-          <w:p>
-            <w:pPr>
-              <w:pStyle w:val="Normal"/>
-              <w:suppressAutoHyphens w:val="false"/>
-              <w:spacing w:before="0" w:after="0"/>
-              <w:jc w:val="center"/>
-              <w:textAlignment w:val="baseline"/>
-              <w:rPr>
-                <w:rFonts w:cs="Arial"/>
-                <w:kern w:val="0"/>
-                <w:lang w:eastAsia="es-ES"/>
-              </w:rPr>
-            </w:pPr>
-            <w:r>
-              <w:rPr>
-                <w:rFonts w:cs="Arial"/>
-                <w:kern w:val="0"/>
-                <w:szCs w:val="22"/>
-                <w:lang w:eastAsia="es-ES"/>
-              </w:rPr>
-              <w:t>40</w:t>
-            </w:r>
-          </w:p>
-        </w:tc>
-        <w:tc>
-          <w:tcPr>
-            <w:tcW w:w="936" w:type="dxa"/>
-            <w:tcBorders>
-              <w:top w:val="single" w:sz="6" w:space="0" w:color="000000"/>
-              <w:left w:val="single" w:sz="6" w:space="0" w:color="000000"/>
-              <w:bottom w:val="single" w:sz="6" w:space="0" w:color="000000"/>
-              <w:right w:val="single" w:sz="6" w:space="0" w:color="000000"/>
-            </w:tcBorders>
-            <w:shd w:color="auto" w:fill="FFFFFF" w:val="clear"/>
-            <w:vAlign w:val="center"/>
-          </w:tcPr>
-          <w:p>
-            <w:pPr>
-              <w:pStyle w:val="Normal"/>
-              <w:suppressAutoHyphens w:val="false"/>
-              <w:spacing w:before="0" w:after="0"/>
-              <w:jc w:val="center"/>
-              <w:textAlignment w:val="baseline"/>
-              <w:rPr>
-                <w:rFonts w:cs="Arial"/>
-                <w:kern w:val="0"/>
-                <w:lang w:eastAsia="es-ES"/>
-              </w:rPr>
-            </w:pPr>
-            <w:r>
-              <w:rPr>
-                <w:rFonts w:cs="Arial"/>
-                <w:kern w:val="0"/>
-                <w:lang w:eastAsia="es-ES"/>
-              </w:rPr>
-            </w:r>
-          </w:p>
-        </w:tc>
-        <w:tc>
-          <w:tcPr>
-            <w:tcW w:w="1222" w:type="dxa"/>
-            <w:tcBorders>
-              <w:top w:val="single" w:sz="6" w:space="0" w:color="000000"/>
-              <w:left w:val="single" w:sz="6" w:space="0" w:color="000000"/>
-              <w:bottom w:val="single" w:sz="6" w:space="0" w:color="000000"/>
-              <w:right w:val="single" w:sz="6" w:space="0" w:color="000000"/>
-            </w:tcBorders>
-            <w:shd w:color="auto" w:fill="FFFFFF" w:val="clear"/>
-            <w:vAlign w:val="center"/>
-          </w:tcPr>
-          <w:p>
-            <w:pPr>
-              <w:pStyle w:val="Normal"/>
-              <w:suppressAutoHyphens w:val="false"/>
-              <w:spacing w:before="0" w:after="0"/>
-              <w:jc w:val="center"/>
-              <w:textAlignment w:val="baseline"/>
-              <w:rPr>
-                <w:rFonts w:cs="Arial"/>
-                <w:kern w:val="0"/>
-                <w:lang w:eastAsia="es-ES"/>
-              </w:rPr>
-            </w:pPr>
-            <w:r>
-              <w:rPr>
-                <w:rFonts w:cs="Arial"/>
-                <w:kern w:val="0"/>
-                <w:lang w:eastAsia="es-ES"/>
-              </w:rPr>
-            </w:r>
-          </w:p>
-        </w:tc>
-        <w:tc>
-          <w:tcPr>
-            <w:tcW w:w="1078" w:type="dxa"/>
-            <w:tcBorders>
-              <w:top w:val="single" w:sz="6" w:space="0" w:color="000000"/>
-              <w:left w:val="single" w:sz="6" w:space="0" w:color="000000"/>
-              <w:bottom w:val="single" w:sz="6" w:space="0" w:color="000000"/>
-              <w:right w:val="single" w:sz="6" w:space="0" w:color="000000"/>
-            </w:tcBorders>
-            <w:shd w:color="auto" w:fill="FFFFFF" w:val="clear"/>
-            <w:vAlign w:val="center"/>
-          </w:tcPr>
-          <w:p>
-            <w:pPr>
-              <w:pStyle w:val="Normal"/>
-              <w:suppressAutoHyphens w:val="false"/>
-              <w:spacing w:before="0" w:after="0"/>
-              <w:jc w:val="center"/>
-              <w:textAlignment w:val="baseline"/>
-              <w:rPr>
-                <w:rFonts w:cs="Arial"/>
-                <w:kern w:val="0"/>
-                <w:lang w:eastAsia="es-ES"/>
-              </w:rPr>
-            </w:pPr>
-            <w:r>
-              <w:rPr>
-                <w:rFonts w:cs="Arial"/>
-                <w:kern w:val="0"/>
-                <w:lang w:eastAsia="es-ES"/>
-              </w:rPr>
-            </w:r>
-          </w:p>
-        </w:tc>
-      </w:tr>
-      <w:tr>
-        <w:trPr>
-          <w:trHeight w:val="255" w:hRule="atLeast"/>
-        </w:trPr>
-        <w:tc>
-          <w:tcPr>
-            <w:tcW w:w="3977" w:type="dxa"/>
-            <w:tcBorders>
-              <w:top w:val="single" w:sz="6" w:space="0" w:color="000000"/>
-              <w:left w:val="single" w:sz="6" w:space="0" w:color="000000"/>
-              <w:bottom w:val="single" w:sz="6" w:space="0" w:color="000000"/>
-              <w:right w:val="single" w:sz="6" w:space="0" w:color="000000"/>
-            </w:tcBorders>
-            <w:shd w:color="auto" w:fill="FFFFFF" w:val="clear"/>
-          </w:tcPr>
-          <w:p>
-            <w:pPr>
-              <w:pStyle w:val="Normal"/>
-              <w:suppressAutoHyphens w:val="false"/>
-              <w:spacing w:before="0" w:after="0"/>
-              <w:textAlignment w:val="baseline"/>
-              <w:rPr>
-                <w:rFonts w:ascii="Segoe UI" w:hAnsi="Segoe UI" w:cs="Segoe UI"/>
-                <w:b/>
-                <w:bCs/>
-                <w:kern w:val="0"/>
-                <w:sz w:val="18"/>
-                <w:szCs w:val="18"/>
-                <w:lang w:eastAsia="es-ES"/>
-              </w:rPr>
-            </w:pPr>
-            <w:r>
-              <w:rPr>
-                <w:rFonts w:cs="Arial"/>
-                <w:b/>
-                <w:bCs/>
-                <w:kern w:val="0"/>
-                <w:szCs w:val="22"/>
-                <w:lang w:eastAsia="es-ES"/>
-              </w:rPr>
-              <w:t>Total ciclo formativo</w:t>
-            </w:r>
-          </w:p>
-        </w:tc>
-        <w:tc>
-          <w:tcPr>
-            <w:tcW w:w="1133" w:type="dxa"/>
-            <w:tcBorders>
-              <w:top w:val="single" w:sz="6" w:space="0" w:color="000000"/>
-              <w:left w:val="single" w:sz="6" w:space="0" w:color="000000"/>
-              <w:bottom w:val="single" w:sz="6" w:space="0" w:color="000000"/>
-              <w:right w:val="single" w:sz="6" w:space="0" w:color="000000"/>
-            </w:tcBorders>
-            <w:shd w:color="auto" w:fill="FFFFFF" w:val="clear"/>
-            <w:vAlign w:val="center"/>
-          </w:tcPr>
-          <w:p>
-            <w:pPr>
-              <w:pStyle w:val="Normal"/>
-              <w:suppressAutoHyphens w:val="false"/>
-              <w:spacing w:before="0" w:after="0"/>
-              <w:jc w:val="center"/>
-              <w:textAlignment w:val="baseline"/>
-              <w:rPr>
-                <w:rFonts w:ascii="Segoe UI" w:hAnsi="Segoe UI" w:cs="Segoe UI"/>
-                <w:kern w:val="0"/>
-                <w:sz w:val="18"/>
-                <w:szCs w:val="18"/>
-                <w:lang w:eastAsia="es-ES"/>
-              </w:rPr>
-            </w:pPr>
-            <w:r>
-              <w:rPr>
-                <w:rFonts w:cs="Segoe UI" w:ascii="Segoe UI" w:hAnsi="Segoe UI"/>
-                <w:kern w:val="0"/>
-                <w:sz w:val="18"/>
-                <w:szCs w:val="18"/>
-                <w:lang w:eastAsia="es-ES"/>
-              </w:rPr>
-            </w:r>
-          </w:p>
-        </w:tc>
-        <w:tc>
-          <w:tcPr>
-            <w:tcW w:w="991" w:type="dxa"/>
-            <w:tcBorders>
-              <w:top w:val="single" w:sz="6" w:space="0" w:color="000000"/>
-              <w:left w:val="single" w:sz="6" w:space="0" w:color="000000"/>
-              <w:bottom w:val="single" w:sz="6" w:space="0" w:color="000000"/>
-              <w:right w:val="single" w:sz="6" w:space="0" w:color="000000"/>
-            </w:tcBorders>
-            <w:shd w:color="auto" w:fill="FFFFFF" w:val="clear"/>
-            <w:vAlign w:val="center"/>
-          </w:tcPr>
-          <w:p>
-            <w:pPr>
-              <w:pStyle w:val="Normal"/>
-              <w:suppressAutoHyphens w:val="false"/>
-              <w:spacing w:before="0" w:after="0"/>
-              <w:jc w:val="center"/>
-              <w:textAlignment w:val="baseline"/>
-              <w:rPr>
-                <w:rFonts w:ascii="Segoe UI" w:hAnsi="Segoe UI" w:cs="Segoe UI"/>
-                <w:kern w:val="0"/>
-                <w:sz w:val="18"/>
-                <w:szCs w:val="18"/>
-                <w:lang w:eastAsia="es-ES"/>
-              </w:rPr>
-            </w:pPr>
-            <w:r>
-              <w:rPr>
-                <w:rFonts w:cs="Arial"/>
-                <w:kern w:val="0"/>
-                <w:szCs w:val="22"/>
-                <w:lang w:eastAsia="es-ES"/>
-              </w:rPr>
-              <w:t>2096</w:t>
-            </w:r>
-          </w:p>
-        </w:tc>
-        <w:tc>
-          <w:tcPr>
-            <w:tcW w:w="936" w:type="dxa"/>
-            <w:tcBorders>
-              <w:top w:val="single" w:sz="6" w:space="0" w:color="000000"/>
-              <w:left w:val="single" w:sz="6" w:space="0" w:color="000000"/>
-              <w:bottom w:val="single" w:sz="6" w:space="0" w:color="000000"/>
-              <w:right w:val="single" w:sz="6" w:space="0" w:color="000000"/>
-            </w:tcBorders>
-            <w:shd w:color="auto" w:fill="FFFFFF" w:val="clear"/>
-            <w:vAlign w:val="center"/>
-          </w:tcPr>
-          <w:p>
-            <w:pPr>
-              <w:pStyle w:val="Normal"/>
-              <w:suppressAutoHyphens w:val="false"/>
-              <w:spacing w:before="0" w:after="0"/>
-              <w:jc w:val="center"/>
-              <w:textAlignment w:val="baseline"/>
-              <w:rPr>
-                <w:rFonts w:ascii="Segoe UI" w:hAnsi="Segoe UI" w:cs="Segoe UI"/>
-                <w:kern w:val="0"/>
-                <w:sz w:val="18"/>
-                <w:szCs w:val="18"/>
-                <w:lang w:eastAsia="es-ES"/>
-              </w:rPr>
-            </w:pPr>
-            <w:r>
-              <w:rPr>
-                <w:rFonts w:cs="Segoe UI" w:ascii="Segoe UI" w:hAnsi="Segoe UI"/>
-                <w:kern w:val="0"/>
-                <w:sz w:val="18"/>
-                <w:szCs w:val="18"/>
-                <w:lang w:eastAsia="es-ES"/>
-              </w:rPr>
-            </w:r>
-          </w:p>
-        </w:tc>
-        <w:tc>
-          <w:tcPr>
-            <w:tcW w:w="1222" w:type="dxa"/>
-            <w:tcBorders>
-              <w:top w:val="single" w:sz="6" w:space="0" w:color="000000"/>
-              <w:left w:val="single" w:sz="6" w:space="0" w:color="000000"/>
-              <w:bottom w:val="single" w:sz="6" w:space="0" w:color="000000"/>
-              <w:right w:val="single" w:sz="6" w:space="0" w:color="000000"/>
-            </w:tcBorders>
-            <w:shd w:color="auto" w:fill="FFFFFF" w:val="clear"/>
-            <w:vAlign w:val="center"/>
-          </w:tcPr>
-          <w:p>
-            <w:pPr>
-              <w:pStyle w:val="Normal"/>
-              <w:suppressAutoHyphens w:val="false"/>
-              <w:spacing w:before="0" w:after="0"/>
-              <w:jc w:val="center"/>
-              <w:textAlignment w:val="baseline"/>
-              <w:rPr>
-                <w:rFonts w:ascii="Segoe UI" w:hAnsi="Segoe UI" w:cs="Segoe UI"/>
-                <w:kern w:val="0"/>
-                <w:sz w:val="18"/>
-                <w:szCs w:val="18"/>
-                <w:lang w:eastAsia="es-ES"/>
-              </w:rPr>
-            </w:pPr>
-            <w:r>
-              <w:rPr>
-                <w:rFonts w:cs="Segoe UI" w:ascii="Segoe UI" w:hAnsi="Segoe UI"/>
-                <w:kern w:val="0"/>
-                <w:sz w:val="18"/>
-                <w:szCs w:val="18"/>
-                <w:lang w:eastAsia="es-ES"/>
-              </w:rPr>
-            </w:r>
-          </w:p>
-        </w:tc>
-        <w:tc>
-          <w:tcPr>
-            <w:tcW w:w="1078" w:type="dxa"/>
-            <w:tcBorders>
-              <w:top w:val="single" w:sz="6" w:space="0" w:color="000000"/>
-              <w:left w:val="single" w:sz="6" w:space="0" w:color="000000"/>
-              <w:bottom w:val="single" w:sz="6" w:space="0" w:color="000000"/>
-              <w:right w:val="single" w:sz="6" w:space="0" w:color="000000"/>
-            </w:tcBorders>
-            <w:shd w:color="auto" w:fill="FFFFFF" w:val="clear"/>
-            <w:vAlign w:val="center"/>
-          </w:tcPr>
-          <w:p>
-            <w:pPr>
-              <w:pStyle w:val="Normal"/>
-              <w:suppressAutoHyphens w:val="false"/>
-              <w:spacing w:before="0" w:after="0"/>
-              <w:jc w:val="center"/>
-              <w:textAlignment w:val="baseline"/>
-              <w:rPr>
-                <w:rFonts w:ascii="Segoe UI" w:hAnsi="Segoe UI" w:cs="Segoe UI"/>
-                <w:kern w:val="0"/>
-                <w:sz w:val="18"/>
-                <w:szCs w:val="18"/>
-                <w:lang w:eastAsia="es-ES"/>
-              </w:rPr>
-            </w:pPr>
-            <w:r>
-              <w:rPr>
-                <w:rFonts w:cs="Segoe UI" w:ascii="Segoe UI" w:hAnsi="Segoe UI"/>
-                <w:kern w:val="0"/>
-                <w:sz w:val="18"/>
-                <w:szCs w:val="18"/>
-                <w:lang w:eastAsia="es-ES"/>
-              </w:rPr>
-            </w:r>
-            <w:bookmarkStart w:id="2" w:name="_Hlk171504303"/>
-            <w:bookmarkStart w:id="3" w:name="_Hlk171504303"/>
-            <w:bookmarkEnd w:id="3"/>
+        <w:tc>
+          <w:p>
+            <w:r>
+              <w:t>0374. Administración de sistemas operativos</w:t>
+            </w:r>
+          </w:p>
+        </w:tc>
+        <w:tc>
+          <w:p>
+            <w:r>
+              <w:t>2º</w:t>
+            </w:r>
+          </w:p>
+        </w:tc>
+        <w:tc>
+          <w:p>
+            <w:r>
+              <w:t>133</w:t>
+            </w:r>
+          </w:p>
+        </w:tc>
+        <w:tc>
+          <w:p>
+            <w:r>
+              <w:t>4</w:t>
+            </w:r>
           </w:p>
         </w:tc>
       </w:tr>
@@ -7629,7 +3013,7 @@
                 <w:sz w:val="20"/>
                 <w:lang w:val="es-ES" w:bidi="hi-IN"/>
               </w:rPr>
-              <w:t>120</w:t>
+              <w:t>133</w:t>
             </w:r>
           </w:p>
         </w:tc>
@@ -7718,7 +3102,7 @@
                 <w:sz w:val="20"/>
                 <w:lang w:val="es-ES" w:bidi="hi-IN"/>
               </w:rPr>
-              <w:t>6</w:t>
+              <w:t>4</w:t>
             </w:r>
           </w:p>
         </w:tc>
@@ -11663,6 +7047,31 @@
       </w:r>
     </w:p>
     <w:p>
+      <w:r>
+        <w:t>Balance horario 2026/2027: 133 horas curriculares y 4 horas semanales. El antiguo cuadro del ciclo se sustituye por los datos del módulo para evitar mezclar planes de estudios.</w:t>
+      </w:r>
+    </w:p>
+    <w:p>
+      <w:r>
+        <w:t>Propuesta de aula de Elche: martes y jueves, dos horas por día, del 10/09/2026 al 23/03/2027. Horario orientativo pendiente de confirmación: 51 sesiones, 102 horas. Primera evaluación: 52 horas; segunda: 50 horas.</w:t>
+      </w:r>
+    </w:p>
+    <w:p>
+      <w:r>
+        <w:t>UD1: 24 h (incluye unas 5 h de fundamentos Linux); UD2: 8 h; UD3: 16 h; UD4: 16 h; UD5: 16 h; UD6: 8 h; UD7: 4 h. Total unidades: 92 h. Pruebas, recuperación y cierre: 10 h (4 + 6), incluidas en las 102 h de aula.</w:t>
+      </w:r>
+    </w:p>
+    <w:p>
+      <w:r>
+        <w:t>Balance pendiente: 133 − 102 = 31 horas. No se consideran impartidas ni se asignan automáticamente a empresa. El centro debe concretar su distribución, actividades y resultados de aprendizaje en el plan formativo, o revisar el calendario de clases. Las 400 horas de empresa del escenario corresponden al conjunto del ciclo, no a ASO.</w:t>
+      </w:r>
+    </w:p>
+    <w:p>
+      <w:r>
+        <w:t>Referencia de fechas y selección de actividades: docs/temporalizacion_2026_2027.md. Cálculo reproducible: preparacion/temporalizacion/calcular.py. Las horas de cada unidad son una propuesta de aula, no el reparto completo de las 133 horas curriculares. Las ponderaciones de RA se mantienen.</w:t>
+      </w:r>
+    </w:p>
+    <w:p>
       <w:pPr>
         <w:pStyle w:val="Heading1"/>
         <w:pBdr>
@@ -14306,7 +9715,7 @@
                 <w:bCs/>
                 <w:color w:themeColor="background1" w:val="FFFFFF"/>
               </w:rPr>
-              <w:t>Sesiones</w:t>
+              <w:t>Horas de aula (propuesta 2026/2027)</w:t>
             </w:r>
           </w:p>
         </w:tc>
@@ -15649,7 +11058,7 @@
                 <w:bCs/>
                 <w:color w:themeColor="background1" w:val="FFFFFF"/>
               </w:rPr>
-              <w:t>Sesiones</w:t>
+              <w:t>Horas de aula (propuesta 2026/2027)</w:t>
             </w:r>
           </w:p>
         </w:tc>
@@ -15674,7 +11083,7 @@
             </w:pPr>
             <w:r>
               <w:rPr/>
-              <w:t>12</w:t>
+              <w:t>8</w:t>
             </w:r>
           </w:p>
         </w:tc>
@@ -16986,7 +12395,7 @@
                 <w:bCs/>
                 <w:color w:themeColor="background1" w:val="FFFFFF"/>
               </w:rPr>
-              <w:t>Sesiones</w:t>
+              <w:t>Horas de aula (propuesta 2026/2027)</w:t>
             </w:r>
           </w:p>
         </w:tc>
@@ -17011,7 +12420,7 @@
             </w:pPr>
             <w:r>
               <w:rPr/>
-              <w:t>24</w:t>
+              <w:t>16</w:t>
             </w:r>
           </w:p>
         </w:tc>
@@ -18357,7 +13766,7 @@
                 <w:bCs/>
                 <w:color w:themeColor="background1" w:val="FFFFFF"/>
               </w:rPr>
-              <w:t>Sesiones</w:t>
+              <w:t>Horas de aula (propuesta 2026/2027)</w:t>
             </w:r>
           </w:p>
         </w:tc>
@@ -18382,7 +13791,7 @@
             </w:pPr>
             <w:r>
               <w:rPr/>
-              <w:t>24</w:t>
+              <w:t>16</w:t>
             </w:r>
           </w:p>
         </w:tc>
@@ -19710,7 +15119,7 @@
                 <w:bCs/>
                 <w:color w:themeColor="background1" w:val="FFFFFF"/>
               </w:rPr>
-              <w:t>Sesiones</w:t>
+              <w:t>Horas de aula (propuesta 2026/2027)</w:t>
             </w:r>
           </w:p>
         </w:tc>
@@ -19735,7 +15144,7 @@
             </w:pPr>
             <w:r>
               <w:rPr/>
-              <w:t>12</w:t>
+              <w:t>16</w:t>
             </w:r>
           </w:p>
         </w:tc>
@@ -21047,7 +16456,7 @@
                 <w:bCs/>
                 <w:color w:themeColor="background1" w:val="FFFFFF"/>
               </w:rPr>
-              <w:t>Sesiones</w:t>
+              <w:t>Horas de aula (propuesta 2026/2027)</w:t>
             </w:r>
           </w:p>
         </w:tc>
@@ -21072,7 +16481,7 @@
             </w:pPr>
             <w:r>
               <w:rPr/>
-              <w:t>12</w:t>
+              <w:t>8</w:t>
             </w:r>
           </w:p>
         </w:tc>
@@ -22404,7 +17813,7 @@
                 <w:bCs/>
                 <w:color w:themeColor="background1" w:val="FFFFFF"/>
               </w:rPr>
-              <w:t>Sesiones</w:t>
+              <w:t>Horas de aula (propuesta 2026/2027)</w:t>
             </w:r>
           </w:p>
         </w:tc>
@@ -22429,7 +17838,7 @@
             </w:pPr>
             <w:r>
               <w:rPr/>
-              <w:t>12</w:t>
+              <w:t>4</w:t>
             </w:r>
           </w:p>
         </w:tc>

</xml_diff>